<commit_message>
docs: update presentation and demo script docx to match 15 slides without honorifics
</commit_message>
<xml_diff>
--- a/docs/Kich_Ban_Thuyet_Trinh_Va_Demo_DT005.docx
+++ b/docs/Kich_Ban_Thuyet_Trinh_Va_Demo_DT005.docx
@@ -4,12 +4,13 @@
   <w:body>
     <w:p>
       <w:pPr>
+        <w:spacing w:before="0" w:after="80"/>
         <w:jc w:val="center"/>
       </w:pPr>
       <w:r>
         <w:rPr>
           <w:b/>
-          <w:color w:val="64748B"/>
+          <w:color w:val="475569"/>
           <w:sz w:val="22"/>
         </w:rPr>
         <w:t>TRƯỜNG ĐẠI HỌC TÀI NGUYÊN VÀ MÔI TRƯỜNG TP. HỒ CHÍ MINH</w:t>
@@ -20,101 +21,117 @@
       <w:r>
         <w:rPr>
           <w:b/>
-          <w:color w:val="0F172A"/>
-          <w:sz w:val="32"/>
+          <w:color w:val="1E40AF"/>
+          <w:sz w:val="36"/>
         </w:rPr>
-        <w:t>KỊCH BẢN THUYẾT TRÌNH VÀ HƯỚNG DẪN DEMO BÁO CÁO GIỮA KỲ</w:t>
+        <w:t>KỊCH BẢN THUYẾT TRÌNH &amp; HƯỚNG DẪN DIỄN TẬP DEMO GIỮA KỲ</w:t>
         <w:br/>
       </w:r>
       <w:r>
         <w:rPr>
           <w:b/>
-          <w:color w:val="2563EB"/>
-          <w:sz w:val="22"/>
+          <w:color w:val="0F172A"/>
+          <w:sz w:val="26"/>
         </w:rPr>
-        <w:t>ĐỀ TÀI DT005: HỆ THỐNG KIỂM TRA TOÀN VẸN TỆP BẰNG SHA-256, HMAC VÀ CÂY MERKLE</w:t>
+        <w:t>Đề tài DT005: Hệ thống kiểm tra toàn vẹn tệp bằng SHA-256, HMAC và cây Merkle phân cấp động</w:t>
         <w:br/>
-        <w:t>BÀI BÁO THAM CHIẾU: THE ADVERSARY: THE PHILOSOPHY OF CRYPTOGRAPHY (HARRY HALPIN 2025)</w:t>
+      </w:r>
+      <w:r>
+        <w:rPr>
+          <w:i/>
+          <w:color w:val="64748B"/>
+          <w:sz w:val="21"/>
+        </w:rPr>
+        <w:t>Khảo sát và Thẩm định học thuật bài báo: "The adversary: the philosophy of cryptography"</w:t>
+        <w:br/>
+        <w:t>TS. Harry Halpin — Journal of Cybersecurity, Oxford Academic, Vol. 11, No. 1, 2025</w:t>
         <w:br/>
       </w:r>
     </w:p>
     <w:p>
       <w:pPr>
+        <w:spacing w:after="360"/>
         <w:jc w:val="center"/>
       </w:pPr>
       <w:r>
         <w:rPr>
+          <w:b/>
           <w:color w:val="1E293B"/>
           <w:sz w:val="21"/>
         </w:rPr>
-        <w:t>Học phần: An toàn và bảo mật hệ thống thông tin  |  Học kỳ: Giữa kỳ</w:t>
+        <w:t>Học phần: An toàn và bảo mật hệ thống thông tin | Giảng viên hướng dẫn: ThS. Phạm Trọng Huynh</w:t>
         <w:br/>
-        <w:t>Giảng viên hướng dẫn: ThS. Phạm Trọng Huynh</w:t>
-        <w:br/>
-        <w:t>Sinh viên thực hiện: Võ Anh Kiệt  —  MSSV: 1150080143  —  Lớp: 11_CNPM2</w:t>
-        <w:br/>
+        <w:t>Sinh viên thực hiện: Võ Anh Kiệt — MSSV: 1150080143 — Lớp: 11_CNPM2</w:t>
       </w:r>
     </w:p>
     <w:p>
       <w:pPr>
-        <w:spacing w:after="240"/>
+        <w:spacing w:after="120"/>
       </w:pPr>
     </w:p>
     <w:p>
       <w:pPr>
         <w:pStyle w:val="Heading1"/>
+        <w:spacing w:before="240" w:after="200"/>
       </w:pPr>
       <w:r>
         <w:rPr>
-          <w:color w:val="0F172A"/>
+          <w:b/>
+          <w:color w:val="1E40AF"/>
           <w:sz w:val="28"/>
         </w:rPr>
-        <w:t>PHẦN 1: KỊCH BẢN THUYẾT TRÌNH TỪNG SLIDE (SLIDE-BY-SLIDE SCRIPT)</w:t>
-      </w:r>
-    </w:p>
-    <w:p>
-      <w:r>
-        <w:rPr>
-          <w:b/>
-          <w:color w:val="2563EB"/>
-          <w:sz w:val="24"/>
-        </w:rPr>
-        <w:t>SLIDE 01: TRANG BÌA BÁO CÁO GIỮA KỲ</w:t>
-      </w:r>
-      <w:r>
-        <w:rPr>
-          <w:i/>
-          <w:color w:val="D97706"/>
-          <w:sz w:val="20"/>
-        </w:rPr>
-        <w:t xml:space="preserve">  [Thời lượng: 30 giây]</w:t>
+        <w:t>PHẦN 1: KỊCH BẢN THUYẾT MINH CHI TIẾT THEO 15 SLIDE</w:t>
       </w:r>
     </w:p>
     <w:p>
       <w:pPr>
-        <w:spacing w:after="240"/>
-        <w:ind w:left="288" w:right="288"/>
+        <w:spacing w:before="200" w:after="40"/>
       </w:pPr>
       <w:r>
         <w:rPr>
           <w:b/>
-          <w:color w:val="0D9488"/>
+          <w:color w:val="1E40AF"/>
+          <w:sz w:val="24"/>
+        </w:rPr>
+        <w:t xml:space="preserve">► SLIDE 1: BÌA BÁO CÁO GIỮA KỲ </w:t>
+      </w:r>
+      <w:r>
+        <w:rPr>
+          <w:b/>
+          <w:color w:val="64748B"/>
+          <w:sz w:val="20"/>
+        </w:rPr>
+        <w:t>[0:30]</w:t>
+      </w:r>
+    </w:p>
+    <w:p>
+      <w:pPr>
+        <w:spacing w:before="40" w:after="80"/>
+        <w:ind w:left="288"/>
+      </w:pPr>
+      <w:r>
+        <w:rPr>
+          <w:b/>
+          <w:color w:val="0F172A"/>
           <w:sz w:val="21"/>
         </w:rPr>
-        <w:t>Lời thoại thuyết trình (Đọc trực tiếp):</w:t>
+        <w:t>Nội dung trình bày:</w:t>
         <w:br/>
       </w:r>
       <w:r>
         <w:rPr>
-          <w:color w:val="1E293B"/>
-          <w:sz w:val="22"/>
+          <w:i w:val="0"/>
+          <w:color w:val="334155"/>
+          <w:sz w:val="21"/>
         </w:rPr>
-        <w:t>“Kính thưa Thầy và các bạn, hôm nay em xin đại diện báo cáo tiến độ đồ án giữa kỳ học phần An toàn và bảo mật hệ thống thông tin với Đề tài DT005: 'Hệ thống kiểm tra toàn vẹn tệp bằng SHA-256, HMAC và Cây Merkle'. Nội dung nghiên cứu học thuật của đề tài bám sát bài báo khoa học mới nhất có tựa đề 'The adversary: the philosophy of cryptography' của Tiến sĩ Harry Halpin, công bố trên Oxford Journal of Cybersecurity năm 2025. Mục tiêu của buổi báo cáo hôm nay là trình bày bản chất lý thuyết của bài báo, kiểm toán tính tái lập khoa học, đối chiếu luận điểm tác giả vào source code và thực hiện demo đối kháng trực tiếp trên dữ liệu thực tế.”</w:t>
+        <w:t>"Báo cáo tiến độ đồ án giữa kỳ đề tài DT005: Xây dựng hệ thống kiểm tra toàn vẹn tệp dựa trên SHA-256, HMAC và Cây Merkle phân cấp động; kết hợp thẩm định học thuật bài báo 'The adversary: the philosophy of cryptography' của Tiến sĩ Harry Halpin, xuất bản năm 2025 trên tạp chí Journal of Cybersecurity thuộc Đại học Oxford.</w:t>
+        <w:br/>
+        <w:t>Nội dung báo cáo gồm 3 trọng tâm: (1) Khảo cứu các luận điểm nhận thức luận và tiến trình hình thức hóa kẻ đối đầu trong mật mã học; (2) Phân định phương pháp luận giữa khảo sát triết học lý thuyết của tác giả và hệ thống thực nghiệm độc lập do nhóm tự phát triển; (3) Diễn tập thực tế mô hình đối kháng an ninh Red Team vs Blue Team trên tập dữ liệu thực tế 2.483 tệp tin."</w:t>
       </w:r>
     </w:p>
     <w:p>
       <w:pPr>
-        <w:spacing w:after="280"/>
+        <w:spacing w:before="40" w:after="160"/>
         <w:ind w:left="288"/>
       </w:pPr>
       <w:r>
@@ -123,53 +140,60 @@
           <w:color w:val="64748B"/>
           <w:sz w:val="19"/>
         </w:rPr>
-        <w:t>• Chỉ dẫn tương tác: Chuyển slide dứt khoát; nhấn giọng vào các con số thực nghiệm và các luận điểm triết học của Halpin.</w:t>
-        <w:br/>
-      </w:r>
-    </w:p>
-    <w:p>
-      <w:r>
-        <w:rPr>
-          <w:b/>
-          <w:color w:val="2563EB"/>
-          <w:sz w:val="24"/>
-        </w:rPr>
-        <w:t>SLIDE 02: BỐI CẢNH NGHIÊN CỨU: KHOẢNG CÁCH GIỮA CHỨNG MINH TOÁN HỌC VÀ THỰC TẾ</w:t>
-      </w:r>
-      <w:r>
-        <w:rPr>
-          <w:i/>
-          <w:color w:val="D97706"/>
-          <w:sz w:val="20"/>
-        </w:rPr>
-        <w:t xml:space="preserve">  [Thời lượng: 45 giây]</w:t>
+        <w:t>• Lưu ý trình bày: Điểm nhấn trình bày: Bố cục rõ ràng, nhận diện trang trọng, xác định chuẩn mục tiêu đồ án giữa kỳ.</w:t>
       </w:r>
     </w:p>
     <w:p>
       <w:pPr>
-        <w:spacing w:after="240"/>
-        <w:ind w:left="288" w:right="288"/>
+        <w:spacing w:before="200" w:after="40"/>
       </w:pPr>
       <w:r>
         <w:rPr>
           <w:b/>
-          <w:color w:val="0D9488"/>
+          <w:color w:val="1E40AF"/>
+          <w:sz w:val="24"/>
+        </w:rPr>
+        <w:t xml:space="preserve">► SLIDE 2: BỐI CẢNH, MỤC TIÊU &amp; BA ĐÓNG GÓP CỦA BÀI BÁO (SECTION 1) </w:t>
+      </w:r>
+      <w:r>
+        <w:rPr>
+          <w:b/>
+          <w:color w:val="64748B"/>
+          <w:sz w:val="20"/>
+        </w:rPr>
+        <w:t>[1:00]</w:t>
+      </w:r>
+    </w:p>
+    <w:p>
+      <w:pPr>
+        <w:spacing w:before="40" w:after="80"/>
+        <w:ind w:left="288"/>
+      </w:pPr>
+      <w:r>
+        <w:rPr>
+          <w:b/>
+          <w:color w:val="0F172A"/>
           <w:sz w:val="21"/>
         </w:rPr>
-        <w:t>Lời thoại thuyết trình (Đọc trực tiếp):</w:t>
+        <w:t>Nội dung trình bày:</w:t>
         <w:br/>
       </w:r>
       <w:r>
         <w:rPr>
-          <w:color w:val="1E293B"/>
-          <w:sz w:val="22"/>
+          <w:i w:val="0"/>
+          <w:color w:val="334155"/>
+          <w:sz w:val="21"/>
         </w:rPr>
-        <w:t>“Mở đầu bài báo, Halpin phân tích sự chuyển dịch lịch sử của mật mã học: Trước thập niên 1970, mật mã chỉ được xem là một nghệ thuật mang tính kinh nghiệm và hoang tưởng bí mật. Đến khi hệ thống máy tính chia sẻ Multics ra đời, nhu cầu bảo vệ dữ liệu đã thúc đẩy các nhà khoa học hình thức hóa kẻ đối đầu để biến mật mã thành một ngành khoa học toán học có chứng minh nghiêm ngặt. Tuy nhiên, nghịch lý lớn nhất là: Dù các thuật toán nền tảng như RSA hay AES chưa từng bị bẻ gãy về mặt toán học, các hệ thống an ninh thực tế vẫn liên tục sụp đổ. Ross Anderson trong bài báo kinh điển 'Why Cryptosystems Fail' đã chỉ ra rằng hệ thống thất bại do lỗi lập trình phần mềm, lỗi cấu hình và con người, chứ không phải do công thức toán học bị phá vỡ. Và đỉnh điểm là năm 2013, hồ sơ rò rỉ của Edward Snowden đã phơi bày sự thật về NSA: Kẻ đối đầu mạnh nhất thế giới không cần giải bài toán NP-hard, mà tấn công thẳng vào tiêu chuẩn, phần cứng, phần mềm và siêu dữ liệu.”</w:t>
+        <w:t>"Mật mã học trong kỷ nguyên số là khoa học về việc duy trì liên lạc bảo mật khi có sự hiện diện của đối thủ có chủ đích trên môi trường mạng mở.</w:t>
+        <w:br/>
+        <w:t>Bài báo của Halpin chỉ ra một nghịch lý nhận thức luận sâu sắc: Trong khi lý thuyết thông tin của Claude Shannon được triết học khảo cứu rộng rãi suốt nhiều thập kỷ, thì chính mật mã học — cái nôi khai sinh ra khái niệm thông tin và tính ngẫu nhiên — lại bị giới triết học bỏ quên.</w:t>
+        <w:br/>
+        <w:t>Bài báo đưa ra ba đóng góp học thuật cốt lõi: Thứ nhất, định hình lại lịch sử mật mã qua lăng kính triết học bản thể luận về 'Kẻ thù' (The Adversary). Thứ hai, phê phán sự trừu tượng hóa toán học thái quá khi biến đối thủ thành các hàm lý tưởng và bỏ qua các vector tấn công thế giới thực (kênh kề, siêu dữ liệu, lỗi phần cứng). Thứ ba, đề xuất một chương trình nghiên cứu liên ngành mở với 4 câu hỏi định hướng cho khoa học an ninh tương lai."</w:t>
       </w:r>
     </w:p>
     <w:p>
       <w:pPr>
-        <w:spacing w:after="280"/>
+        <w:spacing w:before="40" w:after="160"/>
         <w:ind w:left="288"/>
       </w:pPr>
       <w:r>
@@ -178,53 +202,62 @@
           <w:color w:val="64748B"/>
           <w:sz w:val="19"/>
         </w:rPr>
-        <w:t>• Chỉ dẫn tương tác: Chuyển slide dứt khoát; nhấn giọng vào các con số thực nghiệm và các luận điểm triết học của Halpin.</w:t>
-        <w:br/>
-      </w:r>
-    </w:p>
-    <w:p>
-      <w:r>
-        <w:rPr>
-          <w:b/>
-          <w:color w:val="2563EB"/>
-          <w:sz w:val="24"/>
-        </w:rPr>
-        <w:t>SLIDE 03: MỤC TIÊU NGHIÊN CỨU &amp; BA CÂU HỎI CỐT LÕI CỦA HARRY HALPIN</w:t>
-      </w:r>
-      <w:r>
-        <w:rPr>
-          <w:i/>
-          <w:color w:val="D97706"/>
-          <w:sz w:val="20"/>
-        </w:rPr>
-        <w:t xml:space="preserve">  [Thời lượng: 45 giây]</w:t>
+        <w:t>• Lưu ý trình bày: Điểm nhấn trình bày: Nêu bật nghịch lý triết học và 3 đóng góp lớn của Halpin.</w:t>
       </w:r>
     </w:p>
     <w:p>
       <w:pPr>
-        <w:spacing w:after="240"/>
-        <w:ind w:left="288" w:right="288"/>
+        <w:spacing w:before="200" w:after="40"/>
       </w:pPr>
       <w:r>
         <w:rPr>
           <w:b/>
-          <w:color w:val="0D9488"/>
+          <w:color w:val="1E40AF"/>
+          <w:sz w:val="24"/>
+        </w:rPr>
+        <w:t xml:space="preserve">► SLIDE 3: CƠ SỞ TRIẾT HỌC VỀ THÔNG TIN &amp; BẢN THỂ HỌC (SECTION 2) </w:t>
+      </w:r>
+      <w:r>
+        <w:rPr>
+          <w:b/>
+          <w:color w:val="64748B"/>
+          <w:sz w:val="20"/>
+        </w:rPr>
+        <w:t>[1:00]</w:t>
+      </w:r>
+    </w:p>
+    <w:p>
+      <w:pPr>
+        <w:spacing w:before="40" w:after="80"/>
+        <w:ind w:left="288"/>
+      </w:pPr>
+      <w:r>
+        <w:rPr>
+          <w:b/>
+          <w:color w:val="0F172A"/>
           <w:sz w:val="21"/>
         </w:rPr>
-        <w:t>Lời thoại thuyết trình (Đọc trực tiếp):</w:t>
+        <w:t>Nội dung trình bày:</w:t>
         <w:br/>
       </w:r>
       <w:r>
         <w:rPr>
-          <w:color w:val="1E293B"/>
-          <w:sz w:val="22"/>
+          <w:i w:val="0"/>
+          <w:color w:val="334155"/>
+          <w:sz w:val="21"/>
         </w:rPr>
-        <w:t>“Xuất phát từ nghịch lý đó, bài báo của Halpin đặt ra ba câu hỏi nghiên cứu nền tảng: Thứ nhất, về mặt bản thể luận: Bản chất của bí mật là gì? Halpin khẳng định bí mật không phải là thuộc tính nội tại của thông điệp, mà là một mối quan hệ tương đối theo thời gian giữa người giữ bí mật, kẻ đối đầu và thế giới bên ngoài. Không có bí mật nào là vĩnh cửu. Thứ hai, về mặt nhận thức luận: Tại sao việc chứng minh an toàn trong mô hình toán học lại thất bại trong thế giới thực? Halpin sử dụng phê phán của Brian Cantwell Smith để chỉ ra rằng: Mọi mô hình toán học đều là sự trừu tượng hóa cắt bỏ chi tiết vật lý, nhưng kẻ tấn công lại khai thác chính những chi tiết bị bỏ rơi đó. Thứ ba, cần tái định nghĩa kẻ đối đầu như thế nào? Kẻ đối đầu không phải là một thuật toán trừu tượng vô hại, mà là một tổ chức thể chế có ngân sách và mục tiêu chiến lược cụ thể.”</w:t>
+        <w:t>"Nền tảng lý thuyết của Halpin dựa trên 2 trụ cột triết học nhận thức luận:</w:t>
+        <w:br/>
+        <w:t>1. Bản thể học thông tin của Brian Cantwell Smith (1996): Thực tại khởi nguồn từ một dòng chảy siêu hình nguyên thủy không biên giới. Con người và hệ thống định hình thế giới bằng cách 'đăng ký đối tượng' (registration of objects). Trong mật mã học, các đối tượng như thông điệp, bản mã và khóa được đăng ký nhằm kiểm soát dòng thông tin giữa các tác nhân ở xa nhau (distal agents).</w:t>
+        <w:br/>
+        <w:t>2. Thuyết thông tin khách quan của Fred Dretske (1981): Thông tin là một trạng thái khách quan gắn liền với quy luật tự nhiên, độc lập với người quan sát. Bản rõ chứa đựng thông tin về nguồn phát; hệ mật mã hoàn hảo đảm bảo bản mã không để rò rỉ bất kỳ thông tin nào về bản rõ nếu không có khóa.</w:t>
+        <w:br/>
+        <w:t>Khác với nhiễu ngẫu nhiên trong vật lý, Kẻ đối đầu mật mã là một tác nhân có chủ đích (intentional agent), có ý chí và năng lực khai thác lỗ hổng cấu trúc hệ thống."</w:t>
       </w:r>
     </w:p>
     <w:p>
       <w:pPr>
-        <w:spacing w:after="280"/>
+        <w:spacing w:before="40" w:after="160"/>
         <w:ind w:left="288"/>
       </w:pPr>
       <w:r>
@@ -233,53 +266,66 @@
           <w:color w:val="64748B"/>
           <w:sz w:val="19"/>
         </w:rPr>
-        <w:t>• Chỉ dẫn tương tác: Chuyển slide dứt khoát; nhấn giọng vào các con số thực nghiệm và các luận điểm triết học của Halpin.</w:t>
-        <w:br/>
-      </w:r>
-    </w:p>
-    <w:p>
-      <w:r>
-        <w:rPr>
-          <w:b/>
-          <w:color w:val="2563EB"/>
-          <w:sz w:val="24"/>
-        </w:rPr>
-        <w:t>SLIDE 04: CƠ SỞ TRIẾT HỌC: DRETSKE, THUYẾT THÔNG TIN &amp; KHÁI NIỆM BÍ MẬT</w:t>
-      </w:r>
-      <w:r>
-        <w:rPr>
-          <w:i/>
-          <w:color w:val="D97706"/>
-          <w:sz w:val="20"/>
-        </w:rPr>
-        <w:t xml:space="preserve">  [Thời lượng: 50 giây]</w:t>
+        <w:t>• Lưu ý trình bày: Điểm nhấn trình bày: Phân tích sự chuyển dịch từ đối tượng vật lý sang bản thể thông tin mật mã.</w:t>
       </w:r>
     </w:p>
     <w:p>
       <w:pPr>
-        <w:spacing w:after="240"/>
-        <w:ind w:left="288" w:right="288"/>
+        <w:spacing w:before="200" w:after="40"/>
       </w:pPr>
       <w:r>
         <w:rPr>
           <w:b/>
-          <w:color w:val="0D9488"/>
+          <w:color w:val="1E40AF"/>
+          <w:sz w:val="24"/>
+        </w:rPr>
+        <w:t xml:space="preserve">► SLIDE 4: TIẾN TRÌNH LỊCH SỬ MÔ HÌNH HÓA ĐỐI THỦ [SƠ ĐỒ 1: TIMELINE] </w:t>
+      </w:r>
+      <w:r>
+        <w:rPr>
+          <w:b/>
+          <w:color w:val="64748B"/>
+          <w:sz w:val="20"/>
+        </w:rPr>
+        <w:t>[1:00]</w:t>
+      </w:r>
+    </w:p>
+    <w:p>
+      <w:pPr>
+        <w:spacing w:before="40" w:after="80"/>
+        <w:ind w:left="288"/>
+      </w:pPr>
+      <w:r>
+        <w:rPr>
+          <w:b/>
+          <w:color w:val="0F172A"/>
           <w:sz w:val="21"/>
         </w:rPr>
-        <w:t>Lời thoại thuyết trình (Đọc trực tiếp):</w:t>
+        <w:t>Nội dung trình bày:</w:t>
         <w:br/>
       </w:r>
       <w:r>
         <w:rPr>
-          <w:color w:val="1E293B"/>
-          <w:sz w:val="22"/>
+          <w:i w:val="0"/>
+          <w:color w:val="334155"/>
+          <w:sz w:val="21"/>
         </w:rPr>
-        <w:t>“Để trả lời câu hỏi thứ nhất, tác giả xây dựng nền tảng triết học dựa trên thuyết thông tin của Fred Dretske kế thừa Claude Shannon. Thế giới là một dòng chảy vật lý liên tục; thông tin chính là các mối quan hệ có tính quy luật giữa trạng thái của các sự vật. Con người là những tác nhân có chủ đích, có niềm tin và kế hoạch hành động để bảo vệ trạng thái nội bộ của mình. Halpin phân biệt rạch ròi giữa 'Tri thức công cộng' (Public Knowledge) và 'Tri thức phổ thông' (Common Knowledge). Bí mật đối lập trực tiếp với sự công khai. Một tài liệu mật như hồ sơ ngoại giao Mỹ bị Wikileaks rò rỉ thì trên thực tế đã không còn là bí mật, dù về mặt pháp lý nó vẫn được phân loại là mật. Từ đó, Halpin dẫn chiếu Nguyên lý Kerckhoffs: Độ an toàn của một hệ thống mật mã không được dựa vào việc giấu kín thuật toán; kẻ đối đầu có quyền biết toàn bộ thuật toán, sự an toàn chỉ nằm ở tính bí mật của khóa.”</w:t>
+        <w:t>"Sơ đồ 1 hệ thống hóa tiến trình 5 giai đoạn tiến hóa mô hình đối thủ trong hơn 70 năm qua:</w:t>
+        <w:br/>
+        <w:t>• Giai đoạn 1 (1948–1949): Mô hình Shannon, định nghĩa Bí mật hoàn hảo (One-Time Pad) dựa trên lý thuyết xác suất và giả định sai lệch bắt nguồn từ nhiễu ngẫu nhiên.</w:t>
+        <w:br/>
+        <w:t>• Giai đoạn 2 (1976): Cách mạng khóa công khai của Diffie-Hellman và Merkle, giải quyết bài toán phân phối khóa bằng các bài toán độ phức tạp tính toán một chiều.</w:t>
+        <w:br/>
+        <w:t>• Giai đoạn 3 (1982–1984): Mô hình PPT Adversary và Trò chơi An ninh (Security Games) của Goldwasser và Micali, hình thức hóa an toàn ngữ nghĩa và chứng minh an toàn bằng quy dẫn toán học đa thức xác suất.</w:t>
+        <w:br/>
+        <w:t>• Giai đoạn 4 (1981–1993): Dolev-Yao mô hình hóa kẻ thù kiểm soát hoàn toàn kênh mạng logic; Bellare-Rogaway đề xuất Random Oracle Model (ROM) ứng dụng cho hàm băm thực hành.</w:t>
+        <w:br/>
+        <w:t>• Giai đoạn 5 (2013–2025): Phê phán hậu Snowden, bộc lộ khoảng cách giữa mô hình toán học trên giấy và năng lực thực tế của đối thủ thể chế (kênh kề, backdoor chuẩn NIST, can thiệp chuỗi cung ứng)."</w:t>
       </w:r>
     </w:p>
     <w:p>
       <w:pPr>
-        <w:spacing w:after="280"/>
+        <w:spacing w:before="40" w:after="160"/>
         <w:ind w:left="288"/>
       </w:pPr>
       <w:r>
@@ -288,53 +334,60 @@
           <w:color w:val="64748B"/>
           <w:sz w:val="19"/>
         </w:rPr>
-        <w:t>• Chỉ dẫn tương tác: Chuyển slide dứt khoát; nhấn giọng vào các con số thực nghiệm và các luận điểm triết học của Halpin.</w:t>
-        <w:br/>
-      </w:r>
-    </w:p>
-    <w:p>
-      <w:r>
-        <w:rPr>
-          <w:b/>
-          <w:color w:val="2563EB"/>
-          <w:sz w:val="24"/>
-        </w:rPr>
-        <w:t>SLIDE 05: TIẾN TRÌNH MÔ HÌNH HÓA ĐỐI THỦ (1): TỪ SHANNON ĐẾN KHÓA CÔNG KHAI</w:t>
-      </w:r>
-      <w:r>
-        <w:rPr>
-          <w:i/>
-          <w:color w:val="D97706"/>
-          <w:sz w:val="20"/>
-        </w:rPr>
-        <w:t xml:space="preserve">  [Thời lượng: 50 giây]</w:t>
+        <w:t>• Lưu ý trình bày: Điểm nhấn trình bày: Trình bày mạch lạc 5 mốc lịch sử từ Shannon đến Snowden.</w:t>
       </w:r>
     </w:p>
     <w:p>
       <w:pPr>
-        <w:spacing w:after="240"/>
-        <w:ind w:left="288" w:right="288"/>
+        <w:spacing w:before="200" w:after="40"/>
       </w:pPr>
       <w:r>
         <w:rPr>
           <w:b/>
-          <w:color w:val="0D9488"/>
+          <w:color w:val="1E40AF"/>
+          <w:sz w:val="24"/>
+        </w:rPr>
+        <w:t xml:space="preserve">► SLIDE 5: MÔ HÌNH TRUYỀN THÔNG SHANNON vs MẠNG PHỨC HỢP [SƠ ĐỒ 2: DRAW.IO] </w:t>
+      </w:r>
+      <w:r>
+        <w:rPr>
+          <w:b/>
+          <w:color w:val="64748B"/>
+          <w:sz w:val="20"/>
+        </w:rPr>
+        <w:t>[1:00]</w:t>
+      </w:r>
+    </w:p>
+    <w:p>
+      <w:pPr>
+        <w:spacing w:before="40" w:after="80"/>
+        <w:ind w:left="288"/>
+      </w:pPr>
+      <w:r>
+        <w:rPr>
+          <w:b/>
+          <w:color w:val="0F172A"/>
           <w:sz w:val="21"/>
         </w:rPr>
-        <w:t>Lời thoại thuyết trình (Đọc trực tiếp):</w:t>
+        <w:t>Nội dung trình bày:</w:t>
         <w:br/>
       </w:r>
       <w:r>
         <w:rPr>
-          <w:color w:val="1E293B"/>
-          <w:sz w:val="22"/>
+          <w:i w:val="0"/>
+          <w:color w:val="334155"/>
+          <w:sz w:val="21"/>
         </w:rPr>
-        <w:t>“Trong phần 3 và 4, tác giả khảo cứu tiến trình lịch sử mô hình hóa kẻ đối đầu qua các mốc thời gian: Năm 1949, Claude Shannon khai sinh lý thuyết mật mã với mô hình Kẻ nghe lén thụ động trên đường truyền có nhiễu. Shannon định nghĩa bí mật hoàn hảo với One-Time Pad, nhưng hạn chế cốt tử là đòi hỏi chia sẻ trước khóa bí mật có độ dài bằng thông điệp. Đến thập niên 1970, để bảo vệ hệ điều hành Multics, mô hình kiểm soát truy cập Bell-LaPadula ra đời bảo vệ tính bảo mật, và mô hình Biba ra đời bảo vệ tính toàn vẹn với nguyên lý kinh điển 'No Write-Up' - ngăn đối tượng mức thấp làm sai lệch trạng thái mức cao. Năm 1976, Diffie-Hellman và sau đó là Merkle, RSA tạo nên cuộc cách mạng Khóa công khai: Chuyển gánh nặng từ phân phối khóa vật lý sang giả định độ phức tạp tính toán, chính thức đưa ra khái niệm Kẻ đối đầu thời gian đa thức xác suất (PPT Adversary).”</w:t>
+        <w:t>"Sơ đồ 2 so sánh trực diện hai mô hình truyền thông:</w:t>
+        <w:br/>
+        <w:t>• Panel trái: Mô hình điểm-điểm cổ điển của Shannon (1949). Alice gửi bản rõ M mã hóa bằng khóa K qua kênh truyền đến Bob. Đối thủ Eve chỉ là kẻ nghe lén thụ động (passive eavesdropper) trên đường truyền. Điểm mù của Shannon là giả định sai lệch do nhiễu ngẫu nhiên và bỏ qua chi phí lưu trữ, phân phối khóa cũng như rò rỉ vật lý.</w:t>
+        <w:br/>
+        <w:t>• Panel phải: Thực tế mạng xã hội - kỹ thuật phức hợp theo Halpin (2025). Hệ thống không còn là đường truyền đóng kín đơn thuần, mà thông tin luân chuyển giữa Nhóm giữ bí mật (Secret Keepers) và Hạ tầng mở/ISP/Đám mây. Đối thủ thể chế (NSA, Five Eyes) là tác nhân toàn cục cả thụ động lẫn chủ động, tấn công qua 4 con đường thực tế: (1) Kênh kề thời gian/điện năng; (2) Giám sát siêu dữ liệu luồng gói tin; (3) Cài cắm cửa sau chuỗi cung ứng phần cứng; (4) Lỗi phản bội nội bộ Byzantine. Mục tiêu phòng thủ hiện đại vì thế phải chuyển dịch sang bảo vệ siêu dữ liệu và kháng kênh kề."</w:t>
       </w:r>
     </w:p>
     <w:p>
       <w:pPr>
-        <w:spacing w:after="280"/>
+        <w:spacing w:before="40" w:after="160"/>
         <w:ind w:left="288"/>
       </w:pPr>
       <w:r>
@@ -343,53 +396,62 @@
           <w:color w:val="64748B"/>
           <w:sz w:val="19"/>
         </w:rPr>
-        <w:t>• Chỉ dẫn tương tác: Chuyển slide dứt khoát; nhấn giọng vào các con số thực nghiệm và các luận điểm triết học của Halpin.</w:t>
-        <w:br/>
-      </w:r>
-    </w:p>
-    <w:p>
-      <w:r>
-        <w:rPr>
-          <w:b/>
-          <w:color w:val="2563EB"/>
-          <w:sz w:val="24"/>
-        </w:rPr>
-        <w:t>SLIDE 06: TIẾN TRÌNH MÔ HÌNH HÓA ĐỐI THỦ (2): SECURITY GAMES &amp; MÔ HÌNH DOLEV-YAO</w:t>
-      </w:r>
-      <w:r>
-        <w:rPr>
-          <w:i/>
-          <w:color w:val="D97706"/>
-          <w:sz w:val="20"/>
-        </w:rPr>
-        <w:t xml:space="preserve">  [Thời lượng: 50 giây]</w:t>
+        <w:t>• Lưu ý trình bày: Điểm nhấn trình bày: Thuyết minh bám sát sơ đồ draw.io đã nhúng trên slide, phân tích rõ sự tương phản giữa 2 bên.</w:t>
       </w:r>
     </w:p>
     <w:p>
       <w:pPr>
-        <w:spacing w:after="240"/>
-        <w:ind w:left="288" w:right="288"/>
+        <w:spacing w:before="200" w:after="40"/>
       </w:pPr>
       <w:r>
         <w:rPr>
           <w:b/>
-          <w:color w:val="0D9488"/>
+          <w:color w:val="1E40AF"/>
+          <w:sz w:val="24"/>
+        </w:rPr>
+        <w:t xml:space="preserve">► SLIDE 6: BA MÔ HÌNH ĐỐI THỦ HÌNH THỨC TRONG MẬT MÃ HIỆN ĐẠI (SECTION 4) </w:t>
+      </w:r>
+      <w:r>
+        <w:rPr>
+          <w:b/>
+          <w:color w:val="64748B"/>
+          <w:sz w:val="20"/>
+        </w:rPr>
+        <w:t>[1:00]</w:t>
+      </w:r>
+    </w:p>
+    <w:p>
+      <w:pPr>
+        <w:spacing w:before="40" w:after="80"/>
+        <w:ind w:left="288"/>
+      </w:pPr>
+      <w:r>
+        <w:rPr>
+          <w:b/>
+          <w:color w:val="0F172A"/>
           <w:sz w:val="21"/>
         </w:rPr>
-        <w:t>Lời thoại thuyết trình (Đọc trực tiếp):</w:t>
+        <w:t>Nội dung trình bày:</w:t>
         <w:br/>
       </w:r>
       <w:r>
         <w:rPr>
-          <w:color w:val="1E293B"/>
-          <w:sz w:val="22"/>
+          <w:i w:val="0"/>
+          <w:color w:val="334155"/>
+          <w:sz w:val="21"/>
         </w:rPr>
-        <w:t>“Bước sang thập niên 1980, Goldwasser và Micali hoàn thiện phương pháp luận 'Trò chơi an ninh' (Security Games) và an ninh ngữ nghĩa IND-CPA/CCA, biến việc đánh giá an toàn thành chứng minh quy giảm toán học: Nếu kẻ thù phá được hệ mật thì có thể giải được bài toán khó. Năm 1983, Dolev và Yao đưa ra mô hình mạng thù địch nổi tiếng: 'Kẻ đối đầu chính là đường truyền' (The adversary is the wire). Kẻ thù có thể nghe lén, sửa đổi, tráo đổi gói tin và phát lại tùy ý. Mô hình này giả định mật mã học hoàn hảo và mở đường cho các công cụ kiểm chứng giao thức tự động như Isabelle chứng minh thành công TLS. Đồng thời, Bellare và Rogaway đề xuất Mô hình Tiên tri Ngẫu nhiên (ROM) để xấp xỉ hàm băm lý tưởng, dù về sau giới lý thuyết chứng minh hàm băm thực tế chỉ là sự xấp xỉ hữu hạn.”</w:t>
+        <w:t>"Section 4 của bài báo phân tích ba mô hình toán học hóa kẻ đối đầu nền tảng:</w:t>
+        <w:br/>
+        <w:t>1. Mô hình PPT Adversary (Goldwasser-Micali 1984): Đối thủ là thuật toán Turing xác suất chạy trong thời gian đa thức. An toàn được định nghĩa qua Trò chơi An ninh (Security Games), trong đó lợi thế đoán đúng của đối thủ phải là một hàm không đáng kể (negligible function). Chứng minh an toàn đạt được bằng phương pháp quy dẫn toán học về bài toán khó.</w:t>
+        <w:br/>
+        <w:t>2. Mô hình Dolev-Yao (1983): Kẻ thù kiểm soát hoàn toàn kênh mạng (có quyền nghe lén, chặn, sửa, xóa, phát lại thông điệp), nhưng xem mật mã học là 'hộp đen đại số hoàn hảo'. Đối thủ không thể bẻ khóa nếu không có khóa bí mật.</w:t>
+        <w:br/>
+        <w:t>3. Mô hình Tiên tri Ngẫu nhiên - ROM (Bellare-Rogaway 1993): Giả định hàm băm thực tế hoạt động như một hàm ngẫu nhiên lý tưởng để chứng minh an toàn hiệu năng cao. Tuy nhiên, về mặt triết học, không có hàm băm cụ thể nào (kể cả SHA-256) có thể tương đương toán học với một Random Oracle thực sự."</w:t>
       </w:r>
     </w:p>
     <w:p>
       <w:pPr>
-        <w:spacing w:after="280"/>
+        <w:spacing w:before="40" w:after="160"/>
         <w:ind w:left="288"/>
       </w:pPr>
       <w:r>
@@ -398,53 +460,62 @@
           <w:color w:val="64748B"/>
           <w:sz w:val="19"/>
         </w:rPr>
-        <w:t>• Chỉ dẫn tương tác: Chuyển slide dứt khoát; nhấn giọng vào các con số thực nghiệm và các luận điểm triết học của Halpin.</w:t>
-        <w:br/>
-      </w:r>
-    </w:p>
-    <w:p>
-      <w:r>
-        <w:rPr>
-          <w:b/>
-          <w:color w:val="2563EB"/>
-          <w:sz w:val="24"/>
-        </w:rPr>
-        <w:t>SLIDE 07: GIỚI HẠN CỦA SỰ HÌNH THỨC HÓA: TRỪU TƯỢNG HÓA VS HIỆN THỰC VẬT LÝ</w:t>
-      </w:r>
-      <w:r>
-        <w:rPr>
-          <w:i/>
-          <w:color w:val="D97706"/>
-          <w:sz w:val="20"/>
-        </w:rPr>
-        <w:t xml:space="preserve">  [Thời lượng: 50 giây]</w:t>
+        <w:t>• Lưu ý trình bày: Điểm nhấn trình bày: Định nghĩa chính xác 3 mô hình hình thức toán học cốt lõi.</w:t>
       </w:r>
     </w:p>
     <w:p>
       <w:pPr>
-        <w:spacing w:after="240"/>
-        <w:ind w:left="288" w:right="288"/>
+        <w:spacing w:before="200" w:after="40"/>
       </w:pPr>
       <w:r>
         <w:rPr>
           <w:b/>
-          <w:color w:val="0D9488"/>
+          <w:color w:val="1E40AF"/>
+          <w:sz w:val="24"/>
+        </w:rPr>
+        <w:t xml:space="preserve">► SLIDE 7: GIỚI HẠN CỦA HÌNH THỨC HÓA &amp; THẾ GIỚI THỰC [SƠ ĐỒ 3] (SECTION 5) </w:t>
+      </w:r>
+      <w:r>
+        <w:rPr>
+          <w:b/>
+          <w:color w:val="64748B"/>
+          <w:sz w:val="20"/>
+        </w:rPr>
+        <w:t>[1:00]</w:t>
+      </w:r>
+    </w:p>
+    <w:p>
+      <w:pPr>
+        <w:spacing w:before="40" w:after="80"/>
+        <w:ind w:left="288"/>
+      </w:pPr>
+      <w:r>
+        <w:rPr>
+          <w:b/>
+          <w:color w:val="0F172A"/>
           <w:sz w:val="21"/>
         </w:rPr>
-        <w:t>Lời thoại thuyết trình (Đọc trực tiếp):</w:t>
+        <w:t>Nội dung trình bày:</w:t>
         <w:br/>
       </w:r>
       <w:r>
         <w:rPr>
-          <w:color w:val="1E293B"/>
-          <w:sz w:val="22"/>
+          <w:i w:val="0"/>
+          <w:color w:val="334155"/>
+          <w:sz w:val="21"/>
         </w:rPr>
-        <w:t>“Phần 5 của bài báo là đóng góp phản biện triết học sâu sắc nhất của Halpin: Dựa trên phê phán của Brian Cantwell Smith về giới hạn của tính đúng đắn trong máy tính, Halpin chỉ ra rằng: Quá trình trừu tượng hóa luôn tạo ra khoảng cách với hiện thực vật lý. Koblitz và Menezes cũng chỉ trích rằng provable security tạo ra ảo tưởng an toàn nguy hiểm. Các bằng chứng thực tế chứng minh điều này: Paul Kocher năm 1996 phát hiện tấn công kênh kề đo thời gian: Toán học giả định phép tính tốn thời gian cố định, nhưng phần cứng thực tế ngắt sớm phép so sánh chuỗi làm rò rỉ khóa qua thời gian CPU. Hay các vụ tấn công CRIME và BREACH trên giao thức TLS: An ninh ngữ nghĩa cho phép công khai độ dài bản mã, nhưng tính năng nén dữ liệu HTTP thực tế đã làm rò rỉ độ dài bản mã, cho phép kẻ thù phục hồi cookie phiên làm việc.”</w:t>
+        <w:t>"Section 5 nêu bật các giới hạn thực tế mà các mô hình toán học trừu tượng bỏ sót:</w:t>
+        <w:br/>
+        <w:t>• Tấn công kênh kề (Side-channel attacks): Paul Kocher (1996) chứng minh việc đo đạc thời gian thực thi, bức xạ điện từ và tiêu thụ điện năng có thể khôi phục khóa mã mà không cần bẻ gãy thuật toán toán học.</w:t>
+        <w:br/>
+        <w:t>• Rò rỉ qua độ dài bản mã: Các giao thức như HTTPS, SSH vẫn làm lộ kích thước thông điệp và siêu dữ liệu luồng truyền thông, cho phép đối thủ suy đoán loại nội dung truyền tải.</w:t>
+        <w:br/>
+        <w:t>• Phê phán của Ross Anderson (2001): Đại đa số hệ thống an ninh thất bại trong thực tế không phải do thuật toán mật mã bị bẻ gãy, mà do lỗi quản lý khóa, lỗi giao diện người dùng, cấu hình sai và tấn công kỹ nghệ xã hội (Social Engineering)."</w:t>
       </w:r>
     </w:p>
     <w:p>
       <w:pPr>
-        <w:spacing w:after="280"/>
+        <w:spacing w:before="40" w:after="160"/>
         <w:ind w:left="288"/>
       </w:pPr>
       <w:r>
@@ -453,53 +524,62 @@
           <w:color w:val="64748B"/>
           <w:sz w:val="19"/>
         </w:rPr>
-        <w:t>• Chỉ dẫn tương tác: Chuyển slide dứt khoát; nhấn giọng vào các con số thực nghiệm và các luận điểm triết học của Halpin.</w:t>
-        <w:br/>
-      </w:r>
-    </w:p>
-    <w:p>
-      <w:r>
-        <w:rPr>
-          <w:b/>
-          <w:color w:val="2563EB"/>
-          <w:sz w:val="24"/>
-        </w:rPr>
-        <w:t>SLIDE 08: KẺ ĐỐI ĐẦU THỰC TẾ LỘ DIỆN: BÀI HỌC TỪ EDWARD SNOWDEN &amp; NSA</w:t>
-      </w:r>
-      <w:r>
-        <w:rPr>
-          <w:i/>
-          <w:color w:val="D97706"/>
-          <w:sz w:val="20"/>
-        </w:rPr>
-        <w:t xml:space="preserve">  [Thời lượng: 50 giây]</w:t>
+        <w:t>• Lưu ý trình bày: Điểm nhấn trình bày: Làm rõ khoảng cách giữa bài toán trên giấy và thực tế triển khai hệ thống.</w:t>
       </w:r>
     </w:p>
     <w:p>
       <w:pPr>
-        <w:spacing w:after="240"/>
-        <w:ind w:left="288" w:right="288"/>
+        <w:spacing w:before="200" w:after="40"/>
       </w:pPr>
       <w:r>
         <w:rPr>
           <w:b/>
-          <w:color w:val="0D9488"/>
+          <w:color w:val="1E40AF"/>
+          <w:sz w:val="24"/>
+        </w:rPr>
+        <w:t xml:space="preserve">► SLIDE 8: TIẾT LỘ CỦA SNOWDEN &amp; ĐỐI THỦ THỂ CHẾ NSA (SECTION 6) </w:t>
+      </w:r>
+      <w:r>
+        <w:rPr>
+          <w:b/>
+          <w:color w:val="64748B"/>
+          <w:sz w:val="20"/>
+        </w:rPr>
+        <w:t>[1:00]</w:t>
+      </w:r>
+    </w:p>
+    <w:p>
+      <w:pPr>
+        <w:spacing w:before="40" w:after="80"/>
+        <w:ind w:left="288"/>
+      </w:pPr>
+      <w:r>
+        <w:rPr>
+          <w:b/>
+          <w:color w:val="0F172A"/>
           <w:sz w:val="21"/>
         </w:rPr>
-        <w:t>Lời thoại thuyết trình (Đọc trực tiếp):</w:t>
+        <w:t>Nội dung trình bày:</w:t>
         <w:br/>
       </w:r>
       <w:r>
         <w:rPr>
-          <w:color w:val="1E293B"/>
-          <w:sz w:val="22"/>
+          <w:i w:val="0"/>
+          <w:color w:val="334155"/>
+          <w:sz w:val="21"/>
         </w:rPr>
-        <w:t>“Năm 2013, những tài liệu rò rỉ của Edward Snowden đã vén màn bí mật về NSA - kẻ đối đầu cấp quốc gia mạnh nhất lịch sử: NSA không tập trung giải các bài toán toán học khó, mà họ: Một là, chi 250 triệu USD cho dự án BULLRUN để can thiệp tiêu chuẩn hóa, cố ý cài cửa sau vào bộ sinh số ngẫu nhiên Dual_EC_DRBG của NIST. Hai là, thực hiện dự án MUSCULAR câu trộm cáp quang nội bộ giữa các trung tâm dữ liệu của Google và Yahoo trước khi dữ liệu kịp mã hóa. Ba là, can thiệp phần cứng chuỗi cung ứng và thực hiện giám sát siêu dữ liệu quy mô lớn (PRISM, XKeyscore). Đồng thời, sự phát triển của máy tính lượng tử với thuật toán Shor đe dọa bẻ gãy RSA/ECC, khiến cộng đồng phải đặt câu hỏi: Liệu các thuật toán hậu lượng tử mới do NIST và NSA hậu thuẫn có thực sự an toàn?”</w:t>
+        <w:t>"Section 6 của Halpin mổ xẻ bước ngoặt lịch sử năm 2013 từ tài liệu Edward Snowden:</w:t>
+        <w:br/>
+        <w:t>• Phơi bày năng lực thực sự của đối thủ thể chế (NSA và liên minh Five Eyes): Ngân sách khổng lồ, năng lực giám sát cáp quang biển toàn cầu (chương trình PRISM, MUSCULAR).</w:t>
+        <w:br/>
+        <w:t>• Can thiệp tiêu chuẩn mật mã học: Điển hình là vụ việc cài cửa sau vào bộ sinh số ngẫu nhiên Dual_EC_DRBG được chuẩn hóa bởi NIST, cho phép cơ quan tình báo tính toán trước khóa bí mật.</w:t>
+        <w:br/>
+        <w:t>• Bài học nhận thức luận: An toàn mật mã không chỉ là bài toán giữa Alice, Bob và Eve trong phòng thí nghiệm; an toàn hệ thống phải chịu đựng được áp lực từ các thực thể có nguồn lực tài chính, chính trị và công nghệ quy mô nhà nước."</w:t>
       </w:r>
     </w:p>
     <w:p>
       <w:pPr>
-        <w:spacing w:after="280"/>
+        <w:spacing w:before="40" w:after="160"/>
         <w:ind w:left="288"/>
       </w:pPr>
       <w:r>
@@ -508,53 +588,64 @@
           <w:color w:val="64748B"/>
           <w:sz w:val="19"/>
         </w:rPr>
-        <w:t>• Chỉ dẫn tương tác: Chuyển slide dứt khoát; nhấn giọng vào các con số thực nghiệm và các luận điểm triết học của Halpin.</w:t>
-        <w:br/>
-      </w:r>
-    </w:p>
-    <w:p>
-      <w:r>
-        <w:rPr>
-          <w:b/>
-          <w:color w:val="2563EB"/>
-          <w:sz w:val="24"/>
-        </w:rPr>
-        <w:t>SLIDE 09: ĐÓNG GÓP CỐT LÕI &amp; CHƯƠNG TRÌNH NGHIÊN CỨU MỚI CỦA HARRY HALPIN</w:t>
-      </w:r>
-      <w:r>
-        <w:rPr>
-          <w:i/>
-          <w:color w:val="D97706"/>
-          <w:sz w:val="20"/>
-        </w:rPr>
-        <w:t xml:space="preserve">  [Thời lượng: 45 giây]</w:t>
+        <w:t>• Lưu ý trình bày: Điểm nhấn trình bày: Nhấn mạnh ý nghĩa lịch sử của sự kiện Snowden đối với nhận thức luận an ninh.</w:t>
       </w:r>
     </w:p>
     <w:p>
       <w:pPr>
-        <w:spacing w:after="240"/>
-        <w:ind w:left="288" w:right="288"/>
+        <w:spacing w:before="200" w:after="40"/>
       </w:pPr>
       <w:r>
         <w:rPr>
           <w:b/>
-          <w:color w:val="0D9488"/>
+          <w:color w:val="1E40AF"/>
+          <w:sz w:val="24"/>
+        </w:rPr>
+        <w:t xml:space="preserve">► SLIDE 9: BỐN CÂU HỎI NGHIÊN CỨU TƯƠNG LAI CỦA HALPIN (RQ1–RQ4) </w:t>
+      </w:r>
+      <w:r>
+        <w:rPr>
+          <w:b/>
+          <w:color w:val="64748B"/>
+          <w:sz w:val="20"/>
+        </w:rPr>
+        <w:t>[1:00]</w:t>
+      </w:r>
+    </w:p>
+    <w:p>
+      <w:pPr>
+        <w:spacing w:before="40" w:after="80"/>
+        <w:ind w:left="288"/>
+      </w:pPr>
+      <w:r>
+        <w:rPr>
+          <w:b/>
+          <w:color w:val="0F172A"/>
           <w:sz w:val="21"/>
         </w:rPr>
-        <w:t>Lời thoại thuyết trình (Đọc trực tiếp):</w:t>
+        <w:t>Nội dung trình bày:</w:t>
         <w:br/>
       </w:r>
       <w:r>
         <w:rPr>
-          <w:color w:val="1E293B"/>
-          <w:sz w:val="22"/>
+          <w:i w:val="0"/>
+          <w:color w:val="334155"/>
+          <w:sz w:val="21"/>
         </w:rPr>
-        <w:t>“Từ những phân tích lịch sử và thực tiễn, Halpin đề xuất chương trình nghiên cứu tương lai gồm ba trụ cột: Thứ nhất, Tái định nghĩa bản thể luận: Mở rộng mô hình truyền thông từ hai thực thể đơn lẻ sang mạng lưới xã hội - kỹ thuật không đồng nhất gồm nhiều tác nhân phức tạp. Thứ hai, Chuyển hướng bảo vệ sang Siêu dữ liệu: Khi nội dung đã được mã hóa, điều sống còn là chống phân tích lưu lượng thông qua các mạng ẩn danh Mixnet (kế thừa David Chaum và dự án Nym). Thứ ba, Xây dựng một nền Khoa học an ninh thông tin thực nghiệm (Empirical Science of Security), kết hợp kinh tế học an ninh của Ross Anderson và đo lường trên hệ thống thực tế thay vì chỉ giam mình trong chứng minh toán học thuần túy.”</w:t>
+        <w:t>"Halpin khép lại phần lý thuyết bằng việc đề xuất 4 câu hỏi nghiên cứu mở định hình tương lai:</w:t>
+        <w:br/>
+        <w:t>• RQ1 (Triết học khoa học): Làm thế nào để xây dựng một phương pháp luận khoa học an ninh hoàn chỉnh, tích hợp cả chứng minh toán học hình thức lẫn kiểm định thực nghiệm vật lý?</w:t>
+        <w:br/>
+        <w:t>• RQ2 (Bản thể học Kẻ thù): Liệu có thể xây dựng một bản thể học hình thức thống nhất về Đối thủ, bao gồm cả rò rỉ kênh kề, suy thoái phần cứng và lỗi Byzantine nội bộ?</w:t>
+        <w:br/>
+        <w:t>• RQ3 (Giám sát Siêu dữ liệu &amp; Mixnet): Làm thế nào để thiết kế các kiến trúc định tuyến ẩn danh (như Nym, Tor) bảo vệ siêu dữ liệu trước đối thủ toàn cục kiểm soát hạ tầng mạng?</w:t>
+        <w:br/>
+        <w:t>• RQ4 (Chính trị học Mật mã): Mật mã học định hình lại cấu trúc quyền lực và tự do dân sự trong kỷ nguyên số như thế nào?"</w:t>
       </w:r>
     </w:p>
     <w:p>
       <w:pPr>
-        <w:spacing w:after="280"/>
+        <w:spacing w:before="40" w:after="160"/>
         <w:ind w:left="288"/>
       </w:pPr>
       <w:r>
@@ -563,53 +654,62 @@
           <w:color w:val="64748B"/>
           <w:sz w:val="19"/>
         </w:rPr>
-        <w:t>• Chỉ dẫn tương tác: Chuyển slide dứt khoát; nhấn giọng vào các con số thực nghiệm và các luận điểm triết học của Halpin.</w:t>
-        <w:br/>
-      </w:r>
-    </w:p>
-    <w:p>
-      <w:r>
-        <w:rPr>
-          <w:b/>
-          <w:color w:val="2563EB"/>
-          <w:sz w:val="24"/>
-        </w:rPr>
-        <w:t>SLIDE 10: PHÂN TÍCH KHẢ NĂNG TÁI LẬP &amp; TIÊU CHUẨN ĐÁNH GIÁ GIỮA KỲ</w:t>
-      </w:r>
-      <w:r>
-        <w:rPr>
-          <w:i/>
-          <w:color w:val="D97706"/>
-          <w:sz w:val="20"/>
-        </w:rPr>
-        <w:t xml:space="preserve">  [Thời lượng: 45 giây]</w:t>
+        <w:t>• Lưu ý trình bày: Điểm nhấn trình bày: Trình bày cô đọng 4 câu hỏi nghiên cứu lớn của tác giả.</w:t>
       </w:r>
     </w:p>
     <w:p>
       <w:pPr>
-        <w:spacing w:after="240"/>
-        <w:ind w:left="288" w:right="288"/>
+        <w:spacing w:before="200" w:after="40"/>
       </w:pPr>
       <w:r>
         <w:rPr>
           <w:b/>
-          <w:color w:val="0D9488"/>
+          <w:color w:val="1E40AF"/>
+          <w:sz w:val="24"/>
+        </w:rPr>
+        <w:t xml:space="preserve">► SLIDE 10: PHÂN TÍCH PHƯƠNG PHÁP LUẬN &amp; GIỚI HẠN TÁI LẬP </w:t>
+      </w:r>
+      <w:r>
+        <w:rPr>
+          <w:b/>
+          <w:color w:val="64748B"/>
+          <w:sz w:val="20"/>
+        </w:rPr>
+        <w:t>[1:00]</w:t>
+      </w:r>
+    </w:p>
+    <w:p>
+      <w:pPr>
+        <w:spacing w:before="40" w:after="80"/>
+        <w:ind w:left="288"/>
+      </w:pPr>
+      <w:r>
+        <w:rPr>
+          <w:b/>
+          <w:color w:val="0F172A"/>
           <w:sz w:val="21"/>
         </w:rPr>
-        <w:t>Lời thoại thuyết trình (Đọc trực tiếp):</w:t>
+        <w:t>Nội dung trình bày:</w:t>
         <w:br/>
       </w:r>
       <w:r>
         <w:rPr>
-          <w:color w:val="1E293B"/>
-          <w:sz w:val="22"/>
+          <w:i w:val="0"/>
+          <w:color w:val="334155"/>
+          <w:sz w:val="21"/>
         </w:rPr>
-        <w:t>“Bây giờ, em xin chuyển sang phần kiểm toán tính tái lập của bài báo: Theo quy định đánh giá giữa kỳ của Giảng viên: Khung điểm 6 đến 8 yêu cầu dịch bài báo và chạy lại kết quả trên dataset của bài báo. Tuy nhiên, bài báo của Halpin là công trình lý thuyết triết học, 100% không có code, không có dataset, không có benchmark định lượng gốc. Do đó, khả năng tái lập nguyên văn (Nhóm A) là 0%. Để đạt được Khung điểm 9 đến 10, Giảng viên yêu cầu cá nhân phải: Dịch bài báo, TỰ XÂY DỰNG MODELS, THUẬT TOÁN VÀ CHẠY LẠI KẾT QUẢ TỪ DATASET CHO KẾT QUẢ TỐT HƠN. Bám sát tiêu chí này, nhóm em đã tự chọn bộ dữ liệu thực tế Kaggle (2.483 tệp), tự xây dựng 3 baseline đối chứng và tự đề xuất thuật toán Cây Merkle phân cấp động tối ưu hơn!”</w:t>
+        <w:t>"Slide 10 đưa ra tuyên bố phương pháp luận minh bạch của nhóm nghiên cứu đề tài DT005:</w:t>
+        <w:br/>
+        <w:t>• Đặc thù của bài báo: Bài báo của Harry Halpin (2025) là một công trình khảo cứu nhận thức luận triết học thuần túy (philosophical survey), xuất bản trên tạp chí chuyên ngành liên ngành. Bài báo chứa 0 dòng code, 0 bộ dữ liệu benchmark và 0 kết quả đo đạc định lượng.</w:t>
+        <w:br/>
+        <w:t>• Nguyên tắc tái lập khoa học: Nhóm không ngụy tạo kết quả của tác giả. Thay vào đó, nhóm thực hiện tái lập theo phương pháp: Trích xuất các khái niệm lý thuyết cốt lõi của bài báo và tự thiết kế độc lập một hệ thống phần mềm thực nghiệm để kiểm chứng và minh họa các khái niệm đó.</w:t>
+        <w:br/>
+        <w:t>• Bộ dữ liệu Kaggle Resume Dataset (2.483 tệp, 112 MB) và bộ công cụ đo đạc đối kháng là sản phẩm tự phát triển của sinh viên, đóng vai trò công cụ minh họa trực quan cho các lập luận của Halpin."</w:t>
       </w:r>
     </w:p>
     <w:p>
       <w:pPr>
-        <w:spacing w:after="280"/>
+        <w:spacing w:before="40" w:after="160"/>
         <w:ind w:left="288"/>
       </w:pPr>
       <w:r>
@@ -618,53 +718,62 @@
           <w:color w:val="64748B"/>
           <w:sz w:val="19"/>
         </w:rPr>
-        <w:t>• Chỉ dẫn tương tác: Chuyển slide dứt khoát; nhấn giọng vào các con số thực nghiệm và các luận điểm triết học của Halpin.</w:t>
-        <w:br/>
-      </w:r>
-    </w:p>
-    <w:p>
-      <w:r>
-        <w:rPr>
-          <w:b/>
-          <w:color w:val="2563EB"/>
-          <w:sz w:val="24"/>
-        </w:rPr>
-        <w:t>SLIDE 11: BẢNG ÁNH XẠ: LUẬN ĐIỂM BÀI BÁO VS HIỆN THỰC HÓA CODE MINH HỌA DT005</w:t>
-      </w:r>
-      <w:r>
-        <w:rPr>
-          <w:i/>
-          <w:color w:val="D97706"/>
-          <w:sz w:val="20"/>
-        </w:rPr>
-        <w:t xml:space="preserve">  [Thời lượng: 50 giây]</w:t>
+        <w:t>• Lưu ý trình bày: Điểm nhấn trình bày: Khẳng định trung thực học thuật: Bài báo là lý thuyết, phần mềm là mô hình minh họa độc lập.</w:t>
       </w:r>
     </w:p>
     <w:p>
       <w:pPr>
-        <w:spacing w:after="240"/>
-        <w:ind w:left="288" w:right="288"/>
+        <w:spacing w:before="200" w:after="40"/>
       </w:pPr>
       <w:r>
         <w:rPr>
           <w:b/>
-          <w:color w:val="0D9488"/>
+          <w:color w:val="1E40AF"/>
+          <w:sz w:val="24"/>
+        </w:rPr>
+        <w:t xml:space="preserve">► SLIDE 11: MINH HỌA PAPER-TO-CODE &amp; GIỚI HẠN DIỄN GIẢI [SƠ ĐỒ 4] </w:t>
+      </w:r>
+      <w:r>
+        <w:rPr>
+          <w:b/>
+          <w:color w:val="64748B"/>
+          <w:sz w:val="20"/>
+        </w:rPr>
+        <w:t>[1:15]</w:t>
+      </w:r>
+    </w:p>
+    <w:p>
+      <w:pPr>
+        <w:spacing w:before="40" w:after="80"/>
+        <w:ind w:left="288"/>
+      </w:pPr>
+      <w:r>
+        <w:rPr>
+          <w:b/>
+          <w:color w:val="0F172A"/>
           <w:sz w:val="21"/>
         </w:rPr>
-        <w:t>Lời thoại thuyết trình (Đọc trực tiếp):</w:t>
+        <w:t>Nội dung trình bày:</w:t>
         <w:br/>
       </w:r>
       <w:r>
         <w:rPr>
-          <w:color w:val="1E293B"/>
-          <w:sz w:val="22"/>
+          <w:i w:val="0"/>
+          <w:color w:val="334155"/>
+          <w:sz w:val="21"/>
         </w:rPr>
-        <w:t>“Trên slide 11 là bảng ma trận ánh xạ 5 luận điểm triết học của Halpin sang mã nguồn thực nghiệm của đề tài DT005: 1. Luận điểm Shannon vs Kẻ thù chủ đích: Em xây dựng thuật toán khử Gauss trên trường GF(2) chứng minh mã kiểm tra lỗi CRC32 bị bẻ gãy 100%, trong khi SHA-256 chặn đứng tức thì. 2. Nguyên lý Kerckhoffs: Em xây dựng Baseline 1 Flat SHA-256 Manifest công khai hoàn toàn. 3. Kẻ nghe lén Shannon &amp; rủi ro kênh khóa: Em xây dựng Baseline 2 HMAC-SHA256, chỉ ra ưu điểm chống sửa manifest nhưng chứng minh hệ thống sụp đổ nếu 1 client để lộ khóa bí mật K. 4. Mạng thù địch Dolev-Yao: Em xây dựng Baseline 3 Standard Merkle Tree, cung cấp Merkle Proof O(log N) cho client xác thực độc lập chỉ với 32-byte Root Hash công khai. 5. Tấn công kênh kề đo thời gian Kocher: Em đo 20.000 chu kỳ so sánh chuỗi, chứng minh toán tử == ngắt sớm làm rò rỉ thời gian, trong khi hmac.compare_digest triệt tiêu hoàn toàn rò rỉ.”</w:t>
+        <w:t>"Sơ đồ 4 đối chiếu minh bạch ba ví dụ chuyển đổi từ luận điểm bài báo sang mã nguồn thực nghiệm:</w:t>
+        <w:br/>
+        <w:t>• Ví dụ 1 (Nhiễu vs Kẻ thù chủ đích): Halpin chỉ rõ mã kiểm tra lỗi CRC32 chỉ chống được nhiễu ngẫu nhiên. Nhóm triển khai thuật toán giải hệ phương trình bù trên trường nhị phân GF(2), tìm 4 byte patch làm giả tệp tin mà CRC32 vẫn trùng khớp 100%. Ngược lại, hàm băm SHA-256 phát hiện thay đổi ngay lập tức. Giới hạn: Thí nghiệm chỉ minh họa tính phi tuyến của hàm băm, không đại diện cho an toàn toàn diện của toàn hệ thống.</w:t>
+        <w:br/>
+        <w:t>• Ví dụ 2 (Nhập nhằng nút lá trong cây Merkle): Phép ghép thô H(L || R) có nguy cơ làm lẫn lộn nút nhánh nội bộ với nút lá. Nhóm cài đặt chuẩn phân tách miền RFC 6962: Tiền tố 0x00 cho lá và 0x01 cho nhánh, triệt tiêu hoàn toàn nhập nhằng cấu trúc. Giới hạn: Chỉ giải quyết va chạm cấu trúc tầng cây, không loại trừ va chạm ngẫu nhiên 2^256 của SHA-256.</w:t>
+        <w:br/>
+        <w:t>• Ví dụ 3 (Tấn công kênh kề thời gian): Dừng sớm khi so sánh chuỗi làm rò rỉ dữ liệu qua thời gian thực thi. Nhóm đo đạc so sánh tuần tự và chứng minh hàm hmac.compare_digest triệt tiêu độ lệch thời gian. Giới hạn: Phép đo trên Python có độ trễ hệ điều hành, chỉ minh họa ở mức thư viện phần mềm."</w:t>
       </w:r>
     </w:p>
     <w:p>
       <w:pPr>
-        <w:spacing w:after="280"/>
+        <w:spacing w:before="40" w:after="160"/>
         <w:ind w:left="288"/>
       </w:pPr>
       <w:r>
@@ -673,53 +782,56 @@
           <w:color w:val="64748B"/>
           <w:sz w:val="19"/>
         </w:rPr>
-        <w:t>• Chỉ dẫn tương tác: Chuyển slide dứt khoát; nhấn giọng vào các con số thực nghiệm và các luận điểm triết học của Halpin.</w:t>
-        <w:br/>
-      </w:r>
-    </w:p>
-    <w:p>
-      <w:r>
-        <w:rPr>
-          <w:b/>
-          <w:color w:val="2563EB"/>
-          <w:sz w:val="24"/>
-        </w:rPr>
-        <w:t>SLIDE 12: ĐÓNG GÓP THUẬT TOÁN TỰ XÂY DỰNG ĐẠT CHUẨN [9-10 ĐIỂM]: CÂY MERKLE PHÂN CẤP ĐỘNG</w:t>
-      </w:r>
-      <w:r>
-        <w:rPr>
-          <w:i/>
-          <w:color w:val="D97706"/>
-          <w:sz w:val="20"/>
-        </w:rPr>
-        <w:t xml:space="preserve">  [Thời lượng: 60 giây]</w:t>
+        <w:t>• Lưu ý trình bày: Điểm nhấn trình bày: Bám sát 3 cột trên slide: Luận điểm bài báo, Mã nguồn DT005, Giới hạn diễn giải.</w:t>
       </w:r>
     </w:p>
     <w:p>
       <w:pPr>
-        <w:spacing w:after="240"/>
-        <w:ind w:left="288" w:right="288"/>
+        <w:spacing w:before="200" w:after="40"/>
       </w:pPr>
       <w:r>
         <w:rPr>
           <w:b/>
-          <w:color w:val="0D9488"/>
+          <w:color w:val="1E40AF"/>
+          <w:sz w:val="24"/>
+        </w:rPr>
+        <w:t xml:space="preserve">► SLIDE 12: SLIDE CHUYỂN TIẾP: DEMO TRỰC TIẾP </w:t>
+      </w:r>
+      <w:r>
+        <w:rPr>
+          <w:b/>
+          <w:color w:val="64748B"/>
+          <w:sz w:val="20"/>
+        </w:rPr>
+        <w:t>[0:15]</w:t>
+      </w:r>
+    </w:p>
+    <w:p>
+      <w:pPr>
+        <w:spacing w:before="40" w:after="80"/>
+        <w:ind w:left="288"/>
+      </w:pPr>
+      <w:r>
+        <w:rPr>
+          <w:b/>
+          <w:color w:val="0F172A"/>
           <w:sz w:val="21"/>
         </w:rPr>
-        <w:t>Lời thoại thuyết trình (Đọc trực tiếp):</w:t>
+        <w:t>Nội dung trình bày:</w:t>
         <w:br/>
       </w:r>
       <w:r>
         <w:rPr>
-          <w:color w:val="1E293B"/>
-          <w:sz w:val="22"/>
+          <w:i w:val="0"/>
+          <w:color w:val="334155"/>
+          <w:sz w:val="21"/>
         </w:rPr>
-        <w:t>“Để đạt trọn vẹn khung điểm 9-10 theo yêu cầu của Thầy, em xin dành DUY NHẤT 1 TRANG SLIDE NÀY để trình bày thuật toán tự xây dựng của đề tài: Cây Merkle nhị phân truyền thống có hạn chế rất lớn: Khi thêm hoặc xóa 1 tệp, cấu trúc mảng bị vỡ nên buộc phải Rebuild lại toàn bộ cây với chi phí O(N) mất tới 283.9 ms, đồng thời làm phẳng mất cấu trúc thư mục. Em đề xuất mô hình Cây Merkle Phân cấp Động (HD-MerkleTree): Ánh xạ trực tiếp cây thư mục thực tế với các cây con cục bộ. Khi có tệp thay đổi, cơ chế Dirty-Path Cache chỉ tính toán lại duy nhất nhánh cha bị tác động từ lá lên gốc với chi phí logarit O(log N), kết hợp phân tách miền byte 0x00 lá và 0x01 nhánh theo RFC 6962 triệt tiêu 100% va chạm tiền ảnh thứ hai. Kết quả đo đạc thực tế trên tập Kaggle 2.483 tệp: Thời gian thêm tệp chỉ mất 0.24 ms so với 283.9 ms của Merkle chuẩn (nhanh hơn ~1.200 lần); xóa tệp chỉ mất 0.09 ms so với 233.5 ms (nhanh hơn ~2.600 lần); và gói bằng chứng nén CompactProof chỉ 256 Bytes, tiết kiệm 99.9% băng thông mạng so với danh mục băm phẳng 253 KB!”</w:t>
+        <w:t>"Sau phần phân tích lý thuyết và đối chiếu phương pháp luận, nhóm chuyển sang phần Diễn tập An ninh Thực nghiệm trực tiếp: Mô hình đối kháng hai màn hình giữa Hệ thống phòng thủ Blue Team (Port 8080) và Động cơ tấn công đối kháng Red Team (Port 8081) trên tập dữ liệu thực tế 2.483 tệp tin."</w:t>
       </w:r>
     </w:p>
     <w:p>
       <w:pPr>
-        <w:spacing w:after="280"/>
+        <w:spacing w:before="40" w:after="160"/>
         <w:ind w:left="288"/>
       </w:pPr>
       <w:r>
@@ -728,53 +840,62 @@
           <w:color w:val="64748B"/>
           <w:sz w:val="19"/>
         </w:rPr>
-        <w:t>• Chỉ dẫn tương tác: Chuyển slide dứt khoát; nhấn giọng vào các con số thực nghiệm và các luận điểm triết học của Halpin.</w:t>
-        <w:br/>
-      </w:r>
-    </w:p>
-    <w:p>
-      <w:r>
-        <w:rPr>
-          <w:b/>
-          <w:color w:val="2563EB"/>
-          <w:sz w:val="24"/>
-        </w:rPr>
-        <w:t>SLIDE 13: THIẾT KẾ THỰC NGHIỆM DEMO: BÁM SÁT 100% KHÁI NIỆM KẺ ĐỐI ĐẦU CỦA BÀI BÁO</w:t>
-      </w:r>
-      <w:r>
-        <w:rPr>
-          <w:i/>
-          <w:color w:val="D97706"/>
-          <w:sz w:val="20"/>
-        </w:rPr>
-        <w:t xml:space="preserve">  [Thời lượng: 50 giây]</w:t>
+        <w:t>• Lưu ý trình bày: Điểm nhấn trình bày: Chuyển tiếp dứt khoát, giới thiệu các cổng demo trực quan.</w:t>
       </w:r>
     </w:p>
     <w:p>
       <w:pPr>
-        <w:spacing w:after="240"/>
-        <w:ind w:left="288" w:right="288"/>
+        <w:spacing w:before="200" w:after="40"/>
       </w:pPr>
       <w:r>
         <w:rPr>
           <w:b/>
-          <w:color w:val="0D9488"/>
+          <w:color w:val="1E40AF"/>
+          <w:sz w:val="24"/>
+        </w:rPr>
+        <w:t xml:space="preserve">► SLIDE 13: KIẾN TRÚC DIỄN TẬP ĐỐI KHÁNG RED TEAM VS BLUE TEAM [SƠ ĐỒ 5: DRAW.IO] </w:t>
+      </w:r>
+      <w:r>
+        <w:rPr>
+          <w:b/>
+          <w:color w:val="64748B"/>
+          <w:sz w:val="20"/>
+        </w:rPr>
+        <w:t>[1:00]</w:t>
+      </w:r>
+    </w:p>
+    <w:p>
+      <w:pPr>
+        <w:spacing w:before="40" w:after="80"/>
+        <w:ind w:left="288"/>
+      </w:pPr>
+      <w:r>
+        <w:rPr>
+          <w:b/>
+          <w:color w:val="0F172A"/>
           <w:sz w:val="21"/>
         </w:rPr>
-        <w:t>Lời thoại thuyết trình (Đọc trực tiếp):</w:t>
+        <w:t>Nội dung trình bày:</w:t>
         <w:br/>
       </w:r>
       <w:r>
         <w:rPr>
-          <w:color w:val="1E293B"/>
-          <w:sz w:val="22"/>
+          <w:i w:val="0"/>
+          <w:color w:val="334155"/>
+          <w:sz w:val="21"/>
         </w:rPr>
-        <w:t>“Slide 13 mô tả thiết kế hệ thống Demo thực tế bám sát 100% tinh thần đối kháng của bài báo: Red Team (Động cơ kẻ đối đầu The Adversary): Phát động các đòn tấn công bám sát lý thuyết: Bẻ gãy CRC32 bằng đại số GF(2), tráo đổi proof trên mạng Dolev-Yao, khai thác kênh kề đo thời gian Kocher, và thực hiện sửa đổi, chèn cửa sau, xóa tệp tin trực tiếp trên đĩa. Blue Team (Hệ thống phòng thủ): Sử dụng 3 cơ chế toàn vẹn (Flat Hash, HMAC, Merkle Tree) để phát hiện vi phạm và cung cấp lệnh Rollback All khôi phục đĩa cứng về nguyên trạng 100% sau mỗi đợt tấn công. Hệ thống hỗ trợ cả giao diện dòng lệnh độc lập Red Team CLI Console và Web Dashboard trực quan tại Port 8080.”</w:t>
+        <w:t>"Sơ đồ 5 mô tả kiến trúc tương tác thời gian thực giữa hai bên:</w:t>
+        <w:br/>
+        <w:t>• Blue Team (Port 8080 - Hệ thống phòng thủ &amp; giám sát): Nạp toàn bộ tập dữ liệu 2.483 tệp (112 MB) để thiết lập Mốc tin cậy ban đầu (Root Hash H_0 sạch). Khi phát hiện can thiệp, cơ chế Dirty Path O(log N) định vị chính xác vị trí tệp tin bị biến đổi trong ~1.06 ms (tốc độ quét đạt 2.325 tệp/giây).</w:t>
+        <w:br/>
+        <w:t>• Red Team (Port 8081 - Động cơ tấn công đối kháng Adversary Engine): Mô phỏng các vector can thiệp thực tế: Sửa byte tệp ngẫu nhiên (In-place Tamper), bù 4 byte GF(2) qua mặt CRC32, đánh tráo Merkle Proof trên đường truyền Dolev-Yao, và chèn backdoor/xóa tệp.</w:t>
+        <w:br/>
+        <w:t>• Cơ chế Rollback an toàn: Thư mục sao lưu .adversary_backups/ cho phép phục hồi nguyên trạng 100% dữ liệu gốc chỉ với 1 cú click chuột sau mỗi đợt diễn tập."</w:t>
       </w:r>
     </w:p>
     <w:p>
       <w:pPr>
-        <w:spacing w:after="280"/>
+        <w:spacing w:before="40" w:after="160"/>
         <w:ind w:left="288"/>
       </w:pPr>
       <w:r>
@@ -783,53 +904,62 @@
           <w:color w:val="64748B"/>
           <w:sz w:val="19"/>
         </w:rPr>
-        <w:t>• Chỉ dẫn tương tác: Chuyển slide dứt khoát; nhấn giọng vào các con số thực nghiệm và các luận điểm triết học của Halpin.</w:t>
-        <w:br/>
-      </w:r>
-    </w:p>
-    <w:p>
-      <w:r>
-        <w:rPr>
-          <w:b/>
-          <w:color w:val="2563EB"/>
-          <w:sz w:val="24"/>
-        </w:rPr>
-        <w:t>SLIDE 14: TỔNG KẾT BÁO CÁO GIỮA KỲ &amp; SẴN SÀNG THỰC HIỆN DEMO TRỰC TIẾP</w:t>
-      </w:r>
-      <w:r>
-        <w:rPr>
-          <w:i/>
-          <w:color w:val="D97706"/>
-          <w:sz w:val="20"/>
-        </w:rPr>
-        <w:t xml:space="preserve">  [Thời lượng: 30 giây]</w:t>
+        <w:t>• Lưu ý trình bày: Điểm nhấn trình bày: Thuyết minh theo sơ đồ draw.io kiến trúc Red vs Blue, nhấn mạnh cơ chế phát hiện và rollback an toàn.</w:t>
       </w:r>
     </w:p>
     <w:p>
       <w:pPr>
-        <w:spacing w:after="240"/>
-        <w:ind w:left="288" w:right="288"/>
+        <w:spacing w:before="200" w:after="40"/>
       </w:pPr>
       <w:r>
         <w:rPr>
           <w:b/>
-          <w:color w:val="0D9488"/>
+          <w:color w:val="1E40AF"/>
+          <w:sz w:val="24"/>
+        </w:rPr>
+        <w:t xml:space="preserve">► SLIDE 14: TỔNG KẾT BÁO CÁO GIỮA KỲ &amp; LỘ TRÌNH CUỐI KỲ </w:t>
+      </w:r>
+      <w:r>
+        <w:rPr>
+          <w:b/>
+          <w:color w:val="64748B"/>
+          <w:sz w:val="20"/>
+        </w:rPr>
+        <w:t>[0:45]</w:t>
+      </w:r>
+    </w:p>
+    <w:p>
+      <w:pPr>
+        <w:spacing w:before="40" w:after="80"/>
+        <w:ind w:left="288"/>
+      </w:pPr>
+      <w:r>
+        <w:rPr>
+          <w:b/>
+          <w:color w:val="0F172A"/>
           <w:sz w:val="21"/>
         </w:rPr>
-        <w:t>Lời thoại thuyết trình (Đọc trực tiếp):</w:t>
+        <w:t>Nội dung trình bày:</w:t>
         <w:br/>
       </w:r>
       <w:r>
         <w:rPr>
-          <w:color w:val="1E293B"/>
-          <w:sz w:val="22"/>
+          <w:i w:val="0"/>
+          <w:color w:val="334155"/>
+          <w:sz w:val="21"/>
         </w:rPr>
-        <w:t>“Tổng kết lại, bài báo cáo giữa kỳ của em đã: Một là, dịch thuật và nghiên cứu thấu đáo bài báo triết học của Harry Halpin (2025), kiểm toán khoa học trung thực. Hai là, đáp ứng trọn vẹn tiêu chuẩn đánh giá điểm 9-10 của Giảng viên thông qua việc tự xây dựng mô hình thuật toán HD-Merkle và đo đạc cho kết quả vượt trội hơn 1.200 lần trên tập dữ liệu thực tế. Ba là, chuẩn bị đầy đủ hệ thống demo bám sát 100% luận điểm bài báo. Sau đây em xin phép được trình chiếu phần Demo thực nghiệm trước Thầy và Hội đồng!”</w:t>
+        <w:t>"Tổng kết báo cáo giữa kỳ đề tài DT005:</w:t>
+        <w:br/>
+        <w:t>1. Về mặt học thuật: Hoàn thành thẩm định khoa học bài báo của Halpin (2025), phân tích đúng đắn cơ sở triết học và các mô hình kẻ đối đầu qua các thời kỳ lịch sử.</w:t>
+        <w:br/>
+        <w:t>2. Về mặt thực nghiệm: Xây dựng thành công bộ công cụ diễn tập đối kháng Red Team vs Blue Team minh họa sinh động 3 luận điểm kỹ thuật chính của bài báo.</w:t>
+        <w:br/>
+        <w:t>3. Đề xuất lộ trình nghiên cứu cuối kỳ: Nhóm tiếp tục hoàn thiện và tối ưu hóa giải pháp thuật toán Cây Merkle phân cấp động (HD-MerkleTree): Cơ chế cập nhật cục bộ Dirty-Path Cache đạt độ phức tạp O(log N) (~0.24 ms/tệp), chuẩn phân tách miền RFC 6962, tối ưu hóa kích thước bằng chứng CompactProof (256 bytes) và thực hiện kiểm thử độ bền (Ablation Study) toàn diện."</w:t>
       </w:r>
     </w:p>
     <w:p>
       <w:pPr>
-        <w:spacing w:after="280"/>
+        <w:spacing w:before="40" w:after="160"/>
         <w:ind w:left="288"/>
       </w:pPr>
       <w:r>
@@ -838,8 +968,65 @@
           <w:color w:val="64748B"/>
           <w:sz w:val="19"/>
         </w:rPr>
-        <w:t>• Chỉ dẫn tương tác: Chuyển slide dứt khoát; nhấn giọng vào các con số thực nghiệm và các luận điểm triết học của Halpin.</w:t>
+        <w:t>• Lưu ý trình bày: Điểm nhấn trình bày: Tóm tắt 3 kết quả đạt được giữa kỳ và lộ trình kỹ thuật cuối kỳ rõ ràng.</w:t>
+      </w:r>
+    </w:p>
+    <w:p>
+      <w:pPr>
+        <w:spacing w:before="200" w:after="40"/>
+      </w:pPr>
+      <w:r>
+        <w:rPr>
+          <w:b/>
+          <w:color w:val="1E40AF"/>
+          <w:sz w:val="24"/>
+        </w:rPr>
+        <w:t xml:space="preserve">► SLIDE 15: CẢM ƠN &amp; PHIÊN PHẢN BIỆN (Q&amp;A) </w:t>
+      </w:r>
+      <w:r>
+        <w:rPr>
+          <w:b/>
+          <w:color w:val="64748B"/>
+          <w:sz w:val="20"/>
+        </w:rPr>
+        <w:t>[0:15]</w:t>
+      </w:r>
+    </w:p>
+    <w:p>
+      <w:pPr>
+        <w:spacing w:before="40" w:after="80"/>
+        <w:ind w:left="288"/>
+      </w:pPr>
+      <w:r>
+        <w:rPr>
+          <w:b/>
+          <w:color w:val="0F172A"/>
+          <w:sz w:val="21"/>
+        </w:rPr>
+        <w:t>Nội dung trình bày:</w:t>
         <w:br/>
+      </w:r>
+      <w:r>
+        <w:rPr>
+          <w:i w:val="0"/>
+          <w:color w:val="334155"/>
+          <w:sz w:val="21"/>
+        </w:rPr>
+        <w:t>"Phần trình bày báo cáo giữa kỳ của đề tài DT005 đến đây là kết thúc. Xin trân trọng cảm ơn quý vị đã chú ý theo dõi. Nhóm sẵn sàng trao đổi và giải đáp các câu hỏi phản biện."</w:t>
+      </w:r>
+    </w:p>
+    <w:p>
+      <w:pPr>
+        <w:spacing w:before="40" w:after="160"/>
+        <w:ind w:left="288"/>
+      </w:pPr>
+      <w:r>
+        <w:rPr>
+          <w:i/>
+          <w:color w:val="64748B"/>
+          <w:sz w:val="19"/>
+        </w:rPr>
+        <w:t>• Lưu ý trình bày: Điểm nhấn trình bày: Kết thúc tự tin, sẵn sàng chuyển sang phần Demo hoặc trả lời câu hỏi.</w:t>
       </w:r>
     </w:p>
     <w:p>
@@ -850,133 +1037,228 @@
     <w:p>
       <w:pPr>
         <w:pStyle w:val="Heading1"/>
+        <w:spacing w:before="280" w:after="200"/>
       </w:pPr>
       <w:r>
         <w:rPr>
-          <w:color w:val="0F172A"/>
+          <w:b/>
+          <w:color w:val="1E40AF"/>
           <w:sz w:val="28"/>
         </w:rPr>
-        <w:t>PHẦN 2: HƯỚNG DẪN THAO TÁC DEMO THỰC TẾ TRƯỚC GIẢNG VIÊN</w:t>
+        <w:t>PHẦN 2: HƯỚNG DẪN THAO TÁC DIỄN TẬP DEMO THỰC TẾ</w:t>
       </w:r>
     </w:p>
     <w:p>
       <w:r>
-        <w:rPr>
-          <w:color w:val="1E293B"/>
-          <w:sz w:val="22"/>
-        </w:rPr>
-        <w:t>Sinh viên có thể lựa chọn 1 trong 3 phương án Demo dưới đây tùy theo thời lượng Giảng viên cho phép:</w:t>
+        <w:t>Hệ thống demo hỗ trợ 2 hình thức diễn tập tùy thuộc vào yêu cầu của buổi báo cáo: Giao diện Web Trực quan (Khuyến nghị ưu tiên) và Dòng lệnh Terminal CLI độc lập.</w:t>
       </w:r>
     </w:p>
     <w:p>
       <w:pPr>
-        <w:spacing w:after="240"/>
+        <w:spacing w:before="160"/>
       </w:pPr>
       <w:r>
         <w:rPr>
           <w:b/>
-          <w:color w:val="0D9488"/>
-          <w:sz w:val="23"/>
+          <w:color w:val="0F172A"/>
+          <w:sz w:val="24"/>
         </w:rPr>
-        <w:t>Phương án 1: Chạy Suite 7 Kiểm định An ninh Toán học Tự động (Khuyến nghị - 2 phút)</w:t>
-        <w:br/>
-      </w:r>
-      <w:r>
-        <w:rPr>
-          <w:color w:val="1E293B"/>
-          <w:sz w:val="21"/>
-        </w:rPr>
-        <w:t>Lệnh thực thi trong Terminal:</w:t>
-        <w:br/>
-        <w:t xml:space="preserve">    python -m src.proposed_model.security_games</w:t>
-        <w:br/>
-        <w:br/>
-        <w:t>Thuyết minh khi lệnh chạy:</w:t>
-        <w:br/>
-        <w:t>• 'Thưa Thầy, em xin chạy bộ kiểm định 7 mô hình toán học đối kháng bám sát toàn văn bài báo Halpin 2025 trên toàn bộ 2.483 tệp tin Kaggle.'</w:t>
-        <w:br/>
-        <w:t>• Khi màn hình hiện kết quả Game 5 (CRC32 Forge): 'Tại đây, thuật toán khử Gauss GF(2) đã tìm ra 4 byte bù patch đánh lừa hoàn toàn mã CRC32, trong khi SHA-256 phát hiện gian lận tức thì, chứng minh luận điểm Shannon vs Đối thủ chủ đích.'</w:t>
-        <w:br/>
-        <w:t>• Khi hiện kết quả Game 7 (Kocher Timing): 'Hệ thống đo 20.000 chu kỳ chứng minh so sánh chuỗi thông thường làm rò rỉ thời gian, còn hmac.compare_digest triệt tiêu hoàn toàn rò rỉ.'</w:t>
-        <w:br/>
-        <w:t>• Toàn bộ 7 mô hình kiểm định vượt qua chuẩn trong ~5.000 ms.</w:t>
+        <w:t>Phương án 1: Diễn tập Đối kháng 2 Màn hình trên Trình duyệt Web (Ưu tiên hàng đầu)</w:t>
       </w:r>
     </w:p>
     <w:p>
       <w:pPr>
-        <w:spacing w:after="240"/>
+        <w:spacing w:before="80" w:after="40"/>
+        <w:ind w:left="288"/>
       </w:pPr>
       <w:r>
         <w:rPr>
           <w:b/>
-          <w:color w:val="0D9488"/>
-          <w:sz w:val="23"/>
-        </w:rPr>
-        <w:t>Phương án 2: Demo Đối kháng Trực quan Red Team vs Blue Team qua Terminal CLI (3 phút)</w:t>
-        <w:br/>
-      </w:r>
-      <w:r>
-        <w:rPr>
-          <w:color w:val="1E293B"/>
+          <w:color w:val="1E40AF"/>
           <w:sz w:val="21"/>
         </w:rPr>
-        <w:t>Quy trình thực hiện 2 Terminal song song:</w:t>
-        <w:br/>
-        <w:t>1. Mở Terminal 1 (Red Team Adversary Console):</w:t>
-        <w:br/>
-        <w:t xml:space="preserve">    python src/adversary/red_team_cli.py</w:t>
-        <w:br/>
-        <w:t>• Menu hiện ra 10 chức năng tấn công. Bấm phím '1' (Tamper File) để sửa byte tệp ngẫu nhiên.</w:t>
-        <w:br/>
-        <w:t>• Màn hình báo: TAN CONG THANH CONG! Tệp bị phá hoại: Resume/Resume.csv.</w:t>
-        <w:br/>
-        <w:br/>
-        <w:t>2. Mở Terminal 2 (Blue Team Verify):</w:t>
-        <w:br/>
-        <w:t xml:space="preserve">    python -m src.baselines.sha256_manifest --dir "kaggle_dataset" --verify</w:t>
-        <w:br/>
-        <w:t>• Blue Team quét toàn bộ và thông báo vi phạm ngay lập tức: MODIFIED_FILE: Resume/Resume.csv.</w:t>
-        <w:br/>
-        <w:br/>
-        <w:t>3. Thử nghiệm bẻ gãy CRC32:</w:t>
-        <w:br/>
-        <w:t>• Tại Terminal Red Team, bấm phím '4' (CRC32 Forge). Hệ thống báo: CRC32 bị đánh lừa 100%, SHA-256 phát hiện gian lận tức thì.</w:t>
-        <w:br/>
-        <w:br/>
-        <w:t>4. Hoàn nguyên đĩa cứng an toàn:</w:t>
-        <w:br/>
-        <w:t>• Tại Terminal Red Team, bấm phím '9' (Rollback All). Hệ thống khôi phục 100% đĩa cứng về nguyên vẹn.</w:t>
+        <w:t xml:space="preserve">Bước 1: Khởi động 2 máy chủ Web trong nền: </w:t>
       </w:r>
     </w:p>
     <w:p>
       <w:pPr>
-        <w:spacing w:after="240"/>
+        <w:spacing w:before="0" w:after="120"/>
+        <w:ind w:left="576"/>
+      </w:pPr>
+      <w:r>
+        <w:rPr>
+          <w:color w:val="334155"/>
+          <w:sz w:val="20"/>
+        </w:rPr>
+        <w:t>Mở terminal và kích hoạt song song 2 dịch vụ:</w:t>
+        <w:br/>
+        <w:t>• Blue Team Service:  python -m src.demo.web_demo --port 8080</w:t>
+        <w:br/>
+        <w:t>• Red Team Service:   python -m src.demo.red_team_web --port 8081</w:t>
+        <w:br/>
+        <w:t>Mở 2 cửa sổ trình duyệt đặt cạnh nhau (Split Screen): Cửa sổ trái mở http://localhost:8080; cửa sổ phải mở http://localhost:8081.</w:t>
+      </w:r>
+    </w:p>
+    <w:p>
+      <w:pPr>
+        <w:spacing w:before="80" w:after="40"/>
+        <w:ind w:left="288"/>
       </w:pPr>
       <w:r>
         <w:rPr>
           <w:b/>
-          <w:color w:val="0D9488"/>
-          <w:sz w:val="23"/>
+          <w:color w:val="1E40AF"/>
+          <w:sz w:val="21"/>
         </w:rPr>
-        <w:t>Phương án 3: Demo Giao diện Web Dashboard Trực quan (Nếu Giảng viên yêu cầu xem UI)</w:t>
-        <w:br/>
+        <w:t xml:space="preserve">Bước 2: Thiết lập mốc tin cậy sạch tại Blue Team Dashboard (Port 8080): </w:t>
       </w:r>
+    </w:p>
+    <w:p>
+      <w:pPr>
+        <w:spacing w:before="0" w:after="120"/>
+        <w:ind w:left="576"/>
+      </w:pPr>
       <w:r>
         <w:rPr>
-          <w:color w:val="1E293B"/>
+          <w:color w:val="334155"/>
+          <w:sz w:val="20"/>
+        </w:rPr>
+        <w:t>Tại cổng 8080, chọn thư mục 'kaggle_dataset' (chứa 2.483 tệp tin, dung lượng 112.81 MB).</w:t>
+        <w:br/>
+        <w:t>Bấm nút 'Nạp &amp; Tính toán Toàn vẹn'. Hệ thống tính toán và hiển thị Root Hash ban đầu H_0 sạch với trạng thái xanh: '100% NGUYÊN VẸN'.</w:t>
+      </w:r>
+    </w:p>
+    <w:p>
+      <w:pPr>
+        <w:spacing w:before="80" w:after="40"/>
+        <w:ind w:left="288"/>
+      </w:pPr>
+      <w:r>
+        <w:rPr>
+          <w:b/>
+          <w:color w:val="1E40AF"/>
           <w:sz w:val="21"/>
         </w:rPr>
-        <w:t>Lệnh thực thi:</w:t>
+        <w:t xml:space="preserve">Bước 3: Phát động tấn công tại Red Team Adversary Engine (Port 8081): </w:t>
+      </w:r>
+    </w:p>
+    <w:p>
+      <w:pPr>
+        <w:spacing w:before="0" w:after="120"/>
+        <w:ind w:left="576"/>
+      </w:pPr>
+      <w:r>
+        <w:rPr>
+          <w:color w:val="334155"/>
+          <w:sz w:val="20"/>
+        </w:rPr>
+        <w:t>Tại cổng 8081, thực hiện lần lượt các kịch bản tấn công đối kháng:</w:t>
         <w:br/>
-        <w:t xml:space="preserve">    python src/demo/web_demo.py</w:t>
+        <w:t>• Kịch bản 1 (In-place Tamper): Bấm nút 'Can thiệp tệp tin ngẫu nhiên'. Red Team tự động chọn một tệp (ví dụ: Resume/Resume.csv) và sửa đổi nội dung trực tiếp trên ổ đĩa.</w:t>
         <w:br/>
-        <w:t>• Mở trình duyệt tại địa chỉ: http://127.0.0.1:8080</w:t>
+        <w:t>• Kịch bản 2 (CRC32 Forge): Bấm nút 'Tấn công bù 4 byte GF(2)'. Hệ thống giải hệ phương trình tuyến tính, làm sai lệch tệp mà mã CRC32 vẫn giữ nguyên 100%.</w:t>
         <w:br/>
-        <w:t>• Chọn thư mục 'kaggle_dataset' (2.483 tệp).</w:t>
+        <w:t>• Kịch bản 3 (Dolev-Yao MitM): Bấm nút 'Đánh tráo Merkle Proof trên mạng'. Mô phỏng kẻ thù chặn và thay thế chuỗi chứng minh toàn vẹn.</w:t>
+      </w:r>
+    </w:p>
+    <w:p>
+      <w:pPr>
+        <w:spacing w:before="80" w:after="40"/>
+        <w:ind w:left="288"/>
+      </w:pPr>
+      <w:r>
+        <w:rPr>
+          <w:b/>
+          <w:color w:val="1E40AF"/>
+          <w:sz w:val="21"/>
+        </w:rPr>
+        <w:t xml:space="preserve">Bước 4: Kiểm tra và bắt quả tang tại Blue Team Dashboard (Port 8080): </w:t>
+      </w:r>
+    </w:p>
+    <w:p>
+      <w:pPr>
+        <w:spacing w:before="0" w:after="120"/>
+        <w:ind w:left="576"/>
+      </w:pPr>
+      <w:r>
+        <w:rPr>
+          <w:color w:val="334155"/>
+          <w:sz w:val="20"/>
+        </w:rPr>
+        <w:t>Quay trở lại cổng 8080, bấm nút 'Kiểm tra toàn vẹn'.</w:t>
         <w:br/>
-        <w:t>• Bấm nút 'Nạp &amp; Tính toán Toàn vẹn': Hệ thống nạp song song 4 mô hình.</w:t>
+        <w:t>• Hệ thống đổi sang trạng thái cảnh báo đỏ: 'CẢNH BÁO: PHÁT HIỆN CAN THIỆP DỮ LIỆU!'.</w:t>
         <w:br/>
-        <w:t>• Thuyết minh bảng đối sánh tốc độ cập nhật: HD-Merkle chỉ mất 0.24 ms so với 283.9 ms của Standard Merkle, chứng minh kết quả vượt trội đạt điểm 9-10.</w:t>
+        <w:t>• Cột Dirty Path O(log N) chỉ ra chính xác đường dẫn nhánh cây bị sai lệch chỉ trong ~1.06 ms.</w:t>
+        <w:br/>
+        <w:t>• Bảng đối chứng hiển thị: Thuật toán CRC32 bị qua mặt hoàn toàn (Báo khớp sai sự thật), trong khi SHA-256 và Merkle Tree phát hiện tức thì.</w:t>
+      </w:r>
+    </w:p>
+    <w:p>
+      <w:pPr>
+        <w:spacing w:before="80" w:after="40"/>
+        <w:ind w:left="288"/>
+      </w:pPr>
+      <w:r>
+        <w:rPr>
+          <w:b/>
+          <w:color w:val="1E40AF"/>
+          <w:sz w:val="21"/>
+        </w:rPr>
+        <w:t xml:space="preserve">Bước 5: Hoàn nguyên dữ liệu sạch 100% (Rollback All): </w:t>
+      </w:r>
+    </w:p>
+    <w:p>
+      <w:pPr>
+        <w:spacing w:before="0" w:after="120"/>
+        <w:ind w:left="576"/>
+      </w:pPr>
+      <w:r>
+        <w:rPr>
+          <w:color w:val="334155"/>
+          <w:sz w:val="20"/>
+        </w:rPr>
+        <w:t>Tại giao diện Red Team (Port 8081), bấm nút 'ROLLBACK ALL'. Toàn bộ các tệp tin bị tác động trên đĩa được khôi phục nguyên vẹn từ thư mục .adversary_backups/.</w:t>
+        <w:br/>
+        <w:t>Tại Blue Team bấm kiểm tra lại: Hệ thống trở về trạng thái xanh an toàn 100%.</w:t>
+      </w:r>
+    </w:p>
+    <w:p>
+      <w:pPr>
+        <w:spacing w:before="200"/>
+      </w:pPr>
+      <w:r>
+        <w:rPr>
+          <w:b/>
+          <w:color w:val="0F172A"/>
+          <w:sz w:val="24"/>
+        </w:rPr>
+        <w:t>Phương án 2: Diễn tập Dòng lệnh Terminal CLI (Dự phòng trường hợp không dùng UI)</w:t>
+      </w:r>
+    </w:p>
+    <w:p>
+      <w:pPr>
+        <w:ind w:left="288"/>
+      </w:pPr>
+      <w:r>
+        <w:rPr>
+          <w:color w:val="334155"/>
+          <w:sz w:val="20"/>
+        </w:rPr>
+        <w:t>1. Chạy Suite 7 Kiểm định Toán học Tự động:</w:t>
+        <w:br/>
+        <w:t xml:space="preserve">   Lệnh: python -m src.proposed_model.security_games</w:t>
+        <w:br/>
+        <w:t xml:space="preserve">   Kết quả: Thực hiện toàn bộ 7 phép đo bám sát bài báo (tính phi tuyến, hiệu ứng tuyết lở SAC ~50%, bẻ gãy CRC32 trên GF(2), phân tách miền RFC 6962, và kênh kề thời gian so sánh chuỗi). Toàn bộ 7 kiểm định hoàn thành đạt chuẩn trong ~2.885 ms.</w:t>
+        <w:br/>
+        <w:br/>
+        <w:t>2. Diễn tập 2 Terminal Red Team vs Blue Team:</w:t>
+        <w:br/>
+        <w:t xml:space="preserve">   • Terminal 1 (Red Team): Chạy 'python src/adversary/red_team_cli.py'. Bấm phím '1' để can thiệp tệp, hoặc phím '4' để bù mã CRC32.</w:t>
+        <w:br/>
+        <w:t xml:space="preserve">   • Terminal 2 (Blue Team): Chạy 'python -m src.baselines.sha256_manifest --dir kaggle_dataset --verify'. Blue Team phát hiện vi phạm ngay lập tức: MODIFIED_FILE: Resume/Resume.csv.</w:t>
+        <w:br/>
+        <w:t xml:space="preserve">   • Terminal 1: Bấm phím '9' để Rollback All khôi phục đĩa cứng an toàn.</w:t>
       </w:r>
     </w:p>
     <w:p>
@@ -987,123 +1269,204 @@
     <w:p>
       <w:pPr>
         <w:pStyle w:val="Heading1"/>
+        <w:spacing w:before="280" w:after="200"/>
       </w:pPr>
       <w:r>
         <w:rPr>
-          <w:color w:val="0F172A"/>
+          <w:b/>
+          <w:color w:val="1E40AF"/>
           <w:sz w:val="28"/>
         </w:rPr>
-        <w:t>PHẦN 3: BỘ CÂU HỎI &amp; TRẢ LỜI PHẢN BIỆN CHUYÊN SÂU (Q&amp;A DEFENSE GUIDE)</w:t>
+        <w:t>PHẦN 3: BỘ CÂU HỎI &amp; LUẬN ĐIỂM PHẢN BIỆN CHUYÊN SÂU (Q&amp;A DEFENSE)</w:t>
       </w:r>
     </w:p>
     <w:p>
       <w:pPr>
-        <w:spacing w:after="240"/>
+        <w:spacing w:before="160" w:after="40"/>
       </w:pPr>
       <w:r>
         <w:rPr>
           <w:b/>
-          <w:color w:val="2563EB"/>
+          <w:color w:val="0F172A"/>
           <w:sz w:val="22"/>
         </w:rPr>
-        <w:t>Câu hỏi 1: Tại sao bài báo của Halpin bàn về Triết học mật mã học, mà đề tài của em lại làm về Hệ thống kiểm tra toàn vẹn tệp?</w:t>
-        <w:br/>
-      </w:r>
-      <w:r>
-        <w:rPr>
-          <w:color w:val="1E293B"/>
-          <w:sz w:val="21"/>
-        </w:rPr>
-        <w:t>Trả lời: Thưa Thầy, bài báo của Harry Halpin (2025) là công trình triết học khảo sát tiến trình hình thức hóa kẻ đối đầu qua 70 năm lịch sử mật mã. Trong bài báo, Halpin phân tích sâu sắc các thuộc tính an toàn nền tảng (Confidentiality, Integrity, Authentication) và chỉ ra rằng tính toàn vẹn (Integrity) là điều kiện tiên quyết để duy trì an ninh thông tin. Đồng thời, tác giả đưa ra lời kêu gọi xây dựng một nền 'Khoa học an ninh thông tin thực nghiệm' (Empirical Science of Security) để vượt qua các hạn chế của mô hình toán học trừu tượng. Đề tài của em chọn bài toán kiểm tra toàn vẹn tệp tin vì đây là bài toán thực tế kinh điển nhất cho phép minh họa và kiểm chứng trọn vẹn các mô hình kẻ đối đầu mà Halpin đã phân tích: Từ kẻ nghe lén của Shannon, mô hình toàn vẹn Biba, mô hình mạng thù địch Dolev-Yao, đến các đòn tấn công kênh kề Kocher và đối thủ phá hoại thực tế.</w:t>
+        <w:t>Câu hỏi 1: Bài báo của Halpin là một bài khảo luận triết học, tại sao đề tài lại chọn bài toán Kiểm tra toàn vẹn tệp tin?</w:t>
       </w:r>
     </w:p>
     <w:p>
       <w:pPr>
-        <w:spacing w:after="240"/>
+        <w:spacing w:before="40" w:after="160"/>
+        <w:ind w:left="288"/>
+      </w:pPr>
+      <w:r>
+        <w:rPr>
+          <w:color w:val="334155"/>
+          <w:sz w:val="20"/>
+        </w:rPr>
+        <w:t>Luận điểm phản biện &amp; Căn cứ khoa học:</w:t>
+        <w:br/>
+        <w:t>1. Thuộc tính an ninh cốt lõi: Trong cấu trúc tam giác an ninh thông tin (Confidentiality, Integrity, Availability), Halpin phân tích sâu sắc rằng Tính toàn vẹn (Integrity) là điều kiện tiên quyết mang tính bản thể luận. Một thông điệp có thể không bí mật nhưng bắt buộc phải toàn vẹn thì tác nhân mới có thể hành động dựa trên thông tin đó.</w:t>
+        <w:br/>
+        <w:t>2. Lời kêu gọi về một 'Khoa học an ninh thực nghiệm': Halpin phê phán việc toán học hóa trừu tượng đã làm mật mã học xa rời thực tế vật lý. Tác giả kêu gọi xây dựng một nền an ninh thực nghiệm. Bài toán kiểm tra toàn vẹn tệp tin trên hệ thống đĩa cứng thực là bài toán kinh điển, cho phép đưa các khái niệm trừu tượng vào kiểm định vật lý.</w:t>
+        <w:br/>
+        <w:t>3. Mô hình hóa trọn vẹn các đối thủ trong bài báo: Hệ thống toàn vẹn tệp tin cho phép mô hình hóa và kiểm chứng đầy đủ các dạng đối thủ được Halpin mổ xẻ: Từ kẻ nghe lén của Shannon, kẻ can thiệp mạng Dolev-Yao, kẻ khai thác kênh kề Kocher, đến các đòn tấn công can thiệp dữ liệu và chèn backdoor chuỗi cung ứng.</w:t>
+      </w:r>
+    </w:p>
+    <w:p>
+      <w:pPr>
+        <w:spacing w:before="160" w:after="40"/>
       </w:pPr>
       <w:r>
         <w:rPr>
           <w:b/>
-          <w:color w:val="2563EB"/>
+          <w:color w:val="0F172A"/>
           <w:sz w:val="22"/>
         </w:rPr>
-        <w:t>Câu hỏi 2: Bài báo có 134 tài liệu tham khảo, khi tái lập bài báo này thì có cần phải xem và làm theo toàn bộ 134 tài liệu đó không?</w:t>
-        <w:br/>
-      </w:r>
-      <w:r>
-        <w:rPr>
-          <w:color w:val="1E293B"/>
-          <w:sz w:val="21"/>
-        </w:rPr>
-        <w:t>Trả lời: Thưa Thầy, hoàn toàn KHÔNG CẦN và KHÔNG THỂ làm theo toàn bộ 134 tài liệu tham khảo. Lý do là bài báo của Halpin là một bài khảo cứu triết học (philosophical survey), 134 trích dẫn là kho tàng tài liệu lịch sử trải dài từ năm 1883 đến nay, bao gồm cả sách triết học bản thể luận (Cantwell Smith, Dretske, Lewis), tài liệu rò rỉ của chính phủ Mỹ về NSA, và các hệ thống chứng minh định lý toán học phức tạp hàng nghìn dòng mã (như Isabelle chứng minh TLS của Paulson). Trong nghiên cứu khoa học máy tính, việc tái lập một bài báo khảo cứu lý thuyết là chắt lọc các tài liệu tham khảo mang tính nền tảng kỹ thuật trực tiếp để kiểm chứng. Đề tài DT005 của em đã chắt lọc và hiện thực hóa thành công 8 tài liệu tham khảo kỹ thuật kinh điển nhất: Ref [2, 3] của Shannon (Mã tuyến tính vs Hàm băm), Ref [21] của Biba (Toàn vẹn phân cấp), Ref [33, 34] của Goldwasser-Micali (Trò chơi an ninh PPT), Ref [36] của Paul Kocher (Kênh kề thời gian), Ref [40] của Bellare-Rogaway (Tiên tri ngẫu nhiên), Ref [52] của Dolev-Yao (Mạng thù địch), Ref [100, 101] về Snowden/NSA (Kẻ đối đầu thực tế), và Ref [109] của Ben Laurie (Certificate Transparency). Việc hiện thực hóa được các trụ cột này chứng minh sự hiểu biết sâu sắc toàn diện của em về bài báo.</w:t>
+        <w:t>Câu hỏi 2: Bài báo có 134 tài liệu tham khảo, khi thẩm định và tái lập thì có bắt buộc phải làm theo toàn bộ 134 tài liệu đó không?</w:t>
       </w:r>
     </w:p>
     <w:p>
       <w:pPr>
-        <w:spacing w:after="240"/>
+        <w:spacing w:before="40" w:after="160"/>
+        <w:ind w:left="288"/>
+      </w:pPr>
+      <w:r>
+        <w:rPr>
+          <w:color w:val="334155"/>
+          <w:sz w:val="20"/>
+        </w:rPr>
+        <w:t>Luận điểm phản biện &amp; Căn cứ khoa học:</w:t>
+        <w:br/>
+        <w:t>1. Bản chất bài khảo cứu: Bài báo của Halpin là một bài tổng quan triết học (philosophical survey) dài 17 trang, 134 trích dẫn là kho tàng tài liệu lịch sử trải dài từ năm 1883 đến 2024, bao gồm cả sách triết học siêu hình (Dretske, Cantwell Smith), tài liệu lưu trữ chính phủ về NSA, và các hệ thống chứng minh định lý tự động (như Isabelle chứng minh giao thức TLS của Paulson). Về mặt phương pháp luận nghiên cứu, không một công trình kỹ thuật nào có thể hay bắt buộc phải tái lập toàn bộ 134 tài liệu nền đó.</w:t>
+        <w:br/>
+        <w:t>2. Phương pháp tinh lọc trọng tâm: Thẩm định một bài báo lý thuyết là tinh lọc các trụ cột kỹ thuật trực tiếp liên quan đến bài toán an ninh. Đề tài DT005 đã tinh lọc và hiện thực hóa thành công 8 tài liệu kỹ thuật cốt lõi: Ref [2, 3] của Shannon (Mã tuyến tính vs Hàm băm), Ref [21] của Biba (Toàn vẹn phân cấp), Ref [33, 34] của Goldwasser-Micali (Trò chơi an ninh PPT), Ref [36] của Kocher (Kênh kề thời gian), Ref [40] của Bellare-Rogaway (Random Oracle), Ref [52] của Dolev-Yao (Mạng thù địch), Ref [100, 101] về Snowden/NSA (Đối thủ thể chế), và Ref [109] của Ben Laurie (RFC 6962 Certificate Transparency).</w:t>
+      </w:r>
+    </w:p>
+    <w:p>
+      <w:pPr>
+        <w:spacing w:before="160" w:after="40"/>
       </w:pPr>
       <w:r>
         <w:rPr>
           <w:b/>
-          <w:color w:val="2563EB"/>
+          <w:color w:val="0F172A"/>
           <w:sz w:val="22"/>
         </w:rPr>
-        <w:t>Câu hỏi 3: Bộ dữ liệu Kaggle Resume Dataset (2.483 tệp tin) từ đâu ra? Có xuất hiện trong bài báo gốc không?</w:t>
-        <w:br/>
-      </w:r>
-      <w:r>
-        <w:rPr>
-          <w:color w:val="1E293B"/>
-          <w:sz w:val="21"/>
-        </w:rPr>
-        <w:t>Trả lời: Thưa Thầy, em xin khẳng định trung thực 100%: Bài báo gốc của Halpin hoàn toàn KHÔNG CÓ bất kỳ bộ dữ liệu thực nghiệm nào. Bộ dữ liệu Kaggle Resume Dataset gồm 2.483 tệp PDF và CSV là do cá nhân em tự tải về và làm sạch để làm môi trường thực nghiệm. Em chọn bộ dữ liệu này vì nó có cấu trúc thư mục doanh nghiệp 24 ngành nghề thực tế, kích thước tệp biến thiên, phản ánh trung thực tải làm việc thực tế để kiểm tra hiệu năng các mô hình toàn vẹn, hoàn toàn không ngụy tạo số liệu của tác giả.</w:t>
+        <w:t>Câu hỏi 3: Tập dữ liệu kaggle_dataset (2.483 tệp tin, 112 MB) từ đâu ra? Có xuất hiện trong bài báo gốc không?</w:t>
       </w:r>
     </w:p>
     <w:p>
       <w:pPr>
-        <w:spacing w:after="240"/>
+        <w:spacing w:before="40" w:after="160"/>
+        <w:ind w:left="288"/>
+      </w:pPr>
+      <w:r>
+        <w:rPr>
+          <w:color w:val="334155"/>
+          <w:sz w:val="20"/>
+        </w:rPr>
+        <w:t>Luận điểm phản biện &amp; Căn cứ khoa học:</w:t>
+        <w:br/>
+        <w:t>1. Khẳng định minh bạch khoa học: Bài báo gốc của Harry Halpin hoàn toàn KHÔNG CÓ bất kỳ tập dữ liệu, bảng số liệu thực nghiệm hay mã nguồn nào. Bài báo là công trình khảo luận nhận thức luận trên tạp chí lý thuyết.</w:t>
+        <w:br/>
+        <w:t>2. Mục đích đưa tập dữ liệu vào nghiên cứu: Tập dữ liệu Kaggle Resume Dataset (gồm 2.483 tệp tin PDF và CSV thuộc 24 ngành nghề) do nhóm sinh viên tự chọn và tiền xử lý. Lý do chọn tập dữ liệu này là để cung cấp một môi trường cây thư mục doanh nghiệp nhiều tầng thực tế, kích thước tệp biến thiên, phản ánh trung thực tải làm việc thực tế nhằm đo đạc năng lực định vị sai lệch O(log N) và khả năng chịu tải đối kháng, hoàn toàn không phải ngụy tạo số liệu của tác giả.</w:t>
+      </w:r>
+    </w:p>
+    <w:p>
+      <w:pPr>
+        <w:spacing w:before="160" w:after="40"/>
       </w:pPr>
       <w:r>
         <w:rPr>
           <w:b/>
-          <w:color w:val="2563EB"/>
+          <w:color w:val="0F172A"/>
           <w:sz w:val="22"/>
         </w:rPr>
-        <w:t>Câu hỏi 4: Thuật toán Cây Merkle Phân cấp Động (HD-Merkle) của em có điểm gì vượt trội hơn Cây Merkle truyền thống để đạt điểm 9-10?</w:t>
-        <w:br/>
-      </w:r>
-      <w:r>
-        <w:rPr>
-          <w:color w:val="1E293B"/>
-          <w:sz w:val="21"/>
-        </w:rPr>
-        <w:t>Trả lời: Thưa Thầy, Cây Merkle nhị phân truyền thống lưu các nút lá trên một mảng phẳng. Khi hệ thống có 1 tệp tin mới được thêm vào hoặc xóa đi, cấu trúc mảng bị xáo trộn vị trí chẵn lẻ, buộc hệ thống phải dựng lại (Rebuild) toàn bộ cây với chi phí O(N) mất tới 283.9 ms trên tập dữ liệu Kaggle. Thuật toán HD-Merkle do em tự xây dựng ánh xạ trực tiếp cấu trúc cây thư mục doanh nghiệp; khi có tệp thay đổi, cơ chế Dirty-Path Cache chỉ tính lại duy nhất nhánh cha bị tác động từ lá lên gốc với chi phí logarit O(log N) chỉ mất 0.24 ms (thêm tệp) và 0.09 ms (xóa tệp), nhanh hơn từ 1.200 đến 2.600 lần! Đồng thời, em áp dụng phân tách miền byte 0x00 lá và 0x01 nhánh theo RFC 6962 triệt tiêu 100% nguy cơ va chạm tiền ảnh thứ hai, và nén bằng chứng xác minh CompactProof xuống 256 Bytes, tiết kiệm 99.9% băng thông. Đây chính là đóng góp kỹ thuật tự xây dựng cho kết quả vượt trội trên dataset theo đúng tiêu chí điểm 9-10 của Thầy.</w:t>
+        <w:t>Câu hỏi 4: Tại sao mã kiểm tra lỗi tuyến tính CRC32 bị bẻ gãy 100% trên trường nhị phân GF(2), trong khi SHA-256 lại phát hiện được gian lận?</w:t>
       </w:r>
     </w:p>
     <w:p>
       <w:pPr>
-        <w:spacing w:after="240"/>
+        <w:spacing w:before="40" w:after="160"/>
+        <w:ind w:left="288"/>
+      </w:pPr>
+      <w:r>
+        <w:rPr>
+          <w:color w:val="334155"/>
+          <w:sz w:val="20"/>
+        </w:rPr>
+        <w:t>Luận điểm phản biện &amp; Căn cứ khoa học:</w:t>
+        <w:br/>
+        <w:t>1. Tính chất tuyến tính của CRC32: CRC32 hoạt động dựa trên phép chia đa thức trên trường nhị phân hữu hạn GF(2). Do tính chất tuyến tính, giá trị CRC của một thông điệp sửa đổi CRC(M XOR Delta) có thể tính toán trực tiếp từ CRC(M) và CRC(Delta). Kẻ đối đầu có chủ đích chỉ cần giải một hệ phương trình đại số tuyến tính bằng thuật toán khử Gauss để tìm ra 4 byte bù (patch) nối vào cuối tệp tin, khiến cho CRC32 của tệp giả mạo trùng khớp 100% với tệp gốc ban đầu.</w:t>
+        <w:br/>
+        <w:t>2. Tính phi tuyến của SHA-256: SHA-256 là hàm băm mật mã học xây dựng trên cấu trúc lặp Merkle-Damgard và phép nén Davies-Meyer với các hàm phi tuyến (Ch, Maj, Sigma). Hàm băm đạt hiệu ứng tuyết lở (Strict Avalanche Criterion - SAC ~50%): Chỉ cần thay đổi 1 bit đầu vào thì trung bình 50% số bit đầu ra bị đảo ngẫu nhiên. Bài toán tìm tiền ảnh thứ hai trên SHA-256 có độ phức tạp 2^256, vượt quá hoàn toàn năng lực tính toán của đối thủ đa thức xác suất (PPT Adversary).</w:t>
+      </w:r>
+    </w:p>
+    <w:p>
+      <w:pPr>
+        <w:spacing w:before="160" w:after="40"/>
       </w:pPr>
       <w:r>
         <w:rPr>
           <w:b/>
-          <w:color w:val="2563EB"/>
+          <w:color w:val="0F172A"/>
           <w:sz w:val="22"/>
         </w:rPr>
-        <w:t>Câu hỏi 5: Tại sao mã CRC32 lại bị kẻ tấn công bẻ gãy 100%, trong khi SHA-256 lại phát hiện được gian lận?</w:t>
-        <w:br/>
+        <w:t>Câu hỏi 5: Tấn công Kênh kề thời gian (Timing Side-Channel) trong so sánh chuỗi hoạt động như thế nào và cách giải quyết?</w:t>
       </w:r>
+    </w:p>
+    <w:p>
+      <w:pPr>
+        <w:spacing w:before="40" w:after="160"/>
+        <w:ind w:left="288"/>
+      </w:pPr>
       <w:r>
         <w:rPr>
-          <w:color w:val="1E293B"/>
-          <w:sz w:val="21"/>
+          <w:color w:val="334155"/>
+          <w:sz w:val="20"/>
         </w:rPr>
-        <w:t>Trả lời: Thưa Thầy, điều này bắt nguồn từ tính chất toán học mà Halpin đã phân tích ở Section 1 và 2: CRC32 là một hàm tuyến tính trên trường nhị phân GF(2). Do có tính chất tuyến tính, khi kẻ tấn công sửa đổi nội dung thông điệp, kẻ đó chỉ cần giải một hệ phương trình đại số tuyến tính bằng thuật toán khử Gauss để tìm ra 4 byte bù (patch) nối vào cuối tệp, làm cho mã CRC32 của tệp giả mạo trùng khớp 100% với tệp gốc. Em đã lập trình thực tế hàm `crc32_forge_patch` trong file `security_games.py` giải hệ này chỉ trong chưa đầy 1 mili-giây. Ngược lại, SHA-256 là hàm băm mật mã học phi tuyến tính với cấu trúc Merkle-Damgard và phép nén Davies-Meyer, đạt hiệu ứng tuyết lở SAC xấp xỉ 50%, khiến bài toán tìm tiền ảnh thứ hai có độ phức tạp tính toán 2^256, bất khả thi đối với kẻ đối đầu đa thức xác suất (PPT Adversary).</w:t>
+        <w:t>Luận điểm phản biện &amp; Căn cứ khoa học:</w:t>
+        <w:br/>
+        <w:t>1. Cơ chế rò rỉ: Hàm so sánh chuỗi thông thường (như toán tử == trong nhiều ngôn ngữ) thực hiện so sánh tuần tự từng ký tự từ trái sang phải và dừng ngay lập tức (early-return) khi phát hiện ký tự sai khác đầu tiên. Kẻ tấn công gửi các chuỗi thử nghiệm và đo thời gian phản hồi: Thời gian thực thi càng dài đồng nghĩa số lượng ký tự tiền tố đoán đúng càng nhiều. Từ đó, đối thủ khôi phục được mã băm hoặc khóa bí mật mà không cần giải mã.</w:t>
+        <w:br/>
+        <w:t>2. Giải pháp kỹ thuật: Chuyển sang sử dụng hàm so sánh thời gian hằng số (Constant-time comparison) `hmac.compare_digest`. Hàm này luôn duyệt qua toàn bộ độ dài của chuỗi bằng phép toán bitwise XOR tích lũy, đảm bảo thời gian thực thi độc lập hoàn toàn với vị trí xuất hiện ký tự sai khác, triệt tiêu kênh rò rỉ thời gian ở mức phần mềm.</w:t>
+      </w:r>
+    </w:p>
+    <w:p>
+      <w:pPr>
+        <w:spacing w:before="160" w:after="40"/>
+      </w:pPr>
+      <w:r>
+        <w:rPr>
+          <w:b/>
+          <w:color w:val="0F172A"/>
+          <w:sz w:val="22"/>
+        </w:rPr>
+        <w:t>Câu hỏi 6: Giải pháp Cây Merkle phân cấp động (HD-MerkleTree) của đề tài có ưu thế kỹ thuật gì so với Cây Merkle truyền thống?</w:t>
+      </w:r>
+    </w:p>
+    <w:p>
+      <w:pPr>
+        <w:spacing w:before="40" w:after="160"/>
+        <w:ind w:left="288"/>
+      </w:pPr>
+      <w:r>
+        <w:rPr>
+          <w:color w:val="334155"/>
+          <w:sz w:val="20"/>
+        </w:rPr>
+        <w:t>Luận điểm phản biện &amp; Căn cứ khoa học:</w:t>
+        <w:br/>
+        <w:t>1. Cắt giảm độ phức tạp cập nhật từ O(N) xuống O(log N): Cây Merkle nhị phân truyền thống làm phẳng toàn bộ danh mục tệp lên một mảng nút lá. Khi có 1 tệp tin được thêm mới hoặc xóa đi, cấu trúc chẵn lẻ của mảng bị phá vỡ, buộc hệ thống phải Rebuild lại toàn bộ cây với chi phí O(N) mất ~283 ms trên 2.483 tệp. HD-Merkle ánh xạ trực tiếp cấu trúc cây thư mục doanh nghiệp; cơ chế Dirty-Path Cache chỉ tính toán lại duy nhất nhánh cha bị tác động từ nút lá lên nút gốc với chi phí logarit O(log N) chỉ mất ~0.24 ms (nhanh hơn ~1.200 lần).</w:t>
+        <w:br/>
+        <w:t>2. Chuẩn phân tách miền RFC 6962: HD-Merkle áp dụng tiền tố 0x00 cho nút lá và 0x01 cho nút nhánh nội bộ, triệt tiêu 100% lỗ hổng va chạm tiền ảnh thứ hai cấp cấu trúc (Node-Leaf confusion).</w:t>
+        <w:br/>
+        <w:t>3. Tối ưu hóa băng thông bằng chứng: Gói bằng chứng CompactProof được nén xuống 256 Bytes, tiết kiệm hơn 99% băng thông so với việc truyền tải toàn bộ danh mục băm phẳng (253 KB).</w:t>
       </w:r>
     </w:p>
     <w:sectPr>
       <w:pgSz w:w="12240" w:h="15840"/>
-      <w:pgMar w:top="1152" w:right="1296" w:bottom="1152" w:left="1296" w:header="720" w:footer="720" w:gutter="0"/>
+      <w:pgMar w:top="1440" w:right="1440" w:bottom="1440" w:left="1440" w:header="720" w:footer="720" w:gutter="0"/>
       <w:cols w:space="720"/>
       <w:docGrid w:linePitch="360"/>
     </w:sectPr>
@@ -1474,6 +1837,11 @@
     <w:name w:val="Normal"/>
     <w:qFormat/>
     <w:rsid w:val="00FC693F"/>
+    <w:rPr>
+      <w:rFonts w:ascii="Calibri" w:hAnsi="Calibri"/>
+      <w:color w:val="1E293B"/>
+      <w:sz w:val="22"/>
+    </w:rPr>
   </w:style>
   <w:style w:type="paragraph" w:styleId="Header">
     <w:name w:val="header"/>

</xml_diff>

<commit_message>
docs: cap nhat bao cao giua ky slide va kich ban thuyet minh DT005
</commit_message>
<xml_diff>
--- a/docs/Kich_Ban_Thuyet_Trinh_Va_Demo_DT005.docx
+++ b/docs/Kich_Ban_Thuyet_Trinh_Va_Demo_DT005.docx
@@ -199,6 +199,28 @@
     </w:p>
     <w:p>
       <w:pPr>
+        <w:spacing w:before="0" w:after="60"/>
+        <w:ind w:left="648"/>
+      </w:pPr>
+      <w:r>
+        <w:rPr>
+          <w:b/>
+          <w:color w:val="1E40AF"/>
+          <w:sz w:val="19"/>
+        </w:rPr>
+        <w:t xml:space="preserve">↳ Mở rộng: </w:t>
+      </w:r>
+      <w:r>
+        <w:rPr>
+          <w:i/>
+          <w:color w:val="475569"/>
+          <w:sz w:val="19"/>
+        </w:rPr>
+        <w:t>Lời thoại mở đầu: 'Kính chào Thầy và các bạn. Hôm nay em xin trình bày đồ án giữa kỳ DT005. Đồ án của em xuất phát từ việc khảo cứu bài báo khoa học của TS. Harry Halpin xuất bản năm 2025 trên tạp chí Journal of Cybersecurity, từ đó nhóm xây dựng một hệ thống thực nghiệm kiểm tra toàn vẹn dữ liệu để đối chứng các luận điểm của tác giả.'</w:t>
+      </w:r>
+    </w:p>
+    <w:p>
+      <w:pPr>
         <w:spacing w:before="60" w:after="200"/>
         <w:ind w:left="288"/>
       </w:pPr>
@@ -245,7 +267,7 @@
         </w:rPr>
         <w:t>• Vị trí Slide: SECTION 1 — GIỚI THIỆU &amp; MỤC TIÊU BÀI BÁO (TRANG 1–2)</w:t>
         <w:br/>
-        <w:t xml:space="preserve">  Tiêu đề phụ: Khảo cứu nhận thức luận về Kẻ thù trong Mật mã học và Chương trình nghiên cứu tương lai</w:t>
+        <w:t xml:space="preserve">  Tiêu đề phụ: Góc nhìn triết học về Kẻ tấn công trong Mật mã học và Chương trình nghiên cứu tương lai</w:t>
       </w:r>
     </w:p>
     <w:p>
@@ -280,7 +302,7 @@
           <w:color w:val="334155"/>
           <w:sz w:val="20"/>
         </w:rPr>
-        <w:t>Khoa học về truyền thông bí mật khi có sự hiện diện của đối thủ có chủ đích trên môi trường mạng mở.</w:t>
+        <w:t>Mật mã học là ngành khoa học bảo vệ dữ liệu bí mật khi truyền qua môi trường mạng mở có kẻ tấn công chủ đích rình rập.</w:t>
       </w:r>
     </w:p>
     <w:p>
@@ -294,14 +316,14 @@
           <w:color w:val="0F172A"/>
           <w:sz w:val="20"/>
         </w:rPr>
-        <w:t xml:space="preserve">– 2. Nghịch lý nhận thức luận: </w:t>
+        <w:t xml:space="preserve">– 2. Nghịch lý nghiên cứu: </w:t>
       </w:r>
       <w:r>
         <w:rPr>
           <w:color w:val="334155"/>
           <w:sz w:val="20"/>
         </w:rPr>
-        <w:t>Lý thuyết thông tin của Shannon (1948) được triết học nghiên cứu nhiều, nhưng mật mã học lại bị bỏ quên suốt nhiều thập kỷ.</w:t>
+        <w:t>Lý thuyết thông tin của Shannon (1948) được nghiên cứu triết học rất kỹ, nhưng mật mã học lại bị lãng quên suốt nhiều thập kỷ.</w:t>
       </w:r>
     </w:p>
     <w:p>
@@ -323,7 +345,7 @@
           <w:color w:val="475569"/>
           <w:sz w:val="19"/>
         </w:rPr>
-        <w:t>Halpin chỉ ra triết học nghiên cứu sâu lý thuyết thông tin nhưng bỏ quên mật mã học — nơi thực sự định hình an toàn trước đối thủ.</w:t>
+        <w:t>Lời giải thích dễ nhớ: Halpin chỉ ra rằng lý thuyết thông tin chỉ xử lý nhiễu ngẫu nhiên của đường truyền; còn mật mã học mới là nơi trực tiếp đối đầu với kẻ thù có mưu mô và chủ đích phá hoại.</w:t>
       </w:r>
     </w:p>
     <w:p>
@@ -337,14 +359,14 @@
           <w:color w:val="0F172A"/>
           <w:sz w:val="20"/>
         </w:rPr>
-        <w:t xml:space="preserve">– 3. Cái giá của sự trừu tượng hóa: </w:t>
+        <w:t xml:space="preserve">– 3. Hạn chế khi chỉ nhìn trên lý thuyết: </w:t>
       </w:r>
       <w:r>
         <w:rPr>
           <w:color w:val="334155"/>
           <w:sz w:val="20"/>
         </w:rPr>
-        <w:t>Xem mật mã học chỉ là toán học trên giấy sẽ tạo ra điểm mù trước các đòn tấn công vật lý trong thế giới thực.</w:t>
+        <w:t>Nếu chỉ xem mật mã là các phép toán thuần túy trên giấy, chúng ta sẽ có điểm mù trước các đòn tấn công vật lý ngoài đời thực.</w:t>
       </w:r>
     </w:p>
     <w:p>
@@ -366,7 +388,7 @@
           <w:color w:val="475569"/>
           <w:sz w:val="19"/>
         </w:rPr>
-        <w:t>Kẻ tấn công trong thực tế không giải toán mà nhắm vào thời gian xử lý CPU, bộ nhớ đệm Cache và môi trường vật lý.</w:t>
+        <w:t>Ví dụ gần gũi: Một cánh cửa có ổ khóa toán học cực kỳ vững chắc, nhưng kẻ trộm không bẻ khóa mà dùng xà beng cạy bản lề hoặc đo độ trễ khi chìa xoay. Trong máy tính, kẻ tấn công đo thời gian CPU xử lý và bộ nhớ đệm (Cache) để mò ra khóa.</w:t>
       </w:r>
     </w:p>
     <w:p>
@@ -387,7 +409,7 @@
           <w:color w:val="334155"/>
           <w:sz w:val="20"/>
         </w:rPr>
-        <w:t>Hệ thống hóa lịch sử các mô hình đối thủ; Phê phán giới hạn toán học hóa; Đề xuất 4 câu hỏi nghiên cứu mở kết hợp liên ngành.</w:t>
+        <w:t>Tác giả hệ thống hóa lịch sử các mô hình kẻ tấn công; Phê phán giới hạn của việc toán học hóa quá mức; và Đề xuất 4 câu hỏi nghiên cứu liên ngành cho tương lai.</w:t>
       </w:r>
     </w:p>
     <w:p>
@@ -438,7 +460,7 @@
         </w:rPr>
         <w:t>• Vị trí Slide: SECTION 2 &amp; 3 — CƠ SỞ TRIẾT HỌC VỀ THÔNG TIN (TRANG 2–5)</w:t>
         <w:br/>
-        <w:t xml:space="preserve">  Tiêu đề phụ: Khung nhận thức luận của Fred Dretske và Brian Cantwell Smith ứng dụng trong Mật mã học</w:t>
+        <w:t xml:space="preserve">  Tiêu đề phụ: Khung lý thuyết của Fred Dretske và Brian Cantwell Smith ứng dụng trong Mật mã học</w:t>
       </w:r>
     </w:p>
     <w:p>
@@ -473,7 +495,7 @@
           <w:color w:val="334155"/>
           <w:sz w:val="20"/>
         </w:rPr>
-        <w:t>Thế giới khởi đầu từ dòng dữ liệu chưa có ranh giới; con người định hình thực tại bằng cách 'đăng ký đối tượng' (registration of objects) giữa các tác nhân ở xa nhau.</w:t>
+        <w:t>Dữ liệu ban đầu vốn là dòng chảy vô định; con người tạo ra sự an toàn bằng cách phân định rõ ranh giới các đối tượng ('đăng ký đối tượng' — registration of objects).</w:t>
       </w:r>
     </w:p>
     <w:p>
@@ -495,7 +517,7 @@
           <w:color w:val="475569"/>
           <w:sz w:val="19"/>
         </w:rPr>
-        <w:t>Để bảo vệ dữ liệu, hệ thống phân định rõ ranh giới các đối tượng: Bản rõ (M), Bản mã (C) và Khóa bí mật (K).</w:t>
+        <w:t>Lời giải thích dễ nhớ: Trong hệ thống mật mã, ta phải tách bạch rạch ròi 3 thực thể: Bản rõ cần bảo vệ (M), Bản mã gửi đi (C) và Chìa khóa bí mật (K).</w:t>
       </w:r>
     </w:p>
     <w:p>
@@ -516,7 +538,7 @@
           <w:color w:val="334155"/>
           <w:sz w:val="20"/>
         </w:rPr>
-        <w:t>Thông tin tồn tại khách quan theo quy luật tự nhiên; bản rõ mang thông tin về nguồn, hệ mật đảm bảo bản mã không để lộ thông tin về nguồn.</w:t>
+        <w:t>Thông tin tồn tại khách quan theo quy luật tự nhiên, độc lập với người nhận; bản rõ mang thông tin gốc, còn hệ mật phải bảo đảm bản mã không để lộ bất kỳ thông tin nào về nguồn.</w:t>
       </w:r>
     </w:p>
     <w:p>
@@ -538,7 +560,7 @@
           <w:color w:val="475569"/>
           <w:sz w:val="19"/>
         </w:rPr>
-        <w:t>Thông tin tồn tại khách quan độc lập với người nhận; hệ mật tốt triệt tiêu dấu vết để bản mã trông như chuỗi ngẫu nhiên.</w:t>
+        <w:t>Ví dụ gần gũi: Giống như việc xóa sạch dấu vết hiện trường để kẻ lạ nhìn vào bản mã chỉ thấy một chuỗi ngẫu nhiên hỗn loạn, không thể đoán được nội dung gốc là gì.</w:t>
       </w:r>
     </w:p>
     <w:p>
@@ -552,14 +574,14 @@
           <w:color w:val="0F172A"/>
           <w:sz w:val="20"/>
         </w:rPr>
-        <w:t xml:space="preserve">– 3. Bản chất của đối thủ: </w:t>
+        <w:t xml:space="preserve">– 3. Bản chất của kẻ tấn công: </w:t>
       </w:r>
       <w:r>
         <w:rPr>
           <w:color w:val="334155"/>
           <w:sz w:val="20"/>
         </w:rPr>
-        <w:t>Đối thủ là tác nhân có chủ đích (intentional agent), có mục tiêu rõ ràng, khác biệt hoàn toàn với nhiễu ngẫu nhiên vật lý.</w:t>
+        <w:t>Đối thủ là tác nhân có chủ đích (intentional agent), có mục tiêu phá hoại rõ ràng, hoàn toàn khác với sự cố chập chờn hay nhiễu đường truyền vật lý.</w:t>
       </w:r>
     </w:p>
     <w:p>
@@ -580,7 +602,7 @@
           <w:color w:val="334155"/>
           <w:sz w:val="20"/>
         </w:rPr>
-        <w:t>Common Knowledge là tri thức chung mọi người cùng biết; Public Knowledge là công khai; Bí mật là 'tri thức không phổ biến'.</w:t>
+        <w:t>Phân biệt giữa Tri thức chung (Common Knowledge — tri thức ai cũng biết và biết người khác cùng biết), Tri thức công khai (Public Knowledge) và Bí mật (thông tin nội bộ chỉ số ít người nắm giữ).</w:t>
       </w:r>
     </w:p>
     <w:p>
@@ -602,7 +624,7 @@
           <w:color w:val="475569"/>
           <w:sz w:val="19"/>
         </w:rPr>
-        <w:t>Common Knowledge là tri thức ai cũng biết và biết người khác cùng biết; Bí mật là tri thức nội bộ được giới hạn quyền truy cập.</w:t>
+        <w:t>Lời giải thích dễ nhớ: Mật mã học sinh ra để biến thông điệp thành bí mật: chỉ người nào có chìa khóa hợp lệ mới giải mã được thông tin.</w:t>
       </w:r>
     </w:p>
     <w:p>
@@ -653,7 +675,7 @@
         </w:rPr>
         <w:t>• Vị trí Slide: SƠ ĐỒ 1: DÒNG THỜI GIAN TIẾN HÓA MÔ HÌNH ĐỐI THỦ</w:t>
         <w:br/>
-        <w:t xml:space="preserve">  Tiêu đề phụ: Sự dịch chuyển từ Lý thuyết thông tin sang Giả định độ phức tạp tính toán và Phê phán hậu Snowden</w:t>
+        <w:t xml:space="preserve">  Tiêu đề phụ: Từ mô hình thông tin của Shannon đến độ phức tạp tính toán và bài học thực tế sau vụ Snowden</w:t>
       </w:r>
     </w:p>
     <w:p>
@@ -710,7 +732,7 @@
           <w:color w:val="475569"/>
           <w:sz w:val="19"/>
         </w:rPr>
-        <w:t>Shannon chứng minh One-Time Pad an toàn tuyệt đối nhưng bất khả thi vì khóa phải dài bằng bản rõ và không thể tái sử dụng.</w:t>
+        <w:t>Lời giải thích dễ nhớ: Shannon chứng minh mã hóa dùng khóa một lần (One-Time Pad) đạt độ an toàn lý thuyết tuyệt đối, nhưng không khả thi vì khóa phải dài bằng văn bản và không bao giờ được dùng lại.</w:t>
       </w:r>
     </w:p>
     <w:p>
@@ -731,7 +753,7 @@
           <w:color w:val="334155"/>
           <w:sz w:val="20"/>
         </w:rPr>
-        <w:t>Diffie-Hellman và Merkle giải bài toán phân phối khóa bằng các bài toán độ phức tạp tính toán một chiều.</w:t>
+        <w:t>Diffie-Hellman và Merkle giải bài toán phân phối khóa bằng các bài toán toán học một chiều khó đảo ngược (như tính lũy thừa thì nhanh nhưng tìm logarit rời rạc thì cực khó).</w:t>
       </w:r>
     </w:p>
     <w:p>
@@ -745,14 +767,14 @@
           <w:color w:val="0F172A"/>
           <w:sz w:val="20"/>
         </w:rPr>
-        <w:t xml:space="preserve">– 3. Giai đoạn 3 (1982–1984) — PPT Adversary &amp; Security Games: </w:t>
+        <w:t xml:space="preserve">– 3. Giai đoạn 3 (1982–1984) — Kẻ thù PPT &amp; Trò chơi an ninh: </w:t>
       </w:r>
       <w:r>
         <w:rPr>
           <w:color w:val="334155"/>
           <w:sz w:val="20"/>
         </w:rPr>
-        <w:t>Goldwasser-Micali mô hình hóa đối thủ thời gian đa thức xác suất (PPT) và kiểm chứng an toàn qua trò chơi an ninh.</w:t>
+        <w:t>Goldwasser-Micali mô hình hóa đối thủ có năng lực tính toán đa thức xác suất (PPT — Probabilistic Polynomial-Time, tức đối thủ có máy tính mạnh nhưng tài nguyên và thời gian hữu hạn). Độ an toàn được kiểm chứng qua các kịch bản thử thách (Security Games).</w:t>
       </w:r>
     </w:p>
     <w:p>
@@ -774,7 +796,7 @@
           <w:color w:val="475569"/>
           <w:sz w:val="19"/>
         </w:rPr>
-        <w:t>Chuyển từ an toàn tuyệt đối sang an toàn tính toán: đối thủ có tài nguyên giới hạn đa thức không thể giải bài toán trong thời gian thực tế.</w:t>
+        <w:t>Lời giải thích dễ nhớ: Chuyển từ an toàn tuyệt đối trên lý thuyết sang an toàn thực tế: kẻ tấn công dù có siêu máy tính cũng không thể giải nổi bài toán trong thời gian cho phép.</w:t>
       </w:r>
     </w:p>
     <w:p>
@@ -788,14 +810,14 @@
           <w:color w:val="0F172A"/>
           <w:sz w:val="20"/>
         </w:rPr>
-        <w:t xml:space="preserve">– 4. Giai đoạn 4 (1981–1993) — Dolev-Yao &amp; Random Oracle: </w:t>
+        <w:t xml:space="preserve">– 4. Giai đoạn 4 (1981–1993) — Dolev-Yao &amp; Hộp đen ngẫu nhiên (ROM): </w:t>
       </w:r>
       <w:r>
         <w:rPr>
           <w:color w:val="334155"/>
           <w:sz w:val="20"/>
         </w:rPr>
-        <w:t>Dolev-Yao mô hình hóa đối thủ kiểm soát kênh mạng; Bellare-Rogaway đề xuất Random Oracle Model (ROM) cho hàm băm.</w:t>
+        <w:t>Dolev-Yao mô hình hóa kẻ tấn công kiểm soát toàn bộ kênh truyền mạng; Bellare-Rogaway đề xuất mô hình Random Oracle coi hàm băm như một cỗ máy ngẫu nhiên lý tưởng.</w:t>
       </w:r>
     </w:p>
     <w:p>
@@ -809,14 +831,14 @@
           <w:color w:val="0F172A"/>
           <w:sz w:val="20"/>
         </w:rPr>
-        <w:t xml:space="preserve">– 5. Giai đoạn 5 (2013–2025) — Phê phán hậu Snowden: </w:t>
+        <w:t xml:space="preserve">– 5. Giai đoạn 5 (2013–2025) — Bài học thực tế từ Snowden: </w:t>
       </w:r>
       <w:r>
         <w:rPr>
           <w:color w:val="334155"/>
           <w:sz w:val="20"/>
         </w:rPr>
-        <w:t>Snowden phơi bày năng lực thực tế của đối thủ thể chế: Kênh kề, cửa sau tiêu chuẩn, can thiệp chuỗi cung ứng và giám sát siêu dữ liệu.</w:t>
+        <w:t>Vụ lộ lọt của Snowden phơi bày sức mạnh thực tế của các cơ quan tình báo: Tấn công kênh kề vật lý, cài cửa sau vào tiêu chuẩn quốc tế và thu thập siêu dữ liệu người dùng.</w:t>
       </w:r>
     </w:p>
     <w:p>
@@ -867,7 +889,7 @@
         </w:rPr>
         <w:t>• Vị trí Slide: SƠ ĐỒ 2: ĐỐI SÁNH MÔ HÌNH TRUYỀN THÔNG ĐIỂM-ĐIỂM VÀ MẠNG XÃ HỘI-KỸ THUẬT</w:t>
         <w:br/>
-        <w:t xml:space="preserve">  Tiêu đề phụ: Khoảng cách giữa mô hình điểm-điểm đóng kín của Shannon và mạng phức hợp không đồng nhất</w:t>
+        <w:t xml:space="preserve">  Tiêu đề phụ: Khoảng cách giữa mô hình điểm-điểm khép kín của Shannon và môi trường mạng Internet thực tế</w:t>
       </w:r>
     </w:p>
     <w:p>
@@ -895,14 +917,14 @@
           <w:color w:val="0F172A"/>
           <w:sz w:val="20"/>
         </w:rPr>
-        <w:t xml:space="preserve">– Panel Trái — Mô hình điểm-điểm Shannon (1949): </w:t>
+        <w:t xml:space="preserve">– Panel Trái — Mô hình lý thuyết của Shannon (1949): </w:t>
       </w:r>
       <w:r>
         <w:rPr>
           <w:color w:val="334155"/>
           <w:sz w:val="20"/>
         </w:rPr>
-        <w:t>Alice gửi bản rõ M mã hóa bằng khóa K qua kênh truyền đến Bob; đối thủ Eve nghe lén thụ động. Bỏ qua chi phí quản lý khóa và bề mặt tấn công vật lý.</w:t>
+        <w:t>Alice gửi bản rõ M đã mã hóa bằng khóa K đến Bob; kẻ nghe lén Eve chỉ thụ động đón bắt đường truyền. Mô hình này bỏ qua chi phí quản lý khóa và bề mặt tấn công vật lý.</w:t>
       </w:r>
     </w:p>
     <w:p>
@@ -916,14 +938,14 @@
           <w:color w:val="0F172A"/>
           <w:sz w:val="20"/>
         </w:rPr>
-        <w:t xml:space="preserve">– Panel Phải — Mạng xã hội - kỹ thuật (Halpin 2025): </w:t>
+        <w:t xml:space="preserve">– Panel Phải — Mạng Internet thực tế ngày nay (Halpin 2025): </w:t>
       </w:r>
       <w:r>
         <w:rPr>
           <w:color w:val="334155"/>
           <w:sz w:val="20"/>
         </w:rPr>
-        <w:t>Thông tin luân chuyển qua hạ tầng mở, ISP, đám mây. Đối thủ thể chế (NSA) tấn công qua 4 hướng: Kênh kề, giám sát siêu dữ liệu, cửa sau phần cứng và phản bội nội bộ.</w:t>
+        <w:t>Dữ liệu luân chuyển qua nhà mạng, máy chủ đám mây. Đối thủ quy mô quốc gia (như NSA) tấn công vào 4 hướng: Kênh kề vật lý, phân tích siêu dữ liệu, cài cửa sau phần cứng và nội gián.</w:t>
       </w:r>
     </w:p>
     <w:p>
@@ -945,7 +967,7 @@
           <w:color w:val="475569"/>
           <w:sz w:val="19"/>
         </w:rPr>
-        <w:t>Siêu dữ liệu (thời gian, địa chỉ IP, dung lượng) cho phép đối thủ theo dõi hành vi và mối quan hệ mà không cần bẻ khóa nội dung.</w:t>
+        <w:t>Ví dụ gần gũi về siêu dữ liệu: Kẻ tấn công không cần bẻ khóa đọc thư, mà chỉ cần nhìn vào người gửi, người nhận, thời gian và kích thước gói tin là đã biết rõ bạn đang liên lạc với ai và làm gì.</w:t>
       </w:r>
     </w:p>
     <w:p>
@@ -996,7 +1018,7 @@
         </w:rPr>
         <w:t>• Vị trí Slide: SECTION 4 — HÌNH THỨC HÓA ĐỐI THỦ (TRANG 5–8)</w:t>
         <w:br/>
-        <w:t xml:space="preserve">  Tiêu đề phụ: Tiến trình toán học hóa kẻ thù: Độ phức tạp tính toán đa thức, Logic kênh truyền và Tiên tri ngẫu nhiên</w:t>
+        <w:t xml:space="preserve">  Tiêu đề phụ: Ba cách toán học hóa kẻ thù: Độ phức tạp tính toán đa thức, Logic kênh truyền và Tiên tri ngẫu nhiên</w:t>
       </w:r>
     </w:p>
     <w:p>
@@ -1024,14 +1046,14 @@
           <w:color w:val="0F172A"/>
           <w:sz w:val="20"/>
         </w:rPr>
-        <w:t xml:space="preserve">– 1. PPT Adversary (Goldwasser-Micali 1984): </w:t>
+        <w:t xml:space="preserve">– 1. Kẻ tấn công bị giới hạn tính toán (PPT — Goldwasser-Micali 1984): </w:t>
       </w:r>
       <w:r>
         <w:rPr>
           <w:color w:val="334155"/>
           <w:sz w:val="20"/>
         </w:rPr>
-        <w:t>Đối thủ là thuật toán Turing xác suất chạy thời gian đa thức; an toàn định nghĩa qua trò chơi thách đấu; chứng minh bằng quy dẫn về bài toán khó.</w:t>
+        <w:t>Mô hình hóa đối thủ như một thuật toán chạy trong thời gian đa thức xác suất (PPT). Độ an toàn được đo bằng xác suất kẻ địch thắng trong trò chơi thách đấu.</w:t>
       </w:r>
     </w:p>
     <w:p>
@@ -1045,14 +1067,14 @@
           <w:color w:val="0F172A"/>
           <w:sz w:val="20"/>
         </w:rPr>
-        <w:t xml:space="preserve">– 2. Đối thủ mạng logic (Dolev-Yao 1983): </w:t>
+        <w:t xml:space="preserve">– 2. Kẻ tấn công mạng logic (Dolev-Yao 1983): </w:t>
       </w:r>
       <w:r>
         <w:rPr>
           <w:color w:val="334155"/>
           <w:sz w:val="20"/>
         </w:rPr>
-        <w:t>Đối thủ kiểm soát toàn bộ kênh truyền (chặn, sửa, xóa, phát lại gói tin), nhưng xem mật mã là hộp đen an toàn tuyệt đối nếu không có khóa.</w:t>
+        <w:t>Giả định đối thủ kiểm soát toàn bộ đường truyền (bắt, sửa, xóa, gửi lại gói tin), nhưng lại xem mật mã là chiếc hộp đen an toàn tuyệt đối nếu không có khóa.</w:t>
       </w:r>
     </w:p>
     <w:p>
@@ -1074,7 +1096,7 @@
           <w:color w:val="475569"/>
           <w:sz w:val="19"/>
         </w:rPr>
-        <w:t>Điểm mù của Dolev-Yao là giả định mật mã là hộp đen hoàn hảo, bỏ qua các lỗ hổng rò rỉ vật lý khi thực thi thuật toán.</w:t>
+        <w:t>Điểm mù của Dolev-Yao: Mô hình này ngây thơ coi mật mã là hộp đen hoàn hảo trên giấy, bỏ qua các lỗ hổng rò rỉ vật lý khi phần mềm chạy trên máy tính thật.</w:t>
       </w:r>
     </w:p>
     <w:p>
@@ -1088,14 +1110,14 @@
           <w:color w:val="0F172A"/>
           <w:sz w:val="20"/>
         </w:rPr>
-        <w:t xml:space="preserve">– 3. Tiên tri ngẫu nhiên (Bellare-Rogaway 1993): </w:t>
+        <w:t xml:space="preserve">– 3. Tiên tri ngẫu nhiên (Random Oracle — Bellare-Rogaway 1993): </w:t>
       </w:r>
       <w:r>
         <w:rPr>
           <w:color w:val="334155"/>
           <w:sz w:val="20"/>
         </w:rPr>
-        <w:t>Giả định hàm băm hoạt động như hàm ngẫu nhiên lý tưởng (Random Oracle); thực tế không hàm băm nào đạt được tính ngẫu nhiên toán học này.</w:t>
+        <w:t>Giả định hàm băm hoạt động như một cỗ máy ngẫu nhiên lý tưởng; nhưng thực tế không hàm băm máy tính nào đạt được sự ngẫu nhiên toán học tuyệt đối này.</w:t>
       </w:r>
     </w:p>
     <w:p>
@@ -1117,7 +1139,7 @@
           <w:color w:val="475569"/>
           <w:sz w:val="19"/>
         </w:rPr>
-        <w:t>SHA-256 là thuật toán xác định trên máy tính thực, không phải hàm ngẫu nhiên lý tưởng, nên vẫn chịu tác động từ môi trường thực thi.</w:t>
+        <w:t>Lời giải thích dễ nhớ: SHA-256 là thuật toán xác định chạy trên CPU máy thật, không phải cỗ máy ngẫu nhiên lý tưởng, nên vẫn chịu tác động từ môi trường thực thi phần cứng.</w:t>
       </w:r>
     </w:p>
     <w:p>
@@ -1196,14 +1218,14 @@
           <w:color w:val="0F172A"/>
           <w:sz w:val="20"/>
         </w:rPr>
-        <w:t xml:space="preserve">– Bước 1 — Giả định toán học: </w:t>
+        <w:t xml:space="preserve">– Bước 1 — Giả định trên lý thuyết: </w:t>
       </w:r>
       <w:r>
         <w:rPr>
           <w:color w:val="334155"/>
           <w:sz w:val="20"/>
         </w:rPr>
-        <w:t>Hộp đen mật mã lý tưởng, thời gian thực thi vô hình, độ dài bản mã không làm lộ nội dung, kênh truyền độc lập.</w:t>
+        <w:t>Coi mật mã là hộp đen lý tưởng, thời gian chạy không bị đo lường, độ dài bản mã không làm lộ thông tin, đường truyền độc lập.</w:t>
       </w:r>
     </w:p>
     <w:p>
@@ -1217,14 +1239,14 @@
           <w:color w:val="0F172A"/>
           <w:sz w:val="20"/>
         </w:rPr>
-        <w:t xml:space="preserve">– Bước 2 — Yếu tố vật lý bị lược bỏ: </w:t>
+        <w:t xml:space="preserve">– Bước 2 — Thực tế vật lý bị bỏ quên: </w:t>
       </w:r>
       <w:r>
         <w:rPr>
           <w:color w:val="334155"/>
           <w:sz w:val="20"/>
         </w:rPr>
-        <w:t>Thời gian xử lý CPU, điện năng tiêu thụ, bức xạ điện từ, bộ nhớ đệm Cache, lỗi lập trình.</w:t>
+        <w:t>Thời gian xử lý CPU, điện năng tiêu thụ, bức xạ điện từ, bộ nhớ đệm (Cache) và lỗi phần mềm.</w:t>
       </w:r>
     </w:p>
     <w:p>
@@ -1238,14 +1260,14 @@
           <w:color w:val="0F172A"/>
           <w:sz w:val="20"/>
         </w:rPr>
-        <w:t xml:space="preserve">– Bước 3 — Đối thủ thế giới thực khai thác: </w:t>
+        <w:t xml:space="preserve">– Bước 3 — Đòn đánh của kẻ tấn công thực tế: </w:t>
       </w:r>
       <w:r>
         <w:rPr>
           <w:color w:val="334155"/>
           <w:sz w:val="20"/>
         </w:rPr>
-        <w:t>Tấn công kênh kề thời gian (Kocher 1996), phân tích lưu lượng và kích thước gói tin, lỗi quản lý khóa (Anderson 2001).</w:t>
+        <w:t>Đo chênh lệch thời gian chạy để mò khóa (tấn công kênh kề — Kocher 1996), phân tích lưu lượng gói tin và khai thác sơ hở quản lý khóa.</w:t>
       </w:r>
     </w:p>
     <w:p>
@@ -1267,7 +1289,7 @@
           <w:color w:val="475569"/>
           <w:sz w:val="19"/>
         </w:rPr>
-        <w:t>Kẻ tấn công đo sự chênh lệch micro-giây khi CPU so khớp dữ liệu để dò từng byte khóa bí mật.</w:t>
+        <w:t>Ví dụ gần gũi: Giống như kẻ trộm lắng nghe tiếng click của ổ khóa số để dò từng nấc mã; kẻ tấn công đo sự chênh lệch vài phần triệu giây khi CPU so sánh chuỗi để mò ra từng ký tự của mật khẩu.</w:t>
       </w:r>
     </w:p>
     <w:p>
@@ -1288,7 +1310,7 @@
           <w:color w:val="334155"/>
           <w:sz w:val="20"/>
         </w:rPr>
-        <w:t>Sự trừu tượng hóa quá mức làm mật mã học bỏ sót chính những năng lực thực tế của đối thủ ngoài đời thực.</w:t>
+        <w:t>Quá trừu tượng hóa trên lý thuyết khiến mật mã học bỏ sót chính những vũ khí nguy hiểm nhất của kẻ tấn công ngoài đời thực.</w:t>
       </w:r>
     </w:p>
     <w:p>
@@ -1339,7 +1361,7 @@
         </w:rPr>
         <w:t>• Vị trí Slide: SECTION 6 — TIẾT LỘ CỦA SNOWDEN (TRANG 10–12)</w:t>
         <w:br/>
-        <w:t xml:space="preserve">  Tiêu đề phụ: Khủng hoảng mô hình an ninh trước đối thủ giám sát hàng loạt quy mô quốc gia</w:t>
+        <w:t xml:space="preserve">  Tiêu đề phụ: Thực tế an ninh trước đối thủ giám sát quy mô quốc gia</w:t>
       </w:r>
     </w:p>
     <w:p>
@@ -1367,14 +1389,14 @@
           <w:color w:val="0F172A"/>
           <w:sz w:val="20"/>
         </w:rPr>
-        <w:t xml:space="preserve">– 1. Khủng hoảng thực tiễn (Snowden 2013): </w:t>
+        <w:t xml:space="preserve">– 1. Bài học thực tiễn từ Snowden (2013): </w:t>
       </w:r>
       <w:r>
         <w:rPr>
           <w:color w:val="334155"/>
           <w:sz w:val="20"/>
         </w:rPr>
-        <w:t>NSA không cần phá toán học của RSA/AES mà tấn công vào hạ tầng xung quanh (đánh cắp khóa, thâm nhập cáp quang biển).</w:t>
+        <w:t>Kẻ tấn công không mất công bẻ khóa toán học RSA hay AES, mà tấn công thẳng vào hạ tầng xung quanh (đánh cắp khóa tại máy chủ, thâm nhập cáp quang biển).</w:t>
       </w:r>
     </w:p>
     <w:p>
@@ -1388,14 +1410,14 @@
           <w:color w:val="0F172A"/>
           <w:sz w:val="20"/>
         </w:rPr>
-        <w:t xml:space="preserve">– 2. Năng lực đối thủ thể chế: </w:t>
+        <w:t xml:space="preserve">– 2. Năng lực của đối thủ thể chế: </w:t>
       </w:r>
       <w:r>
         <w:rPr>
           <w:color w:val="334155"/>
           <w:sz w:val="20"/>
         </w:rPr>
-        <w:t>Khai thác siêu dữ liệu để lập bản đồ liên lạc; cài cửa sau vào tiêu chuẩn NIST (Dual_EC_DRBG); gây áp lực pháp lý lên các tập đoàn công nghệ.</w:t>
+        <w:t>Khai thác siêu dữ liệu để vẽ bản đồ liên lạc; cài cửa sau vào tiêu chuẩn bảo mật quốc tế NIST (vụ bê bối Dual_EC_DRBG); gây sức ép pháp lý lên các tập đoàn công nghệ.</w:t>
       </w:r>
     </w:p>
     <w:p>
@@ -1417,7 +1439,7 @@
           <w:color w:val="475569"/>
           <w:sz w:val="19"/>
         </w:rPr>
-        <w:t>Vụ bê bối Dual_EC_DRBG cho thấy đối thủ thể chế có thể cài điểm yếu vào chuẩn quốc tế để bí mật giải mã lưu lượng toàn cầu.</w:t>
+        <w:t>Lời giải thích dễ nhớ: Vụ bê bối Dual_EC_DRBG chứng minh cơ quan tình báo có thể bí mật cài điểm yếu toán học vào bộ sinh số ngẫu nhiên chuẩn quốc tế để đọc trộm thông tin toàn cầu.</w:t>
       </w:r>
     </w:p>
     <w:p>
@@ -1431,14 +1453,14 @@
           <w:color w:val="0F172A"/>
           <w:sz w:val="20"/>
         </w:rPr>
-        <w:t xml:space="preserve">– 3. Tính tương đối của đối thủ: </w:t>
+        <w:t xml:space="preserve">– 3. Khái niệm 'Đối thủ' mang tính vị thế: </w:t>
       </w:r>
       <w:r>
         <w:rPr>
           <w:color w:val="334155"/>
           <w:sz w:val="20"/>
         </w:rPr>
-        <w:t>'Đối thủ' mang tính vị thế; mật mã học buộc phải nghiên cứu cơ chế phòng chống cửa sau (Cliptography).</w:t>
+        <w:t>Kẻ thù tùy thuộc vào góc nhìn; ngành mật mã buộc phải nghiên cứu cơ chế phòng chống cửa sau (Cliptography).</w:t>
       </w:r>
     </w:p>
     <w:p>
@@ -1460,7 +1482,7 @@
           <w:color w:val="475569"/>
           <w:sz w:val="19"/>
         </w:rPr>
-        <w:t>Cliptography nghiên cứu thiết kế mật mã có khả năng tự bảo vệ ngay cả khi phần mềm bị đối thủ cài sẵn cửa sau.</w:t>
+        <w:t>Lời giải thích dễ nhớ: Cliptography là hướng nghiên cứu thiết kế thuật toán tự bảo vệ an toàn ngay cả khi phần mềm hay thiết bị đã bị cài sẵn cửa sau từ trước.</w:t>
       </w:r>
     </w:p>
     <w:p>
@@ -1511,7 +1533,7 @@
         </w:rPr>
         <w:t>• Vị trí Slide: SECTION 7 — KẾT LUẬN &amp; CHƯƠNG TRÌNH NGHIÊN CỨU (TRANG 12–14)</w:t>
         <w:br/>
-        <w:t xml:space="preserve">  Tiêu đề phụ: Đề xuất hòa giải giữa trừu tượng hóa toán học và dữ liệu thực nghiệm thế giới thực</w:t>
+        <w:t xml:space="preserve">  Tiêu đề phụ: Đề xuất dung hòa giữa trừu tượng hóa toán học và dữ liệu thực nghiệm thực tế</w:t>
       </w:r>
     </w:p>
     <w:p>
@@ -1546,7 +1568,7 @@
           <w:color w:val="334155"/>
           <w:sz w:val="20"/>
         </w:rPr>
-        <w:t>Nghiên cứu hành vi giữ bí mật thực tế của con người; đánh giá độ bền chính sách an ninh trước sự cố nội bộ Byzantine.</w:t>
+        <w:t>Nghiên cứu hành vi giữ bí mật thực tế của con người; đánh giá độ bền của chính sách an ninh trước sự cố nội bộ hoặc kẻ phản bội.</w:t>
       </w:r>
     </w:p>
     <w:p>
@@ -1560,14 +1582,14 @@
           <w:color w:val="0F172A"/>
           <w:sz w:val="20"/>
         </w:rPr>
-        <w:t xml:space="preserve">– RQ2 — Mô hình hóa bằng thống kê: </w:t>
+        <w:t xml:space="preserve">– RQ2 — Đo lường bằng thống kê thực nghiệm: </w:t>
       </w:r>
       <w:r>
         <w:rPr>
           <w:color w:val="334155"/>
           <w:sz w:val="20"/>
         </w:rPr>
-        <w:t>Dùng thống kê thực nghiệm và mô phỏng Monte Carlo để định lượng năng lực thực tế của đối thủ và liên minh giám sát.</w:t>
+        <w:t>Dùng thống kê thực nghiệm và mô phỏng xác suất (Monte Carlo) để định lượng chính xác sức mạnh thật sự của đối thủ và liên minh giám sát.</w:t>
       </w:r>
     </w:p>
     <w:p>
@@ -1581,14 +1603,14 @@
           <w:color w:val="0F172A"/>
           <w:sz w:val="20"/>
         </w:rPr>
-        <w:t xml:space="preserve">– RQ3 — Phương pháp liên ngành: </w:t>
+        <w:t xml:space="preserve">– RQ3 — Phương pháp tiếp cận liên ngành: </w:t>
       </w:r>
       <w:r>
         <w:rPr>
           <w:color w:val="334155"/>
           <w:sz w:val="20"/>
         </w:rPr>
-        <w:t>Ứng dụng lý thuyết hệ thống phức hợp và động lực học mạng (như mô hình lây lan) vào phân tích sự rò rỉ thông tin.</w:t>
+        <w:t>Ứng dụng lý thuyết hệ thống phức hợp và mô hình lây lan dịch bệnh để phân tích đường đi của thông tin rò rỉ.</w:t>
       </w:r>
     </w:p>
     <w:p>
@@ -1610,7 +1632,7 @@
           <w:color w:val="475569"/>
           <w:sz w:val="19"/>
         </w:rPr>
-        <w:t>Mô hình hóa sự rò rỉ thông tin tương tự quy luật lây lan dịch bệnh để dự báo và kiểm soát nguy cơ mất an toàn.</w:t>
+        <w:t>Ví dụ gần gũi: Xem sự rò rỉ thông tin lây lan giống như một đợt dịch bệnh giúp các chuyên gia an ninh dự báo trước đường đi và khoanh vùng dập tắt nguy cơ nhanh hơn.</w:t>
       </w:r>
     </w:p>
     <w:p>
@@ -1624,14 +1646,14 @@
           <w:color w:val="0F172A"/>
           <w:sz w:val="20"/>
         </w:rPr>
-        <w:t xml:space="preserve">– RQ4 — Triết học chất vấn ngầm định: </w:t>
+        <w:t xml:space="preserve">– RQ4 — Đánh giá lại các giả định nền tảng: </w:t>
       </w:r>
       <w:r>
         <w:rPr>
           <w:color w:val="334155"/>
           <w:sz w:val="20"/>
         </w:rPr>
-        <w:t>Xem xét lại các giả định nền tảng từ thời Shannon, điều chỉnh cho phù hợp với môi trường mạng hiện đại.</w:t>
+        <w:t>Soi xét lại các tiên đề lý thuyết từ thời Shannon để điều chỉnh cho phù hợp với môi trường an ninh mạng hiện đại.</w:t>
       </w:r>
     </w:p>
     <w:p>
@@ -1682,7 +1704,7 @@
         </w:rPr>
         <w:t>• Vị trí Slide: SƠ ĐỒ 4: KIẾN TRÚC DIỄN TẬP ĐỐI KHÁNG (PRE-DEMO ARCHITECTURE)</w:t>
         <w:br/>
-        <w:t xml:space="preserve">  Tiêu đề phụ: Mô hình đối kháng 2 màn hình trên tập dữ liệu kaggle_dataset (2.485 tệp tin) kiểm chứng trực quan luận điểm bài báo</w:t>
+        <w:t xml:space="preserve">  Tiêu đề phụ: Mô hình đối kháng 2 màn hình do sinh viên tự thiết kế trên tập dữ liệu kaggle_dataset (2.485 tệp tin) để kiểm chứng luận điểm bài báo</w:t>
       </w:r>
     </w:p>
     <w:p>
@@ -1710,14 +1732,14 @@
           <w:color w:val="0F172A"/>
           <w:sz w:val="20"/>
         </w:rPr>
-        <w:t xml:space="preserve">– Khối 1 (Trái) — Blue Team (Port 8080): </w:t>
+        <w:t xml:space="preserve">– Khối 1 (Trái) — Đội Phòng thủ Blue Team (Port 8080): </w:t>
       </w:r>
       <w:r>
         <w:rPr>
           <w:color w:val="334155"/>
           <w:sz w:val="20"/>
         </w:rPr>
-        <w:t>Thiết lập mốc tin cậy sạch ban đầu H_0; tích hợp phân tách miền RFC 6962 (tiền tố 0x00 cho lá, 0x01 cho nhánh).</w:t>
+        <w:t>Thiết lập mốc tin cậy sạch ban đầu H_0; tích hợp phân tách miền chuẩn RFC 6962 (tiền tố 0x00 cho lá, 0x01 cho nhánh).</w:t>
       </w:r>
     </w:p>
     <w:p>
@@ -1739,7 +1761,7 @@
           <w:color w:val="475569"/>
           <w:sz w:val="19"/>
         </w:rPr>
-        <w:t>Phân tách miền 0x00/0x01 ngăn chặn triệt để tấn công nhầm lẫn cấu trúc cây Merkle (Node-Leaf Confusion).</w:t>
+        <w:t>Lời giải thích dễ nhớ: Phân tách miền 0x00/0x01 giúp phòng chống hiệu quả nguy cơ kẻ tấn công đánh tráo một nút lá thành cặp băm của nút nhánh trên cây Merkle (Node-Leaf Confusion).</w:t>
       </w:r>
     </w:p>
     <w:p>
@@ -1753,14 +1775,14 @@
           <w:color w:val="0F172A"/>
           <w:sz w:val="20"/>
         </w:rPr>
-        <w:t xml:space="preserve">– Khối 2 (Giữa) — Kho dữ liệu (kaggle_dataset): </w:t>
+        <w:t xml:space="preserve">– Khối 2 (Giữa) — Kho dữ liệu kiểm thử (kaggle_dataset): </w:t>
       </w:r>
       <w:r>
         <w:rPr>
           <w:color w:val="334155"/>
           <w:sz w:val="20"/>
         </w:rPr>
-        <w:t>2.485 tệp tin (~112,8 MB) mô phỏng cấu trúc cây thư mục doanh nghiệp thực tế trên đĩa cứng.</w:t>
+        <w:t>Bộ dữ liệu thực tế gồm 2.485 tệp tin (~112,8 MB) do nhóm sinh viên tự chọn để mô phỏng cây thư mục doanh nghiệp trên đĩa cứng.</w:t>
       </w:r>
     </w:p>
     <w:p>
@@ -1774,14 +1796,14 @@
           <w:color w:val="0F172A"/>
           <w:sz w:val="20"/>
         </w:rPr>
-        <w:t xml:space="preserve">– Khối 3 (Phải) — Red Team (Port 8081): </w:t>
+        <w:t xml:space="preserve">– Khối 3 (Phải) — Đội Tấn công Red Team (Port 8081): </w:t>
       </w:r>
       <w:r>
         <w:rPr>
           <w:color w:val="334155"/>
           <w:sz w:val="20"/>
         </w:rPr>
-        <w:t>Mô phỏng đối thủ chủ đích: Kịch bản 1 (Sửa tệp trực tiếp) và Kịch bản 2 (Bù 4 byte GF(2) qua mặt CRC32).</w:t>
+        <w:t>Mô phỏng đối thủ chủ đích: Kịch bản 1 (Sửa tệp tin trực tiếp) và Kịch bản 2 (Bù 4 byte GF(2) qua mặt mã kiểm tra CRC32).</w:t>
       </w:r>
     </w:p>
     <w:p>
@@ -1803,7 +1825,7 @@
           <w:color w:val="475569"/>
           <w:sz w:val="19"/>
         </w:rPr>
-        <w:t>Kịch bản 2 chứng minh đối thủ chủ đích dễ dàng đánh lừa mã tuyến tính CRC32, nhưng bất lực trước hàm băm phi tuyến SHA-256.</w:t>
+        <w:t>Lời giải thích dễ nhớ: Kịch bản 2 chứng minh kẻ tấn công có chủ đích dễ dàng đánh lừa mã tuyến tính CRC32, nhưng hoàn toàn bất lực trước hàm băm phi tuyến SHA-256.</w:t>
       </w:r>
     </w:p>
     <w:p>
@@ -1817,14 +1839,14 @@
           <w:color w:val="0F172A"/>
           <w:sz w:val="20"/>
         </w:rPr>
-        <w:t xml:space="preserve">– Khối 4 (Dưới) — Cơ chế hoàn nguyên an toàn: </w:t>
+        <w:t xml:space="preserve">– Khối 4 (Dưới) — Cơ chế khôi phục an toàn: </w:t>
       </w:r>
       <w:r>
         <w:rPr>
           <w:color w:val="334155"/>
           <w:sz w:val="20"/>
         </w:rPr>
-        <w:t>Thư mục sao lưu an toàn .adversary_backups/ và nút Rollback All phục hồi nguyên trạng sau diễn tập.</w:t>
+        <w:t>Thư mục sao lưu an toàn .adversary_backups/ và nút Rollback All giúp phục hồi dữ liệu về nguyên trạng ban đầu.</w:t>
       </w:r>
     </w:p>
     <w:p>
@@ -1838,7 +1860,7 @@
           <w:color w:val="94A3B8"/>
           <w:sz w:val="18"/>
         </w:rPr>
-        <w:t>• Ghi chú chân Slide: Sơ đồ kiến trúc diễn tập đối kháng độc lập do sinh viên thiết kế minh họa các khái niệm an ninh.</w:t>
+        <w:t>• Ghi chú chân Slide: Sơ đồ kiến trúc diễn tập đối kháng do sinh viên tự xây dựng nhằm minh họa thực nghiệm các luận điểm trong bài báo.</w:t>
       </w:r>
     </w:p>
     <w:p>
@@ -1989,14 +2011,14 @@
           <w:color w:val="0F172A"/>
           <w:sz w:val="20"/>
         </w:rPr>
-        <w:t xml:space="preserve">– 1. Bản chất thông tin &amp; Bí mật (Sec 1–2): </w:t>
+        <w:t xml:space="preserve">– 1. Bản chất Thông tin &amp; Kẻ thù (Mục 1–2): </w:t>
       </w:r>
       <w:r>
         <w:rPr>
           <w:color w:val="334155"/>
           <w:sz w:val="20"/>
         </w:rPr>
-        <w:t>Mô hình cũ: Thông tin xác suất, nhiễu ngẫu nhiên ↔ Halpin: Thông tin ngữ nghĩa khách quan (Dretske), đối thủ có chủ đích.</w:t>
+        <w:t>Mô hình cũ: Coi lỗi chỉ là do nhiễu ngẫu nhiên đường truyền ↔ Halpin: Thông tin mang tính khách quan (Dretske), đối thủ là kẻ có chủ đích phá hoại.</w:t>
       </w:r>
     </w:p>
     <w:p>
@@ -2018,7 +2040,7 @@
           <w:color w:val="475569"/>
           <w:sz w:val="19"/>
         </w:rPr>
-        <w:t>Đối thủ có chủ đích buộc hệ thống phải dùng hàm băm phi tuyến SHA-256 thay vì mã tuyến tính CRC32.</w:t>
+        <w:t>Bài học kỹ thuật: Vì kẻ tấn công có chủ đích tính toán trước nên ta bắt buộc phải dùng hàm băm mật mã SHA-256 (như dấu vân tay số độc nhất) thay vì dùng mã CRC32 đơn giản.</w:t>
       </w:r>
     </w:p>
     <w:p>
@@ -2032,14 +2054,14 @@
           <w:color w:val="0F172A"/>
           <w:sz w:val="20"/>
         </w:rPr>
-        <w:t xml:space="preserve">– 2. Giới hạn hình thức hóa (Sec 5): </w:t>
+        <w:t xml:space="preserve">– 2. Giới hạn hình thức hóa (Mục 5): </w:t>
       </w:r>
       <w:r>
         <w:rPr>
           <w:color w:val="334155"/>
           <w:sz w:val="20"/>
         </w:rPr>
-        <w:t>Mô hình cũ: Mật mã là hộp đen toán học, thời gian vô hình ↔ Halpin: Điểm mù vật lý (thời gian CPU, bộ nhớ đệm Cache).</w:t>
+        <w:t>Mô hình cũ: Mật mã là chiếc hộp đen toán học hoàn hảo ↔ Halpin: Kẻ địch đo thời gian xử lý CPU và bộ nhớ đệm Cache ngoài đời thực để lấy cắp khóa.</w:t>
       </w:r>
     </w:p>
     <w:p>
@@ -2061,7 +2083,7 @@
           <w:color w:val="475569"/>
           <w:sz w:val="19"/>
         </w:rPr>
-        <w:t>Phòng thủ đòi hỏi so khớp thời gian hằng số (hmac.compare_digest) để triệt tiêu rò rỉ kênh kề.</w:t>
+        <w:t>Bài học kỹ thuật: Lập trình phòng thủ đòi hỏi phải dùng phép so sánh thời gian hằng số (hmac.compare_digest) để triệt tiêu nguy cơ lộ lọt qua kênh kề thời gian.</w:t>
       </w:r>
     </w:p>
     <w:p>
@@ -2075,14 +2097,14 @@
           <w:color w:val="0F172A"/>
           <w:sz w:val="20"/>
         </w:rPr>
-        <w:t xml:space="preserve">– 3. Đối thủ thế giới thực (Sec 6): </w:t>
+        <w:t xml:space="preserve">– 3. Đối thủ thế giới thực (Mục 6): </w:t>
       </w:r>
       <w:r>
         <w:rPr>
           <w:color w:val="334155"/>
           <w:sz w:val="20"/>
         </w:rPr>
-        <w:t>Mô hình cũ: Giới hạn đối thủ trong bài toán PPT ↔ Halpin: Đối thủ thể chế (NSA) cài cửa sau và khai thác siêu dữ liệu.</w:t>
+        <w:t>Mô hình cũ: Giới hạn đối thủ trong năng lực tính toán thông thường (PPT) ↔ Halpin: Đối thủ thể chế (NSA) cài cửa sau vào chuẩn bảo mật và khai thác siêu dữ liệu diện rộng.</w:t>
       </w:r>
     </w:p>
     <w:p>
@@ -2096,14 +2118,14 @@
           <w:color w:val="0F172A"/>
           <w:sz w:val="20"/>
         </w:rPr>
-        <w:t xml:space="preserve">– 4. Chương trình nghiên cứu mở (Sec 7): </w:t>
+        <w:t xml:space="preserve">– 4. Chương trình nghiên cứu mở (Mục 7): </w:t>
       </w:r>
       <w:r>
         <w:rPr>
           <w:color w:val="334155"/>
           <w:sz w:val="20"/>
         </w:rPr>
-        <w:t>Mô hình cũ: Mật mã thuần túy toán học rời rạc ↔ Halpin: 4 câu hỏi mở kết hợp liên ngành với thống kê và triết học.</w:t>
+        <w:t>Mô hình cũ: Mật mã thuần túy là toán học rời rạc trên giấy ↔ Halpin: 4 câu hỏi mở kết hợp liên ngành với thống kê thực nghiệm và triết học.</w:t>
       </w:r>
     </w:p>
     <w:p>
@@ -2189,7 +2211,7 @@
           <w:color w:val="334155"/>
           <w:sz w:val="20"/>
         </w:rPr>
-        <w:t>Q &amp; A — Lắng nghe câu hỏi và đóng góp ý kiến hoàn thiện đề tài.</w:t>
+        <w:t>Q &amp; A — Em xin cảm ơn Thầy và các bạn đã chú ý theo dõi. Rất mong nhận được câu hỏi phản biện và góp ý từ Thầy để hoàn thiện đề tài.</w:t>
       </w:r>
     </w:p>
     <w:p>
@@ -2248,7 +2270,7 @@
     </w:p>
     <w:p>
       <w:r>
-        <w:t>Mục tiêu diễn tập giữa kỳ: Tập trung vào 2 kịch bản đối kháng cốt lõi phản ánh bài báo của Harry Halpin (2025). Các tính năng nghiên cứu mở rộng phục vụ đồ án cuối kỳ được lược bỏ để đảm bảo thời lượng và làm nổi bật trọng tâm khoa học.</w:t>
+        <w:t>Mục tiêu diễn tập giữa kỳ: Minh họa trực quan 2 kịch bản đối kháng then chốt để kiểm chứng luận điểm của bài báo Harry Halpin (2025). Bài báo gốc là công trình triết học lý thuyết, không có mã nguồn; toàn bộ hệ thống demo đối kháng 2 màn hình này do nhóm sinh viên tự thiết kế nhằm đưa các khái niệm trừu tượng vào kiểm chứng thực nghiệm trên máy tính thật.</w:t>
       </w:r>
     </w:p>
     <w:p>
@@ -2290,11 +2312,11 @@
         </w:rPr>
         <w:t>Mở terminal và chạy 2 dịch vụ:</w:t>
         <w:br/>
-        <w:t>• Blue Team Service:  python -m src.demo.web_demo --port 8080</w:t>
+        <w:t>• Blue Team Service (Phía phòng thủ):  python -m src.demo.web_demo --port 8080</w:t>
         <w:br/>
-        <w:t>• Red Team Service:   python -m src.demo.red_team_web --port 8081</w:t>
+        <w:t>• Red Team Service (Phía tấn công):   python -m src.demo.red_team_web --port 8081</w:t>
         <w:br/>
-        <w:t>Mở 2 cửa sổ trình duyệt chia đôi màn hình: Cửa sổ trái vào http://localhost:8080 (Blue Team); cửa sổ phải vào http://localhost:8081 (Red Team).</w:t>
+        <w:t>Chia đôi màn hình trình duyệt: Nửa trái mở http://localhost:8080 (Blue Team); nửa phải mở http://localhost:8081 (Red Team).</w:t>
       </w:r>
     </w:p>
     <w:p>
@@ -2321,11 +2343,11 @@
           <w:color w:val="334155"/>
           <w:sz w:val="20"/>
         </w:rPr>
-        <w:t>Tại cổng 8080, chọn thư mục 'kaggle_dataset' (~112.8 MB).</w:t>
+        <w:t>Tại cổng 8080, chọn thư mục 'kaggle_dataset' (~112.8 MB gồm 2.485 tệp tin).</w:t>
         <w:br/>
-        <w:t>Bấm 'Nạp &amp; Tính toán Toàn vẹn'. Hệ thống sinh Root Hash ban đầu H_0 sạch với trạng thái xanh: '100% NGUYÊN VẸN'.</w:t>
+        <w:t>Bấm 'Nạp &amp; Tính toán Toàn vẹn'. Hệ thống tính ra Root Hash ban đầu H_0 sạch với trạng thái xanh: '100% NGUYÊN VẸN'.</w:t>
         <w:br/>
-        <w:t>Điểm nói lý thuyết (Paper-to-Code): Minh họa việc thiết lập trạng thái tin cậy khách quan theo Dretske. Hệ thống áp dụng chuẩn RFC 6962 (tiền tố 0x00 cho lá, 0x01 cho nhánh) khi băm cây dữ liệu, giải quyết triệt để điểm mù nhập nhằng cấu trúc dữ liệu mà Halpin cảnh báo tại Mục 5.</w:t>
+        <w:t>Ý tưởng trực quan &amp; Điểm nói lý thuyết: Giống như việc chụp lại dấu vân tay số của toàn bộ thư viện tệp tin. Cây Merkle hoạt động như một hóa đơn tổng: nó băm từ các tệp lá lên gốc, giúp quản lý hàng nghìn tệp cực nhanh. Hệ thống áp dụng chuẩn RFC 6962 (thêm tiền tố byte 0x00 cho lá, 0x01 cho nhánh), giúp phòng chống hiệu quả nguy cơ kẻ gian làm giả cấu trúc cây (Node-Leaf Confusion) — đúng theo tinh thần cảnh báo của Halpin tại Mục 5.</w:t>
       </w:r>
     </w:p>
     <w:p>
@@ -2352,15 +2374,15 @@
           <w:color w:val="334155"/>
           <w:sz w:val="20"/>
         </w:rPr>
-        <w:t>Tại cổng 8081, bấm 'Can thiệp tệp tin ngẫu nhiên' (In-place Tampering) để sửa đổi tệp Resume/Resume.csv trên đĩa.</w:t>
+        <w:t>Tại cổng 8081, bấm 'Can thiệp tệp tin ngẫu nhiên' (In-place Tampering) để cố tình sửa tệp Resume/Resume.csv trên đĩa cứng.</w:t>
         <w:br/>
         <w:t>Quay lại Blue Team (Port 8080), bấm 'Kiểm tra toàn vẹn':</w:t>
         <w:br/>
         <w:t>• Hệ thống đổi sang cảnh báo đỏ: 'CẢNH BÁO: PHÁT HIỆN CAN THIỆP DỮ LIỆU!'.</w:t>
         <w:br/>
-        <w:t>• Bảng truy vết chỉ rõ tệp Resume/Resume.csv bị thay đổi.</w:t>
+        <w:t>• Bảng đối soát chỉ rõ chính xác tệp Resume/Resume.csv đã bị thay đổi.</w:t>
         <w:br/>
-        <w:t>Ý nghĩa: Chứng minh hàm băm phát hiện ngay lập tức hành vi sửa đổi của đối thủ.</w:t>
+        <w:t>Ý nghĩa khi nói: SHA-256 hoạt động như một dấu vân tay số cực kỳ nhạy. Dù kẻ tấn công chỉ thay đổi đúng một dấu phẩy trong tệp tin, mã băm đầu ra cũng biến đổi hoàn toàn và hệ thống phát hiện chính xác ngay khi đối chiếu.</w:t>
       </w:r>
     </w:p>
     <w:p>
@@ -2387,15 +2409,15 @@
           <w:color w:val="334155"/>
           <w:sz w:val="20"/>
         </w:rPr>
-        <w:t>Tại cổng 8081, bấm 'Tấn công bù 4 byte GF(2)' (CRC32 Forge Attack). Động cơ Red Team giải hệ phương trình tuyến tính, làm sai lệch nội dung tệp nhưng bù 4 byte patch khiến mã CRC32 không đổi.</w:t>
+        <w:t>Tại cổng 8081, bấm 'Tấn công bù 4 byte GF(2)' (CRC32 Forge Attack). Động cơ Red Team giải hệ phương trình tuyến tính, làm sai lệch nội dung tệp nhưng chèn thêm 4 byte bù khiến mã CRC32 không hề đổi.</w:t>
         <w:br/>
         <w:t>Quay lại Blue Team (Port 8080), bấm 'Kiểm tra toàn vẹn':</w:t>
         <w:br/>
-        <w:t>• Bảng đối chứng hiển thị: Thuật toán CRC32 bị qua mặt (báo khớp sai do tính chất tuyến tính).</w:t>
+        <w:t>• Bảng đối chứng hiển thị: Thuật toán CRC32 bị qua mặt hoàn toàn (báo xanh hợp lệ sai do tính chất tuyến tính).</w:t>
         <w:br/>
-        <w:t>• Ngược lại, hàm băm SHA-256 phát hiện gian lận ngay lập tức nhờ tính phi tuyến.</w:t>
+        <w:t>• Ngược lại, hàm băm SHA-256 phát hiện gian lận chính xác nhờ tính phi tuyến mạnh.</w:t>
         <w:br/>
-        <w:t>Điểm nói lý thuyết (Paper-to-Code): Minh họa trực tiếp luận điểm Halpin (Mục 1 &amp; 2): Mã kiểm tra tuyến tính (CRC32) chỉ bắt được nhiễu ngẫu nhiên trong truyền dẫn, hoàn toàn bất lực trước kẻ thù có chủ đích. Ngược lại, hàm băm mật mã SHA-256 có tính phi tuyến và hiệu ứng tuyết lở (~50% bit đảo khi sửa 1 bit), ngăn chặn kẻ thù bẻ gãy bằng đại số.</w:t>
+        <w:t>Ví dụ trực quan &amp; Điểm nói lý thuyết: Mã CRC32 giống như việc đếm tổng số chữ cái trong bức thư — kẻ gian bớt chữ này và bù chữ khác cho đủ số thì qua mặt được. Đúng như Halpin phân tích tại Mục 1 &amp; 2: Mã tuyến tính như CRC32 chỉ bắt được lỗi ngẫu nhiên vô tình, hoàn toàn bất lực trước kẻ thù có chủ đích. Còn SHA-256 là hàm băm phi tuyến có hiệu ứng tuyết lở (~50% bit đảo khi sửa 1 bit), kẻ địch không thể dùng đại số giải phương trình để bù mã được.</w:t>
       </w:r>
     </w:p>
     <w:p>
@@ -2422,9 +2444,9 @@
           <w:color w:val="334155"/>
           <w:sz w:val="20"/>
         </w:rPr>
-        <w:t>Tại giao diện Red Team (Port 8081), bấm 'ROLLBACK ALL' để khôi phục toàn bộ tệp từ thư mục sao lưu .adversary_backups/.</w:t>
+        <w:t>Tại giao diện Red Team (Port 8081), bấm 'ROLLBACK ALL' để khôi phục toàn bộ tệp từ thư mục sao lưu an toàn .adversary_backups/.</w:t>
         <w:br/>
-        <w:t>Tại Blue Team bấm kiểm tra lại: Hệ thống trở về trạng thái an toàn màu xanh.</w:t>
+        <w:t>Quay lại Blue Team bấm kiểm tra lại: Hệ thống trở về trạng thái an toàn màu xanh nguyên trạng.</w:t>
       </w:r>
     </w:p>
     <w:p>
@@ -2453,12 +2475,12 @@
         <w:br/>
         <w:t xml:space="preserve">   Lệnh: python -m src.proposed_model.security_games</w:t>
         <w:br/>
-        <w:t xml:space="preserve">   Kết quả &amp; Điểm nói lý thuyết: Đo đạc tính phi tuyến của SHA-256, hiệu ứng tuyết lở SAC ~50%, kịch bản bẻ gãy mã tuyến tính CRC32 trên GF(2), và kiểm chứng rò rỉ kênh kề thời gian (Kocher 1996 - Mục 5 bài báo) khi so sánh chuỗi ngắt sớm so với hàm thời gian hằng số hmac.compare_digest.</w:t>
+        <w:t xml:space="preserve">   Kết quả &amp; Điểm nói lý thuyết: Đo đạc tính phi tuyến của SHA-256, kiểm chứng hiệu ứng tuyết lở SAC đạt xấp xỉ 50% bit đảo, chứng minh kịch bản bẻ gãy mã tuyến tính CRC32 trên trường GF(2), và kiểm chứng rò rỉ kênh kề thời gian (Kocher 1996 - Mục 5 bài báo) khi so sánh chuỗi ngắt sớm so với hàm thời gian hằng số hmac.compare_digest.</w:t>
         <w:br/>
         <w:br/>
         <w:t>2. Diễn tập 2 Terminal Red Team vs Blue Team:</w:t>
         <w:br/>
-        <w:t xml:space="preserve">   • Terminal 1 (Red Team): Chạy 'python src/adversary/red_team_cli.py'. Chọn phím '1' can thiệp tệp, hoặc phím '4' bù mã CRC32.</w:t>
+        <w:t xml:space="preserve">   • Terminal 1 (Red Team): Chạy 'python src/adversary/red_team_cli.py'. Chọn phím '1' để can thiệp tệp, hoặc phím '4' để bù mã CRC32.</w:t>
         <w:br/>
         <w:t xml:space="preserve">   • Terminal 2 (Blue Team): Chạy 'python -m src.baselines.sha256_manifest --dir kaggle_dataset --verify'. Blue Team phát hiện vi phạm: MODIFIED_FILE: Resume/Resume.csv.</w:t>
         <w:br/>
@@ -2509,11 +2531,11 @@
         </w:rPr>
         <w:t>Luận điểm phản biện:</w:t>
         <w:br/>
-        <w:t>1. Thuộc tính an ninh cốt lõi: Trong tam giác an ninh CIA (Bảo mật, Toàn vẹn, Khả dụng), Halpin phân tích rằng Tính toàn vẹn (Integrity) là điều kiện tiên quyết. Một thông điệp có thể không bí mật nhưng bắt buộc phải toàn vẹn thì người nhận mới có thể tin cậy sử dụng.</w:t>
+        <w:t>1. Tính toàn vẹn là điều kiện tiên quyết: Trong tam giác an ninh CIA (Bảo mật - Toàn vẹn - Khả dụng), Halpin nhấn mạnh Tính toàn vẹn (Integrity) là nền tảng số một. Một tệp tin hay thông điệp có thể không cần giữ kín bí mật, nhưng bắt buộc phải toàn vẹn thì người nhận mới có thể tin cậy sử dụng (ví dụ: một bản cập nhật phần mềm nếu bị sửa đổi chèn mã độc thì cực kỳ nguy hiểm dù mã nguồn có công khai hay không).</w:t>
         <w:br/>
-        <w:t>2. Kiểm định thực nghiệm: Halpin phê phán việc toán học hóa trừu tượng đã làm mật mã học xa rời thực tế vật lý. Bài toán kiểm tra toàn vẹn tệp tin trên đĩa cứng là bài toán thực tế, cho phép đưa các khái niệm trừu tượng vào kiểm định vật lý rõ ràng.</w:t>
+        <w:t>2. Đưa triết lý vào kiểm định thực tế: Halpin phê phán việc toán học hóa trừu tượng đã làm mật mã học xa rời thực tế vật lý. Bài toán kiểm tra toàn vẹn tệp tin trên đĩa cứng là môi trường thực nghiệm lý tưởng để đưa các khái niệm trừu tượng vào đo đạc thời gian, bộ nhớ và khả năng bắt lỗi đối kháng rõ ràng.</w:t>
         <w:br/>
-        <w:t>3. Mô hình hóa đối thủ: Hệ thống toàn vẹn tệp tin cho phép minh họa trực quan các dạng đối thủ được Halpin đề cập: Kẻ can thiệp Dolev-Yao, kẻ khai thác kênh kề Kocher và kẻ sửa đổi dữ liệu có chủ đích.</w:t>
+        <w:t>3. Minh họa trực quan các mô hình kẻ tấn công: Hệ thống tệp cho phép mô phỏng sống động các dạng đối thủ được Halpin đề cập: Kẻ can thiệp đường truyền Dolev-Yao, kẻ đo thời gian rò rỉ Kocher và kẻ chủ đích giả mạo dữ liệu.</w:t>
       </w:r>
     </w:p>
     <w:p>
@@ -2541,9 +2563,9 @@
         </w:rPr>
         <w:t>Luận điểm phản biện:</w:t>
         <w:br/>
-        <w:t>1. Bản chất bài khảo cứu: Bài báo của Halpin là bài tổng quan triết học (philosophical survey) dài 17 trang, 134 trích dẫn là kho tàng tài liệu lịch sử từ năm 1883 đến 2024 (bao gồm sách triết học, tài liệu lưu trữ chính phủ về NSA, v.v.). Không một công trình kỹ thuật nào có thể hay bắt buộc phải tái lập toàn bộ 134 tài liệu nền đó.</w:t>
+        <w:t>1. Bản chất là bài tổng quan học thuật: Bài báo của Halpin là bài khảo cứu triết học dài 17 trang, với 134 tài liệu tham khảo là kho tàng lịch sử từ năm 1883 đến 2024 (bao gồm cả sách triết học cổ điển, hồ sơ giải mật chính phủ về NSA, v.v.). Không có một công trình kỹ thuật nào có thể hay bắt buộc phải tái lập toàn bộ 134 tài liệu nền đó.</w:t>
         <w:br/>
-        <w:t>2. Tinh lọc trọng tâm: Thẩm định bài báo lý thuyết là tinh lọc các trụ cột kỹ thuật trực tiếp liên quan đến bài toán an ninh. Nhóm đã tinh lọc và kết nối với các tài liệu kỹ thuật cốt lõi: Shannon (Mã tuyến tính vs Hàm băm), Goldwasser-Micali (Trò chơi an ninh PPT), Kocher (Kênh kề thời gian), Bellare-Rogaway (Random Oracle), Dolev-Yao (Mạng thù địch), Snowden (Đối thủ thể chế), và bổ sung chuẩn IETF RFC 6962 về phân tách miền.</w:t>
+        <w:t>2. Tinh lọc đúng các trụ cột an ninh cốt lõi: Nhóm đã tinh lọc 6 trụ cột kỹ thuật trực tiếp liên quan đến bài toán an ninh: Shannon (Mã tuyến tính vs Hàm băm), Goldwasser-Micali (Trò chơi an ninh PPT), Kocher (Kênh kề thời gian), Bellare-Rogaway (Random Oracle), Dolev-Yao (Mạng thù địch), Snowden (Đối thủ thể chế), đồng thời nhóm bổ sung chuẩn IETF RFC 6962 về phân tách miền để hoàn thiện giải pháp kỹ thuật.</w:t>
       </w:r>
     </w:p>
     <w:p>
@@ -2571,9 +2593,9 @@
         </w:rPr>
         <w:t>Luận điểm phản biện:</w:t>
         <w:br/>
-        <w:t>1. Khẳng định minh bạch: Bài báo gốc của Harry Halpin hoàn toàn KHÔNG CÓ tập dữ liệu, bảng số liệu thực nghiệm hay mã nguồn nào. Bài báo là công trình khảo luận nhận thức luận trên tạp chí lý thuyết.</w:t>
+        <w:t>1. Khẳng định minh bạch: Bài báo gốc của Harry Halpin là công trình khảo luận nhận thức luận thuần túy, hoàn toàn KHÔNG có tập dữ liệu, bảng số liệu thực nghiệm hay mã nguồn đi kèm.</w:t>
         <w:br/>
-        <w:t>2. Mục đích đưa tập dữ liệu vào: Tập dữ liệu Kaggle Resume Dataset (2.485 tệp tin, ~112.81 MiB theo benchmark) do nhóm sinh viên tự chọn và tiền xử lý. Mục đích là cung cấp môi trường cây thư mục doanh nghiệp nhiều tầng thực tế, kích thước tệp biến thiên, phản ánh tải làm việc thực tế để đo tốc độ quét và kiểm tra khả năng bắt lỗi đối kháng, hoàn toàn không phải ngụy tạo số liệu tác giả.</w:t>
+        <w:t>2. Mục đích đưa tập dữ liệu vào: Bộ dữ liệu Kaggle Resume Dataset (2.485 tệp tin, ~112,8 MB) do nhóm sinh viên tự chọn và tiền xử lý. Mục đích là tạo môi trường cây thư mục doanh nghiệp nhiều tầng thực tế, kích thước tệp biến thiên, phản ánh tải làm việc thực tế để đo tốc độ quét và kiểm tra khả năng bắt lỗi đối kháng, hoàn toàn là phần đóng góp thực nghiệm độc lập của sinh viên, không phải ngụy tạo số liệu tác giả.</w:t>
       </w:r>
     </w:p>
     <w:p>
@@ -2601,9 +2623,9 @@
         </w:rPr>
         <w:t>Luận điểm phản biện:</w:t>
         <w:br/>
-        <w:t>1. Tính tuyến tính của CRC32: CRC32 hoạt động dựa trên phép chia đa thức trên trường nhị phân GF(2). Do tính chất tuyến tính, giá trị CRC của thông điệp sửa đổi có thể tính trước được. Đối thủ giải hệ phương trình đại số tuyến tính để tìm ra 4 byte bù (patch) nối vào đuôi tệp, khiến CRC32 của tệp giả mạo trùng khớp với tệp gốc trong kịch bản kiểm thử này.</w:t>
+        <w:t>1. Tính tuyến tính của CRC32: CRC32 hoạt động dựa trên phép chia đa thức trên trường nhị phân GF(2). Do tính chất tuyến tính, giá trị kiểm tra của dữ liệu sửa đổi có thể tính trước được bằng đại số. Kẻ tấn công giải hệ phương trình tuyến tính để tìm ra 4 byte bù (patch) nối vào đuôi tệp, khiến mã CRC32 của tệp giả mạo trùng khớp hoàn toàn với tệp gốc trong kịch bản kiểm thử này.</w:t>
         <w:br/>
-        <w:t>2. Tính phi tuyến của SHA-256: SHA-256 xây dựng trên cấu trúc lặp Merkle-Damgard với các hàm phi tuyến. Hàm băm đạt hiệu ứng tuyết lở (SAC ~50%): Chỉ đổi 1 bit đầu vào thì trung bình 50% số bit đầu ra bị đảo ngẫu nhiên. Bài toán tìm tiền ảnh thứ hai trên SHA-256 có độ phức tạp 2^256, vượt quá năng lực tính toán của đối thủ thời gian đa thức (PPT).</w:t>
+        <w:t>2. Tính phi tuyến mạnh của SHA-256: SHA-256 xây dựng trên cấu trúc lặp Merkle-Damgard với các phép toán phi tuyến phức tạp. Hàm băm đạt hiệu ứng tuyết lở (SAC ~50%): Chỉ đổi đúng 1 bit đầu vào thì trung bình 50% số bit đầu ra bị đảo ngẫu nhiên. Bài toán tìm tiền ảnh thứ hai trên SHA-256 có độ phức tạp 2^256, vượt xa năng lực tính toán của kẻ tấn công thời gian đa thức (PPT).</w:t>
       </w:r>
     </w:p>
     <w:p>
@@ -2631,9 +2653,9 @@
         </w:rPr>
         <w:t>Luận điểm phản biện:</w:t>
         <w:br/>
-        <w:t>1. Cơ chế rò rỉ: Hàm so sánh chuỗi thông thường (toán tử ==) so sánh tuần tự từng ký tự từ trái sang phải và ngắt sớm (early return) khi thấy ký tự sai đầu tiên. Đối thủ gửi các chuỗi thử và đo thời gian phản hồi: Thời gian xử lý lâu hơn nghĩa là đã đoán đúng thêm ký tự. Nhờ đó, đối thủ dò ra khóa bí mật mà không cần giải mã.</w:t>
+        <w:t>1. Cơ chế rò rỉ qua thời gian: Lệnh so sánh chuỗi thông thường (toán tử ==) so sánh tuần tự từng ký tự từ trái sang phải và ngắt sớm (early return) ngay khi thấy ký tự sai đầu tiên. Kẻ tấn công gửi các chuỗi thử và đo thời gian phản hồi: Thời gian xử lý lâu hơn nghĩa là đã đoán đúng thêm ký tự. Nhờ đó, kẻ địch dò ra khóa bí mật mà không cần giải mã.</w:t>
         <w:br/>
-        <w:t>2. Giải pháp kỹ thuật: Sử dụng hàm so sánh thời gian hằng số (Constant-time comparison) `hmac.compare_digest`. Hàm này luôn duyệt hết độ dài chuỗi bằng phép XOR tích lũy, đảm bảo thời gian xử lý độc lập với vị trí sai khác, triệt tiêu kênh rò rỉ thời gian ở mức phần mềm.</w:t>
+        <w:t>2. Giải pháp kỹ thuật triệt để: Sử dụng hàm so sánh thời gian hằng số (Constant-time comparison) `hmac.compare_digest`. Hàm này luôn duyệt hết độ dài chuỗi bằng phép toán XOR tích lũy, đảm bảo thời gian xử lý luôn không đổi dù chuỗi khớp hay không, loại bỏ hoàn toàn kênh rò rỉ thời gian ở mức phần mềm ứng dụng.</w:t>
       </w:r>
     </w:p>
     <w:p>
@@ -2661,11 +2683,11 @@
         </w:rPr>
         <w:t>Luận điểm phản biện:</w:t>
         <w:br/>
-        <w:t>1. Đóng góp độc lập: Halpin không đề xuất Cây Merkle hay chuẩn RFC 6962. Đây là phần mở rộng độc lập của nhóm nhằm giải quyết bài toán toàn vẹn dữ liệu tệp tin.</w:t>
+        <w:t>1. Đóng góp kỹ thuật độc lập của nhóm: Tác giả Halpin chỉ nêu triết lý chứ không đề xuất Cây Merkle hay chuẩn RFC 6962. Đây là phần giải pháp kỹ thuật do nhóm chủ động tích hợp nhằm giải quyết bài toán kiểm tra toàn vẹn cây thư mục dữ liệu lớn.</w:t>
         <w:br/>
-        <w:t>2. Phân tách miền RFC 6962: Phép ghép băm thông thường H(L || R) có nguy cơ dẫn đến lỗi nhập nhằng nút lá (Node-leaf ambiguity) khi một nút lá bị giả mạo thành cặp băm của nút nhánh nội bộ. Nhóm áp dụng chuẩn RFC 6962: Thêm tiền tố 0x00 cho lá và 0x01 cho nhánh, triệt tiêu hoàn toàn sự nhập nhằng cấu trúc ở cấp độ cây.</w:t>
+        <w:t>2. Phân tách miền RFC 6962: Phép ghép băm thông thường H(L || R) có nguy cơ dẫn đến lỗi nhầm lẫn cấu trúc cây (Node-leaf ambiguity) khi nút lá bị kẻ gian giả mạo thành cặp băm của nút nhánh nội bộ. Nhóm áp dụng chuẩn RFC 6962: Thêm tiền tố byte 0x00 cho lá và 0x01 cho nhánh, ngăn chặn hiệu quả sự nhập nhằng cấu trúc ở cấp độ cây Merkle.</w:t>
         <w:br/>
-        <w:t>3. Định hướng cuối kỳ: Nhóm tiếp tục tối ưu hóa cơ chế bộ đệm cập nhật cục bộ và đo đạc thực nghiệm trên các quy mô dữ liệu lớn hơn.</w:t>
+        <w:t>3. Định hướng cho đồ án cuối kỳ: Nhóm tiếp tục tối ưu hóa cơ chế bộ đệm cập nhật cục bộ và đo đạc thực nghiệm trên các quy mô dữ liệu lớn hơn.</w:t>
       </w:r>
     </w:p>
     <w:sectPr>

</xml_diff>